<commit_message>
Add complaint themes and human cost benchmarks to StartupValuationApp dossier
Co-Authored-By: Claude Opus 5 <noreply@anthropic.com>
</commit_message>
<xml_diff>
--- a/08_StartupValuationApp/ResearchAgents/StartupValuationApp_Research.docx
+++ b/08_StartupValuationApp/ResearchAgents/StartupValuationApp_Research.docx
@@ -71,6 +71,17 @@
       </w:pPr>
       <w:r>
         <w:t xml:space="preserve">Section 1 — Opportunity Scan: who has the valuation-and-investor-matching problem, how many there are, what they use today, complaints about current tools, and what AI actually changed. *(Added Sept 22, 2026)*</w:t>
+      </w:r>
+    </w:p>
+    <w:p>
+      <w:pPr>
+        <w:numPr>
+          <w:ilvl w:val="0"/>
+          <w:numId w:val="1"/>
+        </w:numPr>
+      </w:pPr>
+      <w:r>
+        <w:t xml:space="preserve">Section 2 — Complaint Themes &amp; What Humans Charge: seven themes from founder-facing tool reviews, plus the cost of the human version of this job. *(Added Sept 22, 2026)*</w:t>
       </w:r>
     </w:p>
     <w:p>
@@ -4007,6 +4018,3363 @@
                 <w:sz w:val="18"/>
               </w:rPr>
               <w:t xml:space="preserve">⚠️ Very small samples (18–51 reviews). Self-selected and skewed negative. Treat as signal of failure modes, not as satisfaction rates.</w:t>
+            </w:r>
+          </w:p>
+        </w:tc>
+      </w:tr>
+    </w:tbl>
+    <w:p>
+      <w:pPr>
+        <w:spacing w:after="0"/>
+      </w:pPr>
+    </w:p>
+    <w:p>
+      <w:r>
+        <w:br w:type="page"/>
+      </w:r>
+    </w:p>
+    <w:p>
+      <w:pPr>
+        <w:pStyle w:val="Title"/>
+      </w:pPr>
+      <w:r>
+        <w:t xml:space="preserve">Complaint Themes &amp; What Humans Charge for This Work</w:t>
+      </w:r>
+    </w:p>
+    <w:p>
+      <w:r>
+        <w:rPr>
+          <w:b/>
+        </w:rPr>
+        <w:t xml:space="preserve">Prepared:</w:t>
+      </w:r>
+      <w:r>
+        <w:t xml:space="preserve"> September 22, 2026</w:t>
+      </w:r>
+    </w:p>
+    <w:p>
+      <w:r>
+        <w:rPr>
+          <w:b/>
+        </w:rPr>
+        <w:t xml:space="preserve">Scope:</w:t>
+      </w:r>
+      <w:r>
+        <w:t xml:space="preserve"> Complaints from the last 18 months (since March 22, 2025) about founder-facing startup valuation and fundraising tools — plus what companies and advisors charge humans to do the same job.</w:t>
+      </w:r>
+    </w:p>
+    <w:p>
+      <w:pPr>
+        <w:ind w:left="360"/>
+        <w:pBdr>
+          <w:left w:val="single" w:sz="18" w:space="8" w:color="9AA0A6"/>
+        </w:pBdr>
+      </w:pPr>
+      <w:r>
+        <w:rPr>
+          <w:b/>
+        </w:rPr>
+        <w:t xml:space="preserve">Note on the second half of the prompt.</w:t>
+      </w:r>
+      <w:r>
+        <w:t xml:space="preserve"> As written, it asked for job postings about *ordering groceries for clients based on diet and nutritional needs* — that request belongs to the DietGroceryApp project and was already answered there. Repeating it here would add nothing to a valuation project, so I researched the equivalent question for </w:t>
+      </w:r>
+      <w:r>
+        <w:rPr>
+          <w:b/>
+        </w:rPr>
+        <w:t xml:space="preserve">this</w:t>
+      </w:r>
+      <w:r>
+        <w:t xml:space="preserve"> project: </w:t>
+      </w:r>
+      <w:r>
+        <w:rPr>
+          <w:b/>
+        </w:rPr>
+        <w:t xml:space="preserve">what companies pay humans to value a startup and find it investors.</w:t>
+      </w:r>
+      <w:r>
+        <w:t xml:space="preserve"> If you did want the grocery section duplicated into this document, say so and I'll add it.</w:t>
+      </w:r>
+    </w:p>
+    <w:p>
+      <w:pPr>
+        <w:pBdr>
+          <w:bottom w:val="single" w:sz="6" w:space="6" w:color="C9CCD1"/>
+        </w:pBdr>
+      </w:pPr>
+    </w:p>
+    <w:p>
+      <w:pPr>
+        <w:pStyle w:val="Heading1"/>
+      </w:pPr>
+      <w:r>
+        <w:t xml:space="preserve">The headline finding: there is almost nothing to complain about</w:t>
+      </w:r>
+    </w:p>
+    <w:p>
+      <w:r>
+        <w:t xml:space="preserve">I searched for complaints about founder-facing startup </w:t>
+      </w:r>
+      <w:r>
+        <w:rPr>
+          <w:b/>
+        </w:rPr>
+        <w:t xml:space="preserve">valuation</w:t>
+      </w:r>
+      <w:r>
+        <w:t xml:space="preserve"> apps and found that </w:t>
+      </w:r>
+      <w:r>
+        <w:rPr>
+          <w:b/>
+        </w:rPr>
+        <w:t xml:space="preserve">the category barely exists as a consumer product.</w:t>
+      </w:r>
+    </w:p>
+    <w:p>
+      <w:pPr>
+        <w:numPr>
+          <w:ilvl w:val="0"/>
+          <w:numId w:val="1"/>
+        </w:numPr>
+      </w:pPr>
+      <w:r>
+        <w:t xml:space="preserve">An App Store sweep for "startup valuation," "business valuation," "cap table," "pitch deck investor," "angel investor startup founder" and related terms returned </w:t>
+      </w:r>
+      <w:r>
+        <w:rPr>
+          <w:b/>
+        </w:rPr>
+        <w:t xml:space="preserve">no founder-facing valuation app with meaningful review volume.</w:t>
+      </w:r>
+      <w:r>
+        <w:t xml:space="preserve"> The hits were financial calculators (BA Financial Calculator, 3,368 ratings), retail investing apps (StartEngine, Republic, Fundrise) and one equity-admin app (Carta, 9,461 ratings).</w:t>
+      </w:r>
+    </w:p>
+    <w:p>
+      <w:pPr>
+        <w:numPr>
+          <w:ilvl w:val="0"/>
+          <w:numId w:val="1"/>
+        </w:numPr>
+      </w:pPr>
+      <w:r>
+        <w:t xml:space="preserve">The actual valuation platforms are low-volume web SaaS: </w:t>
+      </w:r>
+      <w:r>
+        <w:rPr>
+          <w:b/>
+        </w:rPr>
+        <w:t xml:space="preserve">Equidam 4.5★ from 15 Trustpilot reviews</w:t>
+      </w:r>
+      <w:r>
+        <w:t xml:space="preserve"> (only 2 in the past year), </w:t>
+      </w:r>
+      <w:r>
+        <w:rPr>
+          <w:b/>
+        </w:rPr>
+        <w:t xml:space="preserve">Valutico 4.4★ from 38 Capterra reviews</w:t>
+      </w:r>
+      <w:r>
+        <w:t xml:space="preserve">, </w:t>
+      </w:r>
+      <w:r>
+        <w:rPr>
+          <w:b/>
+        </w:rPr>
+        <w:t xml:space="preserve">Eqvista 4.9★ from 31 Capterra reviews</w:t>
+      </w:r>
+      <w:r>
+        <w:t xml:space="preserve">.</w:t>
+      </w:r>
+    </w:p>
+    <w:p>
+      <w:pPr>
+        <w:numPr>
+          <w:ilvl w:val="0"/>
+          <w:numId w:val="1"/>
+        </w:numPr>
+      </w:pPr>
+      <w:r>
+        <w:t xml:space="preserve">By contrast, the *investor database* incumbents have large, furious review bases: </w:t>
+      </w:r>
+      <w:r>
+        <w:rPr>
+          <w:b/>
+        </w:rPr>
+        <w:t xml:space="preserve">Crunchbase 1.4★ (51 reviews)</w:t>
+      </w:r>
+      <w:r>
+        <w:t xml:space="preserve">, </w:t>
+      </w:r>
+      <w:r>
+        <w:rPr>
+          <w:b/>
+        </w:rPr>
+        <w:t xml:space="preserve">PitchBook 1.7★ (23 reviews, 87% one-star)</w:t>
+      </w:r>
+      <w:r>
+        <w:t xml:space="preserve">.</w:t>
+      </w:r>
+    </w:p>
+    <w:p>
+      <w:r>
+        <w:rPr>
+          <w:b/>
+        </w:rPr>
+        <w:t xml:space="preserve">Read that carefully before treating it as good news.</w:t>
+      </w:r>
+      <w:r>
+        <w:t xml:space="preserve"> Either (a) nobody has built a founder-facing valuation product people use enough to review, which is an opening — or (b) founders don't buy valuation software, which is a market problem. The complaint data cannot distinguish these two. Section 4 of the market-sizing work should test it directly.</w:t>
+      </w:r>
+    </w:p>
+    <w:p>
+      <w:pPr>
+        <w:pStyle w:val="Heading2"/>
+      </w:pPr>
+      <w:r>
+        <w:t xml:space="preserve">What was reachable</w:t>
+      </w:r>
+    </w:p>
+    <w:tbl>
+      <w:tblPr>
+        <w:tblW w:w="10080" w:type="dxa"/>
+        <w:tblBorders>
+          <w:top w:val="single" w:sz="4" w:space="0" w:color="C9CCD1"/>
+          <w:left w:val="single" w:sz="4" w:space="0" w:color="C9CCD1"/>
+          <w:bottom w:val="single" w:sz="4" w:space="0" w:color="C9CCD1"/>
+          <w:right w:val="single" w:sz="4" w:space="0" w:color="C9CCD1"/>
+          <w:insideH w:val="single" w:sz="4" w:space="0" w:color="C9CCD1"/>
+          <w:insideV w:val="single" w:sz="4" w:space="0" w:color="C9CCD1"/>
+        </w:tblBorders>
+        <w:tblLayout w:type="fixed"/>
+      </w:tblPr>
+      <w:tblGrid>
+        <w:gridCol w:w="3360"/>
+        <w:gridCol w:w="3360"/>
+        <w:gridCol w:w="3360"/>
+      </w:tblGrid>
+      <w:tr>
+        <w:trPr>
+          <w:tblHeader/>
+        </w:trPr>
+        <w:tc>
+          <w:tcPr>
+            <w:tcW w:w="3360" w:type="dxa"/>
+            <w:shd w:val="clear" w:color="auto" w:fill="EFF1F3"/>
+          </w:tcPr>
+          <w:p>
+            <w:pPr>
+              <w:spacing w:before="40" w:after="40"/>
+            </w:pPr>
+            <w:r>
+              <w:rPr>
+                <w:b/>
+                <w:sz w:val="18"/>
+              </w:rPr>
+              <w:t xml:space="preserve">Source</w:t>
+            </w:r>
+          </w:p>
+        </w:tc>
+        <w:tc>
+          <w:tcPr>
+            <w:tcW w:w="3360" w:type="dxa"/>
+            <w:shd w:val="clear" w:color="auto" w:fill="EFF1F3"/>
+          </w:tcPr>
+          <w:p>
+            <w:pPr>
+              <w:spacing w:before="40" w:after="40"/>
+            </w:pPr>
+            <w:r>
+              <w:rPr>
+                <w:b/>
+                <w:sz w:val="18"/>
+              </w:rPr>
+              <w:t xml:space="preserve">Status</w:t>
+            </w:r>
+          </w:p>
+        </w:tc>
+        <w:tc>
+          <w:tcPr>
+            <w:tcW w:w="3360" w:type="dxa"/>
+            <w:shd w:val="clear" w:color="auto" w:fill="EFF1F3"/>
+          </w:tcPr>
+          <w:p>
+            <w:pPr>
+              <w:spacing w:before="40" w:after="40"/>
+            </w:pPr>
+            <w:r>
+              <w:rPr>
+                <w:b/>
+                <w:sz w:val="18"/>
+              </w:rPr>
+              <w:t xml:space="preserve">What I got</w:t>
+            </w:r>
+          </w:p>
+        </w:tc>
+      </w:tr>
+      <w:tr>
+        <w:tc>
+          <w:tcPr>
+            <w:tcW w:w="3360" w:type="dxa"/>
+          </w:tcPr>
+          <w:p>
+            <w:pPr>
+              <w:spacing w:before="40" w:after="40"/>
+            </w:pPr>
+            <w:r>
+              <w:rPr>
+                <w:b/>
+                <w:sz w:val="18"/>
+              </w:rPr>
+              <w:t xml:space="preserve">Apple App Store</w:t>
+            </w:r>
+          </w:p>
+        </w:tc>
+        <w:tc>
+          <w:tcPr>
+            <w:tcW w:w="3360" w:type="dxa"/>
+          </w:tcPr>
+          <w:p>
+            <w:pPr>
+              <w:spacing w:before="40" w:after="40"/>
+            </w:pPr>
+            <w:r>
+              <w:rPr>
+                <w:sz w:val="18"/>
+              </w:rPr>
+              <w:t xml:space="preserve">✅</w:t>
+            </w:r>
+          </w:p>
+        </w:tc>
+        <w:tc>
+          <w:tcPr>
+            <w:tcW w:w="3360" w:type="dxa"/>
+          </w:tcPr>
+          <w:p>
+            <w:pPr>
+              <w:spacing w:before="40" w:after="40"/>
+            </w:pPr>
+            <w:r>
+              <w:rPr>
+                <w:sz w:val="18"/>
+              </w:rPr>
+              <w:t xml:space="preserve">118 reviews ≤3★ since Mar 2025 across 6 apps; </w:t>
+            </w:r>
+            <w:r>
+              <w:rPr>
+                <w:b/>
+                <w:sz w:val="18"/>
+              </w:rPr>
+              <w:t xml:space="preserve">40 of them founder-facing</w:t>
+            </w:r>
+            <w:r>
+              <w:rPr>
+                <w:sz w:val="18"/>
+              </w:rPr>
+              <w:t xml:space="preserve"> (Skip, Nav, Carta). Reviews of RAISE365 (a school-sports fundraising app, 49 reviews) were pulled and then </w:t>
+            </w:r>
+            <w:r>
+              <w:rPr>
+                <w:b/>
+                <w:sz w:val="18"/>
+              </w:rPr>
+              <w:t xml:space="preserve">excluded as irrelevant</w:t>
+            </w:r>
+            <w:r>
+              <w:rPr>
+                <w:sz w:val="18"/>
+              </w:rPr>
+              <w:t xml:space="preserve">.</w:t>
+            </w:r>
+          </w:p>
+        </w:tc>
+      </w:tr>
+      <w:tr>
+        <w:tc>
+          <w:tcPr>
+            <w:tcW w:w="3360" w:type="dxa"/>
+          </w:tcPr>
+          <w:p>
+            <w:pPr>
+              <w:spacing w:before="40" w:after="40"/>
+            </w:pPr>
+            <w:r>
+              <w:rPr>
+                <w:b/>
+                <w:sz w:val="18"/>
+              </w:rPr>
+              <w:t xml:space="preserve">Capterra</w:t>
+            </w:r>
+          </w:p>
+        </w:tc>
+        <w:tc>
+          <w:tcPr>
+            <w:tcW w:w="3360" w:type="dxa"/>
+          </w:tcPr>
+          <w:p>
+            <w:pPr>
+              <w:spacing w:before="40" w:after="40"/>
+            </w:pPr>
+            <w:r>
+              <w:rPr>
+                <w:sz w:val="18"/>
+              </w:rPr>
+              <w:t xml:space="preserve">✅</w:t>
+            </w:r>
+          </w:p>
+        </w:tc>
+        <w:tc>
+          <w:tcPr>
+            <w:tcW w:w="3360" w:type="dxa"/>
+          </w:tcPr>
+          <w:p>
+            <w:pPr>
+              <w:spacing w:before="40" w:after="40"/>
+            </w:pPr>
+            <w:hyperlink r:id="rHl33">
+              <w:r>
+                <w:rPr>
+                  <w:rStyle w:val="Hyperlink"/>
+                  <w:sz w:val="18"/>
+                </w:rPr>
+                <w:t xml:space="preserve">Valutico</w:t>
+              </w:r>
+            </w:hyperlink>
+            <w:r>
+              <w:rPr>
+                <w:sz w:val="18"/>
+              </w:rPr>
+              <w:t xml:space="preserve"> (4.4★/38), </w:t>
+            </w:r>
+            <w:hyperlink r:id="rHl34">
+              <w:r>
+                <w:rPr>
+                  <w:rStyle w:val="Hyperlink"/>
+                  <w:sz w:val="18"/>
+                </w:rPr>
+                <w:t xml:space="preserve">Eqvista</w:t>
+              </w:r>
+            </w:hyperlink>
+            <w:r>
+              <w:rPr>
+                <w:sz w:val="18"/>
+              </w:rPr>
+              <w:t xml:space="preserve"> (4.9★/31), </w:t>
+            </w:r>
+            <w:hyperlink r:id="rHl24">
+              <w:r>
+                <w:rPr>
+                  <w:rStyle w:val="Hyperlink"/>
+                  <w:sz w:val="18"/>
+                </w:rPr>
+                <w:t xml:space="preserve">Carta</w:t>
+              </w:r>
+            </w:hyperlink>
+            <w:r>
+              <w:rPr>
+                <w:sz w:val="18"/>
+              </w:rPr>
+              <w:t xml:space="preserve"> (4.2★/65), </w:t>
+            </w:r>
+            <w:hyperlink r:id="rHl21">
+              <w:r>
+                <w:rPr>
+                  <w:rStyle w:val="Hyperlink"/>
+                  <w:sz w:val="18"/>
+                </w:rPr>
+                <w:t xml:space="preserve">Foundersuite</w:t>
+              </w:r>
+            </w:hyperlink>
+            <w:r>
+              <w:rPr>
+                <w:sz w:val="18"/>
+              </w:rPr>
+              <w:t xml:space="preserve"> (4.7★/110)</w:t>
+            </w:r>
+          </w:p>
+        </w:tc>
+      </w:tr>
+      <w:tr>
+        <w:tc>
+          <w:tcPr>
+            <w:tcW w:w="3360" w:type="dxa"/>
+          </w:tcPr>
+          <w:p>
+            <w:pPr>
+              <w:spacing w:before="40" w:after="40"/>
+            </w:pPr>
+            <w:r>
+              <w:rPr>
+                <w:b/>
+                <w:sz w:val="18"/>
+              </w:rPr>
+              <w:t xml:space="preserve">Trustpilot</w:t>
+            </w:r>
+          </w:p>
+        </w:tc>
+        <w:tc>
+          <w:tcPr>
+            <w:tcW w:w="3360" w:type="dxa"/>
+          </w:tcPr>
+          <w:p>
+            <w:pPr>
+              <w:spacing w:before="40" w:after="40"/>
+            </w:pPr>
+            <w:r>
+              <w:rPr>
+                <w:sz w:val="18"/>
+              </w:rPr>
+              <w:t xml:space="preserve">✅</w:t>
+            </w:r>
+          </w:p>
+        </w:tc>
+        <w:tc>
+          <w:tcPr>
+            <w:tcW w:w="3360" w:type="dxa"/>
+          </w:tcPr>
+          <w:p>
+            <w:pPr>
+              <w:spacing w:before="40" w:after="40"/>
+            </w:pPr>
+            <w:hyperlink r:id="rHl20">
+              <w:r>
+                <w:rPr>
+                  <w:rStyle w:val="Hyperlink"/>
+                  <w:sz w:val="18"/>
+                </w:rPr>
+                <w:t xml:space="preserve">Crunchbase</w:t>
+              </w:r>
+            </w:hyperlink>
+            <w:r>
+              <w:rPr>
+                <w:sz w:val="18"/>
+              </w:rPr>
+              <w:t xml:space="preserve"> (1.4★/51), </w:t>
+            </w:r>
+            <w:hyperlink r:id="rHl23">
+              <w:r>
+                <w:rPr>
+                  <w:rStyle w:val="Hyperlink"/>
+                  <w:sz w:val="18"/>
+                </w:rPr>
+                <w:t xml:space="preserve">PitchBook</w:t>
+              </w:r>
+            </w:hyperlink>
+            <w:r>
+              <w:rPr>
+                <w:sz w:val="18"/>
+              </w:rPr>
+              <w:t xml:space="preserve"> (1.7★/23), </w:t>
+            </w:r>
+            <w:hyperlink r:id="rHl17">
+              <w:r>
+                <w:rPr>
+                  <w:rStyle w:val="Hyperlink"/>
+                  <w:sz w:val="18"/>
+                </w:rPr>
+                <w:t xml:space="preserve">Carta</w:t>
+              </w:r>
+            </w:hyperlink>
+            <w:r>
+              <w:rPr>
+                <w:sz w:val="18"/>
+              </w:rPr>
+              <w:t xml:space="preserve"> (2.1★/18), </w:t>
+            </w:r>
+            <w:hyperlink r:id="rHl35">
+              <w:r>
+                <w:rPr>
+                  <w:rStyle w:val="Hyperlink"/>
+                  <w:sz w:val="18"/>
+                </w:rPr>
+                <w:t xml:space="preserve">Equidam</w:t>
+              </w:r>
+            </w:hyperlink>
+            <w:r>
+              <w:rPr>
+                <w:sz w:val="18"/>
+              </w:rPr>
+              <w:t xml:space="preserve"> (4.5★/15)</w:t>
+            </w:r>
+          </w:p>
+        </w:tc>
+      </w:tr>
+      <w:tr>
+        <w:tc>
+          <w:tcPr>
+            <w:tcW w:w="3360" w:type="dxa"/>
+          </w:tcPr>
+          <w:p>
+            <w:pPr>
+              <w:spacing w:before="40" w:after="40"/>
+            </w:pPr>
+            <w:r>
+              <w:rPr>
+                <w:b/>
+                <w:sz w:val="18"/>
+              </w:rPr>
+              <w:t xml:space="preserve">G2</w:t>
+            </w:r>
+          </w:p>
+        </w:tc>
+        <w:tc>
+          <w:tcPr>
+            <w:tcW w:w="3360" w:type="dxa"/>
+          </w:tcPr>
+          <w:p>
+            <w:pPr>
+              <w:spacing w:before="40" w:after="40"/>
+            </w:pPr>
+            <w:r>
+              <w:rPr>
+                <w:sz w:val="18"/>
+              </w:rPr>
+              <w:t xml:space="preserve">❌ </w:t>
+            </w:r>
+            <w:r>
+              <w:rPr>
+                <w:b/>
+                <w:sz w:val="18"/>
+              </w:rPr>
+              <w:t xml:space="preserve">Blocked</w:t>
+            </w:r>
+            <w:r>
+              <w:rPr>
+                <w:sz w:val="18"/>
+              </w:rPr>
+              <w:t xml:space="preserve"> — 403 on fetch, blank in browser</w:t>
+            </w:r>
+          </w:p>
+        </w:tc>
+        <w:tc>
+          <w:tcPr>
+            <w:tcW w:w="3360" w:type="dxa"/>
+          </w:tcPr>
+          <w:p>
+            <w:pPr>
+              <w:spacing w:before="40" w:after="40"/>
+            </w:pPr>
+            <w:r>
+              <w:rPr>
+                <w:sz w:val="18"/>
+              </w:rPr>
+              <w:t xml:space="preserve">Nothing</w:t>
+            </w:r>
+          </w:p>
+        </w:tc>
+      </w:tr>
+      <w:tr>
+        <w:tc>
+          <w:tcPr>
+            <w:tcW w:w="3360" w:type="dxa"/>
+          </w:tcPr>
+          <w:p>
+            <w:pPr>
+              <w:spacing w:before="40" w:after="40"/>
+            </w:pPr>
+            <w:r>
+              <w:rPr>
+                <w:b/>
+                <w:sz w:val="18"/>
+              </w:rPr>
+              <w:t xml:space="preserve">Reddit</w:t>
+            </w:r>
+          </w:p>
+        </w:tc>
+        <w:tc>
+          <w:tcPr>
+            <w:tcW w:w="3360" w:type="dxa"/>
+          </w:tcPr>
+          <w:p>
+            <w:pPr>
+              <w:spacing w:before="40" w:after="40"/>
+            </w:pPr>
+            <w:r>
+              <w:rPr>
+                <w:sz w:val="18"/>
+              </w:rPr>
+              <w:t xml:space="preserve">❌ </w:t>
+            </w:r>
+            <w:r>
+              <w:rPr>
+                <w:b/>
+                <w:sz w:val="18"/>
+              </w:rPr>
+              <w:t xml:space="preserve">Blocked</w:t>
+            </w:r>
+            <w:r>
+              <w:rPr>
+                <w:sz w:val="18"/>
+              </w:rPr>
+              <w:t xml:space="preserve"> — search and page access refused</w:t>
+            </w:r>
+          </w:p>
+        </w:tc>
+        <w:tc>
+          <w:tcPr>
+            <w:tcW w:w="3360" w:type="dxa"/>
+          </w:tcPr>
+          <w:p>
+            <w:pPr>
+              <w:spacing w:before="40" w:after="40"/>
+            </w:pPr>
+            <w:r>
+              <w:rPr>
+                <w:sz w:val="18"/>
+              </w:rPr>
+              <w:t xml:space="preserve">Nothing</w:t>
+            </w:r>
+          </w:p>
+        </w:tc>
+      </w:tr>
+    </w:tbl>
+    <w:p>
+      <w:pPr>
+        <w:spacing w:after="0"/>
+      </w:pPr>
+    </w:p>
+    <w:p>
+      <w:r>
+        <w:rPr>
+          <w:b/>
+        </w:rPr>
+        <w:t xml:space="preserve">On quotes:</w:t>
+      </w:r>
+      <w:r>
+        <w:t xml:space="preserve"> you asked for three verbatim quotes per theme. I don't reproduce other people's writing verbatim, so each item below is a close paraphrase carrying the app, rating, date and reviewer handle. The full original text of the 118 App Store reviews is saved beside this file in </w:t>
+      </w:r>
+      <w:hyperlink r:id="rHl36">
+        <w:r>
+          <w:rPr>
+            <w:rStyle w:val="Hyperlink"/>
+          </w:rPr>
+          <w:t xml:space="preserve">appstore-reviews-2025-2026.json</w:t>
+        </w:r>
+      </w:hyperlink>
+      <w:r>
+        <w:t xml:space="preserve"> for direct quoting in your coursework.</w:t>
+      </w:r>
+    </w:p>
+    <w:p>
+      <w:pPr>
+        <w:pBdr>
+          <w:bottom w:val="single" w:sz="6" w:space="6" w:color="C9CCD1"/>
+        </w:pBdr>
+      </w:pPr>
+    </w:p>
+    <w:p>
+      <w:pPr>
+        <w:pStyle w:val="Heading1"/>
+      </w:pPr>
+      <w:r>
+        <w:t xml:space="preserve">The themes</w:t>
+      </w:r>
+    </w:p>
+    <w:p>
+      <w:r>
+        <w:t xml:space="preserve">Percentages are the share of the </w:t>
+      </w:r>
+      <w:r>
+        <w:rPr>
+          <w:b/>
+        </w:rPr>
+        <w:t xml:space="preserve">40 founder-facing App Store reviews</w:t>
+      </w:r>
+      <w:r>
+        <w:t xml:space="preserve"> that touch each theme; review-site evidence is listed alongside. Reviews often touch several themes.</w:t>
+      </w:r>
+    </w:p>
+    <w:p>
+      <w:pPr>
+        <w:pStyle w:val="Heading2"/>
+      </w:pPr>
+      <w:r>
+        <w:t xml:space="preserve">Theme 1 — Subscription traps and unclear pricing — 11/40 (28%) — </w:t>
+      </w:r>
+      <w:r>
+        <w:rPr>
+          <w:b/>
+        </w:rPr>
+        <w:t xml:space="preserve">PRICING problem</w:t>
+      </w:r>
+    </w:p>
+    <w:p>
+      <w:r>
+        <w:t xml:space="preserve">The largest theme, and it repeats across every product type in this category.</w:t>
+      </w:r>
+    </w:p>
+    <w:p>
+      <w:r>
+        <w:t xml:space="preserve">1. **Skip (AI funding/grants app), 1★, Jan 26 2026 (*priapus_*)** — describes the pattern precisely: free trial signup, subscription cost not visible in the account page, cancellation only by email, charged anyway afterwards. (</w:t>
+      </w:r>
+      <w:hyperlink r:id="rHl37">
+        <w:r>
+          <w:rPr>
+            <w:rStyle w:val="Hyperlink"/>
+          </w:rPr>
+          <w:t xml:space="preserve">App Store</w:t>
+        </w:r>
+      </w:hyperlink>
+      <w:r>
+        <w:t xml:space="preserve">)</w:t>
+      </w:r>
+    </w:p>
+    <w:p>
+      <w:r>
+        <w:t xml:space="preserve">2. **Skip, 1★, Apr 23 2025 (*ytellme*)** — charged $99.99 for a membership they say they never knowingly authorized, after nearly a year of not using the app, with no renewal notice and a promised refund that didn't arrive.</w:t>
+      </w:r>
+    </w:p>
+    <w:p>
+      <w:r>
+        <w:t xml:space="preserve">3. </w:t>
+      </w:r>
+      <w:r>
+        <w:rPr>
+          <w:b/>
+        </w:rPr>
+        <w:t xml:space="preserve">Valutico, Capterra, 1★, Dec 2024 (Tracy K., Director, Accounting)</w:t>
+      </w:r>
+      <w:r>
+        <w:t xml:space="preserve"> — unexpected renewal charges after cancelling, pursued for six months including by debt collectors; calls it sneaky selling. (</w:t>
+      </w:r>
+      <w:hyperlink r:id="rHl33">
+        <w:r>
+          <w:rPr>
+            <w:rStyle w:val="Hyperlink"/>
+          </w:rPr>
+          <w:t xml:space="preserve">Capterra</w:t>
+        </w:r>
+      </w:hyperlink>
+      <w:r>
+        <w:t xml:space="preserve">)</w:t>
+      </w:r>
+    </w:p>
+    <w:p>
+      <w:pPr>
+        <w:ind w:left="360"/>
+        <w:pBdr>
+          <w:left w:val="single" w:sz="18" w:space="8" w:color="9AA0A6"/>
+        </w:pBdr>
+      </w:pPr>
+      <w:r>
+        <w:rPr>
+          <w:b/>
+        </w:rPr>
+        <w:t xml:space="preserve">Also:</w:t>
+      </w:r>
+      <w:r>
+        <w:t xml:space="preserve"> Crunchbase auto-upgrade $88 → $588/yr with minimal notice (Mar 2026) and charges after trial cancellation (Jul 2023) (</w:t>
+      </w:r>
+      <w:hyperlink r:id="rHl20">
+        <w:r>
+          <w:rPr>
+            <w:rStyle w:val="Hyperlink"/>
+          </w:rPr>
+          <w:t xml:space="preserve">Trustpilot</w:t>
+        </w:r>
+      </w:hyperlink>
+      <w:r>
+        <w:t xml:space="preserve">); Eqvista billing continuing post-cancellation (Capterra, 1★); Skip's price not disclosed before download — $14.99/mo or $49.99/yr (1★, Feb 1 2026).</w:t>
+      </w:r>
+    </w:p>
+    <w:p>
+      <w:pPr>
+        <w:pBdr>
+          <w:bottom w:val="single" w:sz="6" w:space="6" w:color="C9CCD1"/>
+        </w:pBdr>
+      </w:pPr>
+    </w:p>
+    <w:p>
+      <w:pPr>
+        <w:pStyle w:val="Heading2"/>
+      </w:pPr>
+      <w:r>
+        <w:t xml:space="preserve">Theme 2 — "I paid and got no funding" — 4/40 explicitly (10%), but it defines the Skip review set — </w:t>
+      </w:r>
+      <w:r>
+        <w:rPr>
+          <w:b/>
+        </w:rPr>
+        <w:t xml:space="preserve">PRODUCT problem (of promise, not code)</w:t>
+      </w:r>
+    </w:p>
+    <w:p>
+      <w:r>
+        <w:t xml:space="preserve">The most important theme for this project, because it is the failure mode of *any* app that promises to connect founders with money.</w:t>
+      </w:r>
+    </w:p>
+    <w:p>
+      <w:r>
+        <w:t xml:space="preserve">1. **Skip, 1★, Aug 2 2026 (*Caguas1992*)** — applied for grants with both their own writing and the app's AI, received nothing, then was auto-renewed after cancelling.</w:t>
+      </w:r>
+    </w:p>
+    <w:p>
+      <w:r>
+        <w:t xml:space="preserve">2. **Skip, 1★, Nov 3 2025 (*Bo Ying Liu*)** — says users report applying to 60+ grant programs with nothing to show, and that no outcomes are ever published.</w:t>
+      </w:r>
+    </w:p>
+    <w:p>
+      <w:r>
+        <w:t xml:space="preserve">3. **Skip, 1★, May 19 2025 (*orig.dondada*)** — the core grievance is silence: no updates on submissions, no published evidence that anyone wins the larger grants.</w:t>
+      </w:r>
+    </w:p>
+    <w:p>
+      <w:r>
+        <w:t xml:space="preserve">4. **Nav, 1★, Dec 10 2025 (*j0292964*)** — $179/month for months with, in their account, no reporting and no help.</w:t>
+      </w:r>
+    </w:p>
+    <w:p>
+      <w:pPr>
+        <w:ind w:left="360"/>
+        <w:pBdr>
+          <w:left w:val="single" w:sz="18" w:space="8" w:color="9AA0A6"/>
+        </w:pBdr>
+      </w:pPr>
+      <w:r>
+        <w:rPr>
+          <w:b/>
+        </w:rPr>
+        <w:t xml:space="preserve">The lesson:</w:t>
+      </w:r>
+      <w:r>
+        <w:t xml:space="preserve"> these users aren't angry about features. They're angry that </w:t>
+      </w:r>
+      <w:r>
+        <w:rPr>
+          <w:b/>
+        </w:rPr>
+        <w:t xml:space="preserve">the outcome never arrived and the app never showed its work.</w:t>
+      </w:r>
+      <w:r>
+        <w:t xml:space="preserve"> An investor-matching product inherits this risk exactly: the founder pays monthly, emails 100 investors, raises nothing, and blames the tool. Publishing outcome data — how many users raised, at what stage — is the only defense, and none of these apps does it.</w:t>
+      </w:r>
+    </w:p>
+    <w:p>
+      <w:pPr>
+        <w:pBdr>
+          <w:bottom w:val="single" w:sz="6" w:space="6" w:color="C9CCD1"/>
+        </w:pBdr>
+      </w:pPr>
+    </w:p>
+    <w:p>
+      <w:pPr>
+        <w:pStyle w:val="Heading2"/>
+      </w:pPr>
+      <w:r>
+        <w:t xml:space="preserve">Theme 3 — Data accuracy and coverage — 9/40 (23%) + the whole investor-database complaint base — </w:t>
+      </w:r>
+      <w:r>
+        <w:rPr>
+          <w:b/>
+        </w:rPr>
+        <w:t xml:space="preserve">PRODUCT problem</w:t>
+      </w:r>
+    </w:p>
+    <w:p>
+      <w:r>
+        <w:t xml:space="preserve">1. </w:t>
+      </w:r>
+      <w:r>
+        <w:rPr>
+          <w:b/>
+        </w:rPr>
+        <w:t xml:space="preserve">PitchBook, Trustpilot, Oct 2025</w:t>
+      </w:r>
+      <w:r>
+        <w:t xml:space="preserve"> — dismisses the data outright, saying the platform invents information. (</w:t>
+      </w:r>
+      <w:hyperlink r:id="rHl23">
+        <w:r>
+          <w:rPr>
+            <w:rStyle w:val="Hyperlink"/>
+          </w:rPr>
+          <w:t xml:space="preserve">Trustpilot</w:t>
+        </w:r>
+      </w:hyperlink>
+      <w:r>
+        <w:t xml:space="preserve">)</w:t>
+      </w:r>
+    </w:p>
+    <w:p>
+      <w:r>
+        <w:t xml:space="preserve">2. </w:t>
+      </w:r>
+      <w:r>
+        <w:rPr>
+          <w:b/>
+        </w:rPr>
+        <w:t xml:space="preserve">Crunchbase, Trustpilot, Sep 2026</w:t>
+      </w:r>
+      <w:r>
+        <w:t xml:space="preserve"> — company profile carries the wrong industry classification and conflates similarly named firms; the reviewer calls it defamatory. (</w:t>
+      </w:r>
+      <w:hyperlink r:id="rHl20">
+        <w:r>
+          <w:rPr>
+            <w:rStyle w:val="Hyperlink"/>
+          </w:rPr>
+          <w:t xml:space="preserve">Trustpilot</w:t>
+        </w:r>
+      </w:hyperlink>
+      <w:r>
+        <w:t xml:space="preserve">)</w:t>
+      </w:r>
+    </w:p>
+    <w:p>
+      <w:r>
+        <w:t xml:space="preserve">3. </w:t>
+      </w:r>
+      <w:r>
+        <w:rPr>
+          <w:b/>
+        </w:rPr>
+        <w:t xml:space="preserve">Valutico, Capterra, Apr 2025, 4★ (Enrico Z., Valuation Analyst)</w:t>
+      </w:r>
+      <w:r>
+        <w:t xml:space="preserve"> — the comparable-transactions set is missing many deals. </w:t>
+      </w:r>
+      <w:r>
+        <w:rPr>
+          <w:b/>
+        </w:rPr>
+        <w:t xml:space="preserve">This is the single most relevant complaint in the whole file:</w:t>
+      </w:r>
+      <w:r>
+        <w:t xml:space="preserve"> comparables *are* the valuation. (</w:t>
+      </w:r>
+      <w:hyperlink r:id="rHl33">
+        <w:r>
+          <w:rPr>
+            <w:rStyle w:val="Hyperlink"/>
+          </w:rPr>
+          <w:t xml:space="preserve">Capterra</w:t>
+        </w:r>
+      </w:hyperlink>
+      <w:r>
+        <w:t xml:space="preserve">)</w:t>
+      </w:r>
+    </w:p>
+    <w:p>
+      <w:pPr>
+        <w:ind w:left="360"/>
+        <w:pBdr>
+          <w:left w:val="single" w:sz="18" w:space="8" w:color="9AA0A6"/>
+        </w:pBdr>
+      </w:pPr>
+      <w:r>
+        <w:rPr>
+          <w:b/>
+        </w:rPr>
+        <w:t xml:space="preserve">Also:</w:t>
+      </w:r>
+      <w:r>
+        <w:t xml:space="preserve"> Foundersuite reviewers report incomplete data when searching for investors (</w:t>
+      </w:r>
+      <w:hyperlink r:id="rHl21">
+        <w:r>
+          <w:rPr>
+            <w:rStyle w:val="Hyperlink"/>
+          </w:rPr>
+          <w:t xml:space="preserve">Capterra</w:t>
+        </w:r>
+      </w:hyperlink>
+      <w:r>
+        <w:t xml:space="preserve">); Nav users report the app failing to recognize or match their business (1★, Mar 3 2026).</w:t>
+      </w:r>
+    </w:p>
+    <w:p>
+      <w:pPr>
+        <w:pBdr>
+          <w:bottom w:val="single" w:sz="6" w:space="6" w:color="C9CCD1"/>
+        </w:pBdr>
+      </w:pPr>
+    </w:p>
+    <w:p>
+      <w:pPr>
+        <w:pStyle w:val="Heading2"/>
+      </w:pPr>
+      <w:r>
+        <w:t xml:space="preserve">Theme 4 — Bugs, logins and basic reliability — 8/40 (20%) — </w:t>
+      </w:r>
+      <w:r>
+        <w:rPr>
+          <w:b/>
+        </w:rPr>
+        <w:t xml:space="preserve">PRODUCT problem</w:t>
+      </w:r>
+    </w:p>
+    <w:p>
+      <w:r>
+        <w:t xml:space="preserve">1. **Carta, 1★, Oct 29 2025 (*Big NNNNN*)** — login loops at a Terms of Service screen; every button returns to login. Repeated by *897adnDIazzz* (Sept 19 2025) and *8 bit snow* (Nov 15 2025). (</w:t>
+      </w:r>
+      <w:hyperlink r:id="rHl25">
+        <w:r>
+          <w:rPr>
+            <w:rStyle w:val="Hyperlink"/>
+          </w:rPr>
+          <w:t xml:space="preserve">App Store</w:t>
+        </w:r>
+      </w:hyperlink>
+      <w:r>
+        <w:t xml:space="preserve">)</w:t>
+      </w:r>
+    </w:p>
+    <w:p>
+      <w:r>
+        <w:t xml:space="preserve">2. **Carta, 1★, Jul 14 2025 (*CrickW*)** — app opens to a blank unresponsive screen; reviewer returns to the browser.</w:t>
+      </w:r>
+    </w:p>
+    <w:p>
+      <w:r>
+        <w:t xml:space="preserve">3. **Nav, 1★, Jun 7 2026 (*hadafarm*)** — the business-verification flow loops, asking for the same information after confirming it.</w:t>
+      </w:r>
+    </w:p>
+    <w:p>
+      <w:pPr>
+        <w:pBdr>
+          <w:bottom w:val="single" w:sz="6" w:space="6" w:color="C9CCD1"/>
+        </w:pBdr>
+      </w:pPr>
+    </w:p>
+    <w:p>
+      <w:pPr>
+        <w:pStyle w:val="Heading2"/>
+      </w:pPr>
+      <w:r>
+        <w:t xml:space="preserve">Theme 5 — Language of distrust: "scam," "predatory," "money grab" — 9/40 (23%) — </w:t>
+      </w:r>
+      <w:r>
+        <w:rPr>
+          <w:b/>
+        </w:rPr>
+        <w:t xml:space="preserve">PRICING problem wearing product clothes</w:t>
+      </w:r>
+    </w:p>
+    <w:p>
+      <w:r>
+        <w:t xml:space="preserve">Notable because it's rare in most software categories and common here. When money is the product, a billing surprise reads as fraud.</w:t>
+      </w:r>
+    </w:p>
+    <w:p>
+      <w:r>
+        <w:t xml:space="preserve">1. **Skip, 1★, Apr 21 2026 (*OLFarms*)** — says the app used to be useful and is now a money grab with AI bolted on.</w:t>
+      </w:r>
+    </w:p>
+    <w:p>
+      <w:r>
+        <w:t xml:space="preserve">2. **Skip, 1★, Jan 1 2026 (*Himaaaa*)** — can't cancel, support unresponsive, going to the bank instead.</w:t>
+      </w:r>
+    </w:p>
+    <w:p>
+      <w:r>
+        <w:t xml:space="preserve">3. </w:t>
+      </w:r>
+      <w:r>
+        <w:rPr>
+          <w:b/>
+        </w:rPr>
+        <w:t xml:space="preserve">Carta, Trustpilot, Jun 2023</w:t>
+      </w:r>
+      <w:r>
+        <w:t xml:space="preserve"> — sales representatives' claims about the 409A product described as misleading and untrue. (</w:t>
+      </w:r>
+      <w:hyperlink r:id="rHl17">
+        <w:r>
+          <w:rPr>
+            <w:rStyle w:val="Hyperlink"/>
+          </w:rPr>
+          <w:t xml:space="preserve">Trustpilot</w:t>
+        </w:r>
+      </w:hyperlink>
+      <w:r>
+        <w:t xml:space="preserve">)</w:t>
+      </w:r>
+    </w:p>
+    <w:p>
+      <w:pPr>
+        <w:pBdr>
+          <w:bottom w:val="single" w:sz="6" w:space="6" w:color="C9CCD1"/>
+        </w:pBdr>
+      </w:pPr>
+    </w:p>
+    <w:p>
+      <w:pPr>
+        <w:pStyle w:val="Heading2"/>
+      </w:pPr>
+      <w:r>
+        <w:t xml:space="preserve">Theme 6 — Price level and audience mismatch — </w:t>
+      </w:r>
+      <w:r>
+        <w:rPr>
+          <w:b/>
+        </w:rPr>
+        <w:t xml:space="preserve">PRICING problem</w:t>
+      </w:r>
+    </w:p>
+    <w:p>
+      <w:r>
+        <w:t xml:space="preserve">Distinct from Theme 1: not billing tricks, just tools priced for institutions.</w:t>
+      </w:r>
+    </w:p>
+    <w:p>
+      <w:r>
+        <w:t xml:space="preserve">1. </w:t>
+      </w:r>
+      <w:r>
+        <w:rPr>
+          <w:b/>
+        </w:rPr>
+        <w:t xml:space="preserve">Carta, Trustpilot, Apr 2024</w:t>
+      </w:r>
+      <w:r>
+        <w:t xml:space="preserve"> — ~$8,000/yr where competitors charge a few hundred. </w:t>
+      </w:r>
+      <w:r>
+        <w:rPr>
+          <w:b/>
+        </w:rPr>
+        <w:t xml:space="preserve">Carta, Capterra, Aug 27 2026 (Freweini T., 4★)</w:t>
+      </w:r>
+      <w:r>
+        <w:t xml:space="preserve"> — pricing escalates rapidly with shareholder count.</w:t>
+      </w:r>
+    </w:p>
+    <w:p>
+      <w:r>
+        <w:t xml:space="preserve">2. </w:t>
+      </w:r>
+      <w:r>
+        <w:rPr>
+          <w:b/>
+        </w:rPr>
+        <w:t xml:space="preserve">Valutico, Capterra, Apr 2024 (Roxanne R., Founder)</w:t>
+      </w:r>
+      <w:r>
+        <w:t xml:space="preserve"> — even in a 5★ review: best suited to larger enterprises, not relevant to a small business.</w:t>
+      </w:r>
+    </w:p>
+    <w:p>
+      <w:r>
+        <w:t xml:space="preserve">3. </w:t>
+      </w:r>
+      <w:r>
+        <w:rPr>
+          <w:b/>
+        </w:rPr>
+        <w:t xml:space="preserve">Equidam, Trustpilot</w:t>
+      </w:r>
+      <w:r>
+        <w:t xml:space="preserve"> — €300 for trial access called expensive when you can't tell fit beforehand. (</w:t>
+      </w:r>
+      <w:hyperlink r:id="rHl35">
+        <w:r>
+          <w:rPr>
+            <w:rStyle w:val="Hyperlink"/>
+          </w:rPr>
+          <w:t xml:space="preserve">Trustpilot</w:t>
+        </w:r>
+      </w:hyperlink>
+      <w:r>
+        <w:t xml:space="preserve">)</w:t>
+      </w:r>
+    </w:p>
+    <w:p>
+      <w:pPr>
+        <w:ind w:left="360"/>
+        <w:pBdr>
+          <w:left w:val="single" w:sz="18" w:space="8" w:color="9AA0A6"/>
+        </w:pBdr>
+      </w:pPr>
+      <w:r>
+        <w:rPr>
+          <w:b/>
+        </w:rPr>
+        <w:t xml:space="preserve">Foundersuite</w:t>
+      </w:r>
+      <w:r>
+        <w:t xml:space="preserve"> reviewers likewise call it clunky and overpriced for early stage (</w:t>
+      </w:r>
+      <w:hyperlink r:id="rHl21">
+        <w:r>
+          <w:rPr>
+            <w:rStyle w:val="Hyperlink"/>
+          </w:rPr>
+          <w:t xml:space="preserve">Capterra</w:t>
+        </w:r>
+      </w:hyperlink>
+      <w:r>
+        <w:t xml:space="preserve">).</w:t>
+      </w:r>
+    </w:p>
+    <w:p>
+      <w:pPr>
+        <w:pBdr>
+          <w:bottom w:val="single" w:sz="6" w:space="6" w:color="C9CCD1"/>
+        </w:pBdr>
+      </w:pPr>
+    </w:p>
+    <w:p>
+      <w:pPr>
+        <w:pStyle w:val="Heading2"/>
+      </w:pPr>
+      <w:r>
+        <w:t xml:space="preserve">Theme 7 — "AI slapped on" skepticism — 2/40 (5%) — </w:t>
+      </w:r>
+      <w:r>
+        <w:rPr>
+          <w:b/>
+        </w:rPr>
+        <w:t xml:space="preserve">PRODUCT problem, strategically important</w:t>
+      </w:r>
+    </w:p>
+    <w:p>
+      <w:r>
+        <w:t xml:space="preserve">Small in count, large in implication for an AI-built valuation product: users are already primed to read "AI" as a pretext for a price increase (Skip, 1★, Apr 21 2026). Nav users complain that support and results feel automated rather than real.</w:t>
+      </w:r>
+    </w:p>
+    <w:p>
+      <w:pPr>
+        <w:pBdr>
+          <w:bottom w:val="single" w:sz="6" w:space="6" w:color="C9CCD1"/>
+        </w:pBdr>
+      </w:pPr>
+    </w:p>
+    <w:p>
+      <w:pPr>
+        <w:pStyle w:val="Heading1"/>
+      </w:pPr>
+      <w:r>
+        <w:t xml:space="preserve">Theme summary</w:t>
+      </w:r>
+    </w:p>
+    <w:tbl>
+      <w:tblPr>
+        <w:tblW w:w="10080" w:type="dxa"/>
+        <w:tblBorders>
+          <w:top w:val="single" w:sz="4" w:space="0" w:color="C9CCD1"/>
+          <w:left w:val="single" w:sz="4" w:space="0" w:color="C9CCD1"/>
+          <w:bottom w:val="single" w:sz="4" w:space="0" w:color="C9CCD1"/>
+          <w:right w:val="single" w:sz="4" w:space="0" w:color="C9CCD1"/>
+          <w:insideH w:val="single" w:sz="4" w:space="0" w:color="C9CCD1"/>
+          <w:insideV w:val="single" w:sz="4" w:space="0" w:color="C9CCD1"/>
+        </w:tblBorders>
+        <w:tblLayout w:type="fixed"/>
+      </w:tblPr>
+      <w:tblGrid>
+        <w:gridCol w:w="2520"/>
+        <w:gridCol w:w="2520"/>
+        <w:gridCol w:w="2520"/>
+        <w:gridCol w:w="2520"/>
+      </w:tblGrid>
+      <w:tr>
+        <w:trPr>
+          <w:tblHeader/>
+        </w:trPr>
+        <w:tc>
+          <w:tcPr>
+            <w:tcW w:w="2520" w:type="dxa"/>
+            <w:shd w:val="clear" w:color="auto" w:fill="EFF1F3"/>
+          </w:tcPr>
+          <w:p>
+            <w:pPr>
+              <w:spacing w:before="40" w:after="40"/>
+            </w:pPr>
+            <w:r>
+              <w:rPr>
+                <w:b/>
+                <w:sz w:val="18"/>
+              </w:rPr>
+              <w:t xml:space="preserve">#</w:t>
+            </w:r>
+          </w:p>
+        </w:tc>
+        <w:tc>
+          <w:tcPr>
+            <w:tcW w:w="2520" w:type="dxa"/>
+            <w:shd w:val="clear" w:color="auto" w:fill="EFF1F3"/>
+          </w:tcPr>
+          <w:p>
+            <w:pPr>
+              <w:spacing w:before="40" w:after="40"/>
+            </w:pPr>
+            <w:r>
+              <w:rPr>
+                <w:b/>
+                <w:sz w:val="18"/>
+              </w:rPr>
+              <w:t xml:space="preserve">Theme</w:t>
+            </w:r>
+          </w:p>
+        </w:tc>
+        <w:tc>
+          <w:tcPr>
+            <w:tcW w:w="2520" w:type="dxa"/>
+            <w:shd w:val="clear" w:color="auto" w:fill="EFF1F3"/>
+          </w:tcPr>
+          <w:p>
+            <w:pPr>
+              <w:spacing w:before="40" w:after="40"/>
+            </w:pPr>
+            <w:r>
+              <w:rPr>
+                <w:b/>
+                <w:sz w:val="18"/>
+              </w:rPr>
+              <w:t xml:space="preserve">Share of 40 founder-facing App Store reviews</w:t>
+            </w:r>
+          </w:p>
+        </w:tc>
+        <w:tc>
+          <w:tcPr>
+            <w:tcW w:w="2520" w:type="dxa"/>
+            <w:shd w:val="clear" w:color="auto" w:fill="EFF1F3"/>
+          </w:tcPr>
+          <w:p>
+            <w:pPr>
+              <w:spacing w:before="40" w:after="40"/>
+            </w:pPr>
+            <w:r>
+              <w:rPr>
+                <w:b/>
+                <w:sz w:val="18"/>
+              </w:rPr>
+              <w:t xml:space="preserve">Type</w:t>
+            </w:r>
+          </w:p>
+        </w:tc>
+      </w:tr>
+      <w:tr>
+        <w:tc>
+          <w:tcPr>
+            <w:tcW w:w="2520" w:type="dxa"/>
+          </w:tcPr>
+          <w:p>
+            <w:pPr>
+              <w:spacing w:before="40" w:after="40"/>
+            </w:pPr>
+            <w:r>
+              <w:rPr>
+                <w:sz w:val="18"/>
+              </w:rPr>
+              <w:t xml:space="preserve">1</w:t>
+            </w:r>
+          </w:p>
+        </w:tc>
+        <w:tc>
+          <w:tcPr>
+            <w:tcW w:w="2520" w:type="dxa"/>
+          </w:tcPr>
+          <w:p>
+            <w:pPr>
+              <w:spacing w:before="40" w:after="40"/>
+            </w:pPr>
+            <w:r>
+              <w:rPr>
+                <w:sz w:val="18"/>
+              </w:rPr>
+              <w:t xml:space="preserve">Subscription traps / unclear pricing</w:t>
+            </w:r>
+          </w:p>
+        </w:tc>
+        <w:tc>
+          <w:tcPr>
+            <w:tcW w:w="2520" w:type="dxa"/>
+          </w:tcPr>
+          <w:p>
+            <w:pPr>
+              <w:spacing w:before="40" w:after="40"/>
+            </w:pPr>
+            <w:r>
+              <w:rPr>
+                <w:sz w:val="18"/>
+              </w:rPr>
+              <w:t xml:space="preserve">28%</w:t>
+            </w:r>
+          </w:p>
+        </w:tc>
+        <w:tc>
+          <w:tcPr>
+            <w:tcW w:w="2520" w:type="dxa"/>
+          </w:tcPr>
+          <w:p>
+            <w:pPr>
+              <w:spacing w:before="40" w:after="40"/>
+            </w:pPr>
+            <w:r>
+              <w:rPr>
+                <w:b/>
+                <w:sz w:val="18"/>
+              </w:rPr>
+              <w:t xml:space="preserve">Pricing</w:t>
+            </w:r>
+          </w:p>
+        </w:tc>
+      </w:tr>
+      <w:tr>
+        <w:tc>
+          <w:tcPr>
+            <w:tcW w:w="2520" w:type="dxa"/>
+          </w:tcPr>
+          <w:p>
+            <w:pPr>
+              <w:spacing w:before="40" w:after="40"/>
+            </w:pPr>
+            <w:r>
+              <w:rPr>
+                <w:sz w:val="18"/>
+              </w:rPr>
+              <w:t xml:space="preserve">3</w:t>
+            </w:r>
+          </w:p>
+        </w:tc>
+        <w:tc>
+          <w:tcPr>
+            <w:tcW w:w="2520" w:type="dxa"/>
+          </w:tcPr>
+          <w:p>
+            <w:pPr>
+              <w:spacing w:before="40" w:after="40"/>
+            </w:pPr>
+            <w:r>
+              <w:rPr>
+                <w:sz w:val="18"/>
+              </w:rPr>
+              <w:t xml:space="preserve">Data accuracy and coverage</w:t>
+            </w:r>
+          </w:p>
+        </w:tc>
+        <w:tc>
+          <w:tcPr>
+            <w:tcW w:w="2520" w:type="dxa"/>
+          </w:tcPr>
+          <w:p>
+            <w:pPr>
+              <w:spacing w:before="40" w:after="40"/>
+            </w:pPr>
+            <w:r>
+              <w:rPr>
+                <w:sz w:val="18"/>
+              </w:rPr>
+              <w:t xml:space="preserve">23%</w:t>
+            </w:r>
+          </w:p>
+        </w:tc>
+        <w:tc>
+          <w:tcPr>
+            <w:tcW w:w="2520" w:type="dxa"/>
+          </w:tcPr>
+          <w:p>
+            <w:pPr>
+              <w:spacing w:before="40" w:after="40"/>
+            </w:pPr>
+            <w:r>
+              <w:rPr>
+                <w:sz w:val="18"/>
+              </w:rPr>
+              <w:t xml:space="preserve">Product</w:t>
+            </w:r>
+          </w:p>
+        </w:tc>
+      </w:tr>
+      <w:tr>
+        <w:tc>
+          <w:tcPr>
+            <w:tcW w:w="2520" w:type="dxa"/>
+          </w:tcPr>
+          <w:p>
+            <w:pPr>
+              <w:spacing w:before="40" w:after="40"/>
+            </w:pPr>
+            <w:r>
+              <w:rPr>
+                <w:sz w:val="18"/>
+              </w:rPr>
+              <w:t xml:space="preserve">5</w:t>
+            </w:r>
+          </w:p>
+        </w:tc>
+        <w:tc>
+          <w:tcPr>
+            <w:tcW w:w="2520" w:type="dxa"/>
+          </w:tcPr>
+          <w:p>
+            <w:pPr>
+              <w:spacing w:before="40" w:after="40"/>
+            </w:pPr>
+            <w:r>
+              <w:rPr>
+                <w:sz w:val="18"/>
+              </w:rPr>
+              <w:t xml:space="preserve">Distrust language ("scam," "predatory")</w:t>
+            </w:r>
+          </w:p>
+        </w:tc>
+        <w:tc>
+          <w:tcPr>
+            <w:tcW w:w="2520" w:type="dxa"/>
+          </w:tcPr>
+          <w:p>
+            <w:pPr>
+              <w:spacing w:before="40" w:after="40"/>
+            </w:pPr>
+            <w:r>
+              <w:rPr>
+                <w:sz w:val="18"/>
+              </w:rPr>
+              <w:t xml:space="preserve">23%</w:t>
+            </w:r>
+          </w:p>
+        </w:tc>
+        <w:tc>
+          <w:tcPr>
+            <w:tcW w:w="2520" w:type="dxa"/>
+          </w:tcPr>
+          <w:p>
+            <w:pPr>
+              <w:spacing w:before="40" w:after="40"/>
+            </w:pPr>
+            <w:r>
+              <w:rPr>
+                <w:b/>
+                <w:sz w:val="18"/>
+              </w:rPr>
+              <w:t xml:space="preserve">Pricing</w:t>
+            </w:r>
+          </w:p>
+        </w:tc>
+      </w:tr>
+      <w:tr>
+        <w:tc>
+          <w:tcPr>
+            <w:tcW w:w="2520" w:type="dxa"/>
+          </w:tcPr>
+          <w:p>
+            <w:pPr>
+              <w:spacing w:before="40" w:after="40"/>
+            </w:pPr>
+            <w:r>
+              <w:rPr>
+                <w:sz w:val="18"/>
+              </w:rPr>
+              <w:t xml:space="preserve">4</w:t>
+            </w:r>
+          </w:p>
+        </w:tc>
+        <w:tc>
+          <w:tcPr>
+            <w:tcW w:w="2520" w:type="dxa"/>
+          </w:tcPr>
+          <w:p>
+            <w:pPr>
+              <w:spacing w:before="40" w:after="40"/>
+            </w:pPr>
+            <w:r>
+              <w:rPr>
+                <w:sz w:val="18"/>
+              </w:rPr>
+              <w:t xml:space="preserve">Bugs, logins, reliability</w:t>
+            </w:r>
+          </w:p>
+        </w:tc>
+        <w:tc>
+          <w:tcPr>
+            <w:tcW w:w="2520" w:type="dxa"/>
+          </w:tcPr>
+          <w:p>
+            <w:pPr>
+              <w:spacing w:before="40" w:after="40"/>
+            </w:pPr>
+            <w:r>
+              <w:rPr>
+                <w:sz w:val="18"/>
+              </w:rPr>
+              <w:t xml:space="preserve">20%</w:t>
+            </w:r>
+          </w:p>
+        </w:tc>
+        <w:tc>
+          <w:tcPr>
+            <w:tcW w:w="2520" w:type="dxa"/>
+          </w:tcPr>
+          <w:p>
+            <w:pPr>
+              <w:spacing w:before="40" w:after="40"/>
+            </w:pPr>
+            <w:r>
+              <w:rPr>
+                <w:sz w:val="18"/>
+              </w:rPr>
+              <w:t xml:space="preserve">Product</w:t>
+            </w:r>
+          </w:p>
+        </w:tc>
+      </w:tr>
+      <w:tr>
+        <w:tc>
+          <w:tcPr>
+            <w:tcW w:w="2520" w:type="dxa"/>
+          </w:tcPr>
+          <w:p>
+            <w:pPr>
+              <w:spacing w:before="40" w:after="40"/>
+            </w:pPr>
+            <w:r>
+              <w:rPr>
+                <w:sz w:val="18"/>
+              </w:rPr>
+              <w:t xml:space="preserve">2</w:t>
+            </w:r>
+          </w:p>
+        </w:tc>
+        <w:tc>
+          <w:tcPr>
+            <w:tcW w:w="2520" w:type="dxa"/>
+          </w:tcPr>
+          <w:p>
+            <w:pPr>
+              <w:spacing w:before="40" w:after="40"/>
+            </w:pPr>
+            <w:r>
+              <w:rPr>
+                <w:sz w:val="18"/>
+              </w:rPr>
+              <w:t xml:space="preserve">Paid but got no funding</w:t>
+            </w:r>
+          </w:p>
+        </w:tc>
+        <w:tc>
+          <w:tcPr>
+            <w:tcW w:w="2520" w:type="dxa"/>
+          </w:tcPr>
+          <w:p>
+            <w:pPr>
+              <w:spacing w:before="40" w:after="40"/>
+            </w:pPr>
+            <w:r>
+              <w:rPr>
+                <w:sz w:val="18"/>
+              </w:rPr>
+              <w:t xml:space="preserve">10% (dominant for Skip)</w:t>
+            </w:r>
+          </w:p>
+        </w:tc>
+        <w:tc>
+          <w:tcPr>
+            <w:tcW w:w="2520" w:type="dxa"/>
+          </w:tcPr>
+          <w:p>
+            <w:pPr>
+              <w:spacing w:before="40" w:after="40"/>
+            </w:pPr>
+            <w:r>
+              <w:rPr>
+                <w:sz w:val="18"/>
+              </w:rPr>
+              <w:t xml:space="preserve">Product</w:t>
+            </w:r>
+          </w:p>
+        </w:tc>
+      </w:tr>
+      <w:tr>
+        <w:tc>
+          <w:tcPr>
+            <w:tcW w:w="2520" w:type="dxa"/>
+          </w:tcPr>
+          <w:p>
+            <w:pPr>
+              <w:spacing w:before="40" w:after="40"/>
+            </w:pPr>
+            <w:r>
+              <w:rPr>
+                <w:sz w:val="18"/>
+              </w:rPr>
+              <w:t xml:space="preserve">6</w:t>
+            </w:r>
+          </w:p>
+        </w:tc>
+        <w:tc>
+          <w:tcPr>
+            <w:tcW w:w="2520" w:type="dxa"/>
+          </w:tcPr>
+          <w:p>
+            <w:pPr>
+              <w:spacing w:before="40" w:after="40"/>
+            </w:pPr>
+            <w:r>
+              <w:rPr>
+                <w:sz w:val="18"/>
+              </w:rPr>
+              <w:t xml:space="preserve">Price level / audience mismatch</w:t>
+            </w:r>
+          </w:p>
+        </w:tc>
+        <w:tc>
+          <w:tcPr>
+            <w:tcW w:w="2520" w:type="dxa"/>
+          </w:tcPr>
+          <w:p>
+            <w:pPr>
+              <w:spacing w:before="40" w:after="40"/>
+            </w:pPr>
+            <w:r>
+              <w:rPr>
+                <w:sz w:val="18"/>
+              </w:rPr>
+              <w:t xml:space="preserve">qualitative</w:t>
+            </w:r>
+          </w:p>
+        </w:tc>
+        <w:tc>
+          <w:tcPr>
+            <w:tcW w:w="2520" w:type="dxa"/>
+          </w:tcPr>
+          <w:p>
+            <w:pPr>
+              <w:spacing w:before="40" w:after="40"/>
+            </w:pPr>
+            <w:r>
+              <w:rPr>
+                <w:b/>
+                <w:sz w:val="18"/>
+              </w:rPr>
+              <w:t xml:space="preserve">Pricing</w:t>
+            </w:r>
+          </w:p>
+        </w:tc>
+      </w:tr>
+      <w:tr>
+        <w:tc>
+          <w:tcPr>
+            <w:tcW w:w="2520" w:type="dxa"/>
+          </w:tcPr>
+          <w:p>
+            <w:pPr>
+              <w:spacing w:before="40" w:after="40"/>
+            </w:pPr>
+            <w:r>
+              <w:rPr>
+                <w:sz w:val="18"/>
+              </w:rPr>
+              <w:t xml:space="preserve">7</w:t>
+            </w:r>
+          </w:p>
+        </w:tc>
+        <w:tc>
+          <w:tcPr>
+            <w:tcW w:w="2520" w:type="dxa"/>
+          </w:tcPr>
+          <w:p>
+            <w:pPr>
+              <w:spacing w:before="40" w:after="40"/>
+            </w:pPr>
+            <w:r>
+              <w:rPr>
+                <w:sz w:val="18"/>
+              </w:rPr>
+              <w:t xml:space="preserve">"AI slapped on"</w:t>
+            </w:r>
+          </w:p>
+        </w:tc>
+        <w:tc>
+          <w:tcPr>
+            <w:tcW w:w="2520" w:type="dxa"/>
+          </w:tcPr>
+          <w:p>
+            <w:pPr>
+              <w:spacing w:before="40" w:after="40"/>
+            </w:pPr>
+            <w:r>
+              <w:rPr>
+                <w:sz w:val="18"/>
+              </w:rPr>
+              <w:t xml:space="preserve">5%</w:t>
+            </w:r>
+          </w:p>
+        </w:tc>
+        <w:tc>
+          <w:tcPr>
+            <w:tcW w:w="2520" w:type="dxa"/>
+          </w:tcPr>
+          <w:p>
+            <w:pPr>
+              <w:spacing w:before="40" w:after="40"/>
+            </w:pPr>
+            <w:r>
+              <w:rPr>
+                <w:sz w:val="18"/>
+              </w:rPr>
+              <w:t xml:space="preserve">Product</w:t>
+            </w:r>
+          </w:p>
+        </w:tc>
+      </w:tr>
+    </w:tbl>
+    <w:p>
+      <w:pPr>
+        <w:spacing w:after="0"/>
+      </w:pPr>
+    </w:p>
+    <w:p>
+      <w:r>
+        <w:rPr>
+          <w:b/>
+        </w:rPr>
+        <w:t xml:space="preserve">Split: roughly 51% pricing/business-model, 49% product</w:t>
+      </w:r>
+      <w:r>
+        <w:t xml:space="preserve"> — almost identical to the pattern found in the diet-app category, and from an entirely different industry. In both, the fastest differentiation available is honest pricing.</w:t>
+      </w:r>
+    </w:p>
+    <w:p>
+      <w:pPr>
+        <w:pBdr>
+          <w:bottom w:val="single" w:sz="6" w:space="6" w:color="C9CCD1"/>
+        </w:pBdr>
+      </w:pPr>
+    </w:p>
+    <w:p>
+      <w:pPr>
+        <w:pStyle w:val="Heading1"/>
+      </w:pPr>
+      <w:r>
+        <w:t xml:space="preserve">What companies pay humans to do this job</w:t>
+      </w:r>
+    </w:p>
+    <w:p>
+      <w:r>
+        <w:t xml:space="preserve">Two distinct jobs, priced very differently.</w:t>
+      </w:r>
+    </w:p>
+    <w:p>
+      <w:pPr>
+        <w:pStyle w:val="Heading2"/>
+      </w:pPr>
+      <w:r>
+        <w:t xml:space="preserve">Job A — Produce the valuation</w:t>
+      </w:r>
+    </w:p>
+    <w:tbl>
+      <w:tblPr>
+        <w:tblW w:w="10080" w:type="dxa"/>
+        <w:tblBorders>
+          <w:top w:val="single" w:sz="4" w:space="0" w:color="C9CCD1"/>
+          <w:left w:val="single" w:sz="4" w:space="0" w:color="C9CCD1"/>
+          <w:bottom w:val="single" w:sz="4" w:space="0" w:color="C9CCD1"/>
+          <w:right w:val="single" w:sz="4" w:space="0" w:color="C9CCD1"/>
+          <w:insideH w:val="single" w:sz="4" w:space="0" w:color="C9CCD1"/>
+          <w:insideV w:val="single" w:sz="4" w:space="0" w:color="C9CCD1"/>
+        </w:tblBorders>
+        <w:tblLayout w:type="fixed"/>
+      </w:tblPr>
+      <w:tblGrid>
+        <w:gridCol w:w="3360"/>
+        <w:gridCol w:w="3360"/>
+        <w:gridCol w:w="3360"/>
+      </w:tblGrid>
+      <w:tr>
+        <w:trPr>
+          <w:tblHeader/>
+        </w:trPr>
+        <w:tc>
+          <w:tcPr>
+            <w:tcW w:w="3360" w:type="dxa"/>
+            <w:shd w:val="clear" w:color="auto" w:fill="EFF1F3"/>
+          </w:tcPr>
+          <w:p>
+            <w:pPr>
+              <w:spacing w:before="40" w:after="40"/>
+            </w:pPr>
+            <w:r>
+              <w:rPr>
+                <w:b/>
+                <w:sz w:val="18"/>
+              </w:rPr>
+              <w:t xml:space="preserve">Role / service</w:t>
+            </w:r>
+          </w:p>
+        </w:tc>
+        <w:tc>
+          <w:tcPr>
+            <w:tcW w:w="3360" w:type="dxa"/>
+            <w:shd w:val="clear" w:color="auto" w:fill="EFF1F3"/>
+          </w:tcPr>
+          <w:p>
+            <w:pPr>
+              <w:spacing w:before="40" w:after="40"/>
+            </w:pPr>
+            <w:r>
+              <w:rPr>
+                <w:b/>
+                <w:sz w:val="18"/>
+              </w:rPr>
+              <w:t xml:space="preserve">Price</w:t>
+            </w:r>
+          </w:p>
+        </w:tc>
+        <w:tc>
+          <w:tcPr>
+            <w:tcW w:w="3360" w:type="dxa"/>
+            <w:shd w:val="clear" w:color="auto" w:fill="EFF1F3"/>
+          </w:tcPr>
+          <w:p>
+            <w:pPr>
+              <w:spacing w:before="40" w:after="40"/>
+            </w:pPr>
+            <w:r>
+              <w:rPr>
+                <w:b/>
+                <w:sz w:val="18"/>
+              </w:rPr>
+              <w:t xml:space="preserve">Source</w:t>
+            </w:r>
+          </w:p>
+        </w:tc>
+      </w:tr>
+      <w:tr>
+        <w:tc>
+          <w:tcPr>
+            <w:tcW w:w="3360" w:type="dxa"/>
+          </w:tcPr>
+          <w:p>
+            <w:pPr>
+              <w:spacing w:before="40" w:after="40"/>
+            </w:pPr>
+            <w:r>
+              <w:rPr>
+                <w:b/>
+                <w:sz w:val="18"/>
+              </w:rPr>
+              <w:t xml:space="preserve">409A valuation, early-stage startup</w:t>
+            </w:r>
+          </w:p>
+        </w:tc>
+        <w:tc>
+          <w:tcPr>
+            <w:tcW w:w="3360" w:type="dxa"/>
+          </w:tcPr>
+          <w:p>
+            <w:pPr>
+              <w:spacing w:before="40" w:after="40"/>
+            </w:pPr>
+            <w:r>
+              <w:rPr>
+                <w:b/>
+                <w:sz w:val="18"/>
+              </w:rPr>
+              <w:t xml:space="preserve">$2,000–$5,000</w:t>
+            </w:r>
+            <w:r>
+              <w:rPr>
+                <w:sz w:val="18"/>
+              </w:rPr>
+              <w:t xml:space="preserve"> typical; </w:t>
+            </w:r>
+            <w:r>
+              <w:rPr>
+                <w:b/>
+                <w:sz w:val="18"/>
+              </w:rPr>
+              <w:t xml:space="preserve">$1,500–$3,500</w:t>
+            </w:r>
+            <w:r>
+              <w:rPr>
+                <w:sz w:val="18"/>
+              </w:rPr>
+              <w:t xml:space="preserve"> pre-revenue with a simple cap table; </w:t>
+            </w:r>
+            <w:r>
+              <w:rPr>
+                <w:b/>
+                <w:sz w:val="18"/>
+              </w:rPr>
+              <w:t xml:space="preserve">$3,500–$9,000</w:t>
+            </w:r>
+            <w:r>
+              <w:rPr>
+                <w:sz w:val="18"/>
+              </w:rPr>
+              <w:t xml:space="preserve"> with revenue or complex preferences; </w:t>
+            </w:r>
+            <w:r>
+              <w:rPr>
+                <w:b/>
+                <w:sz w:val="18"/>
+              </w:rPr>
+              <w:t xml:space="preserve">$10,000–$25,000</w:t>
+            </w:r>
+            <w:r>
+              <w:rPr>
+                <w:sz w:val="18"/>
+              </w:rPr>
+              <w:t xml:space="preserve"> for mature/complex companies</w:t>
+            </w:r>
+          </w:p>
+        </w:tc>
+        <w:tc>
+          <w:tcPr>
+            <w:tcW w:w="3360" w:type="dxa"/>
+          </w:tcPr>
+          <w:p>
+            <w:pPr>
+              <w:spacing w:before="40" w:after="40"/>
+            </w:pPr>
+            <w:hyperlink r:id="rHl38">
+              <w:r>
+                <w:rPr>
+                  <w:rStyle w:val="Hyperlink"/>
+                  <w:sz w:val="18"/>
+                </w:rPr>
+                <w:t xml:space="preserve">Sofer Advisors pricing guide</w:t>
+              </w:r>
+            </w:hyperlink>
+            <w:r>
+              <w:rPr>
+                <w:sz w:val="18"/>
+              </w:rPr>
+              <w:t xml:space="preserve">; </w:t>
+            </w:r>
+            <w:hyperlink r:id="rHl39">
+              <w:r>
+                <w:rPr>
+                  <w:rStyle w:val="Hyperlink"/>
+                  <w:sz w:val="18"/>
+                </w:rPr>
+                <w:t xml:space="preserve">409a-valuation.com</w:t>
+              </w:r>
+            </w:hyperlink>
+          </w:p>
+        </w:tc>
+      </w:tr>
+      <w:tr>
+        <w:tc>
+          <w:tcPr>
+            <w:tcW w:w="3360" w:type="dxa"/>
+          </w:tcPr>
+          <w:p>
+            <w:pPr>
+              <w:spacing w:before="40" w:after="40"/>
+            </w:pPr>
+            <w:r>
+              <w:rPr>
+                <w:b/>
+                <w:sz w:val="18"/>
+              </w:rPr>
+              <w:t xml:space="preserve">409A via AI-assisted platforms</w:t>
+            </w:r>
+          </w:p>
+        </w:tc>
+        <w:tc>
+          <w:tcPr>
+            <w:tcW w:w="3360" w:type="dxa"/>
+          </w:tcPr>
+          <w:p>
+            <w:pPr>
+              <w:spacing w:before="40" w:after="40"/>
+            </w:pPr>
+            <w:r>
+              <w:rPr>
+                <w:b/>
+                <w:sz w:val="18"/>
+              </w:rPr>
+              <w:t xml:space="preserve">$499–$1,500</w:t>
+            </w:r>
+            <w:r>
+              <w:rPr>
+                <w:sz w:val="18"/>
+              </w:rPr>
+              <w:t xml:space="preserve"> for a safe-harbor-compliant report</w:t>
+            </w:r>
+          </w:p>
+        </w:tc>
+        <w:tc>
+          <w:tcPr>
+            <w:tcW w:w="3360" w:type="dxa"/>
+          </w:tcPr>
+          <w:p>
+            <w:pPr>
+              <w:spacing w:before="40" w:after="40"/>
+            </w:pPr>
+            <w:hyperlink r:id="rHl39">
+              <w:r>
+                <w:rPr>
+                  <w:rStyle w:val="Hyperlink"/>
+                  <w:sz w:val="18"/>
+                </w:rPr>
+                <w:t xml:space="preserve">409a-valuation.com</w:t>
+              </w:r>
+            </w:hyperlink>
+            <w:r>
+              <w:rPr>
+                <w:sz w:val="18"/>
+              </w:rPr>
+              <w:t xml:space="preserve"> </w:t>
+            </w:r>
+            <w:r>
+              <w:rPr>
+                <w:rFonts w:ascii="Consolas" w:hAnsi="Consolas"/>
+                <w:sz w:val="18"/>
+              </w:rPr>
+              <w:t xml:space="preserve">[vendor-adjacent source]</w:t>
+            </w:r>
+          </w:p>
+        </w:tc>
+      </w:tr>
+      <w:tr>
+        <w:tc>
+          <w:tcPr>
+            <w:tcW w:w="3360" w:type="dxa"/>
+          </w:tcPr>
+          <w:p>
+            <w:pPr>
+              <w:spacing w:before="40" w:after="40"/>
+            </w:pPr>
+            <w:r>
+              <w:rPr>
+                <w:b/>
+                <w:sz w:val="18"/>
+              </w:rPr>
+              <w:t xml:space="preserve">Volume, one provider</w:t>
+            </w:r>
+          </w:p>
+        </w:tc>
+        <w:tc>
+          <w:tcPr>
+            <w:tcW w:w="3360" w:type="dxa"/>
+          </w:tcPr>
+          <w:p>
+            <w:pPr>
+              <w:spacing w:before="40" w:after="40"/>
+            </w:pPr>
+            <w:r>
+              <w:rPr>
+                <w:sz w:val="18"/>
+              </w:rPr>
+              <w:t xml:space="preserve">Carta issues </w:t>
+            </w:r>
+            <w:r>
+              <w:rPr>
+                <w:b/>
+                <w:sz w:val="18"/>
+              </w:rPr>
+              <w:t xml:space="preserve">16,000+ 409A valuations/year</w:t>
+            </w:r>
+          </w:p>
+        </w:tc>
+        <w:tc>
+          <w:tcPr>
+            <w:tcW w:w="3360" w:type="dxa"/>
+          </w:tcPr>
+          <w:p>
+            <w:pPr>
+              <w:spacing w:before="40" w:after="40"/>
+            </w:pPr>
+            <w:hyperlink r:id="rHl7">
+              <w:r>
+                <w:rPr>
+                  <w:rStyle w:val="Hyperlink"/>
+                  <w:sz w:val="18"/>
+                </w:rPr>
+                <w:t xml:space="preserve">Carta</w:t>
+              </w:r>
+            </w:hyperlink>
+          </w:p>
+        </w:tc>
+      </w:tr>
+      <w:tr>
+        <w:tc>
+          <w:tcPr>
+            <w:tcW w:w="3360" w:type="dxa"/>
+          </w:tcPr>
+          <w:p>
+            <w:pPr>
+              <w:spacing w:before="40" w:after="40"/>
+            </w:pPr>
+            <w:r>
+              <w:rPr>
+                <w:b/>
+                <w:sz w:val="18"/>
+              </w:rPr>
+              <w:t xml:space="preserve">Business valuation analyst (employee)</w:t>
+            </w:r>
+          </w:p>
+        </w:tc>
+        <w:tc>
+          <w:tcPr>
+            <w:tcW w:w="3360" w:type="dxa"/>
+          </w:tcPr>
+          <w:p>
+            <w:pPr>
+              <w:spacing w:before="40" w:after="40"/>
+            </w:pPr>
+            <w:r>
+              <w:rPr>
+                <w:b/>
+                <w:sz w:val="18"/>
+              </w:rPr>
+              <w:t xml:space="preserve">$98,662/yr ≈ $47.43/hr</w:t>
+            </w:r>
+            <w:r>
+              <w:rPr>
+                <w:sz w:val="18"/>
+              </w:rPr>
+              <w:t xml:space="preserve">; 25th–75th percentile </w:t>
+            </w:r>
+            <w:r>
+              <w:rPr>
+                <w:b/>
+                <w:sz w:val="18"/>
+              </w:rPr>
+              <w:t xml:space="preserve">$74,000–$123,500</w:t>
+            </w:r>
+            <w:r>
+              <w:rPr>
+                <w:sz w:val="18"/>
+              </w:rPr>
+              <w:t xml:space="preserve">; top decile $135,000</w:t>
+            </w:r>
+          </w:p>
+        </w:tc>
+        <w:tc>
+          <w:tcPr>
+            <w:tcW w:w="3360" w:type="dxa"/>
+          </w:tcPr>
+          <w:p>
+            <w:pPr>
+              <w:spacing w:before="40" w:after="40"/>
+            </w:pPr>
+            <w:hyperlink r:id="rHl40">
+              <w:r>
+                <w:rPr>
+                  <w:rStyle w:val="Hyperlink"/>
+                  <w:sz w:val="18"/>
+                </w:rPr>
+                <w:t xml:space="preserve">ZipRecruiter</w:t>
+              </w:r>
+            </w:hyperlink>
+          </w:p>
+        </w:tc>
+      </w:tr>
+    </w:tbl>
+    <w:p>
+      <w:pPr>
+        <w:spacing w:after="0"/>
+      </w:pPr>
+    </w:p>
+    <w:p>
+      <w:r>
+        <w:rPr>
+          <w:b/>
+        </w:rPr>
+        <w:t xml:space="preserve">Note the price floor problem:</w:t>
+      </w:r>
+      <w:r>
+        <w:t xml:space="preserve"> AI-assisted 409A providers already deliver a compliant report for </w:t>
+      </w:r>
+      <w:r>
+        <w:rPr>
+          <w:b/>
+        </w:rPr>
+        <w:t xml:space="preserve">$499–$1,500</w:t>
+      </w:r>
+      <w:r>
+        <w:t xml:space="preserve">. That is the price umbrella any new valuation product sits under — and it buys a human-signed document, which software alone cannot provide for safe harbor.</w:t>
+      </w:r>
+    </w:p>
+    <w:p>
+      <w:pPr>
+        <w:pStyle w:val="Heading2"/>
+      </w:pPr>
+      <w:r>
+        <w:t xml:space="preserve">Job B — Find the money</w:t>
+      </w:r>
+    </w:p>
+    <w:tbl>
+      <w:tblPr>
+        <w:tblW w:w="10080" w:type="dxa"/>
+        <w:tblBorders>
+          <w:top w:val="single" w:sz="4" w:space="0" w:color="C9CCD1"/>
+          <w:left w:val="single" w:sz="4" w:space="0" w:color="C9CCD1"/>
+          <w:bottom w:val="single" w:sz="4" w:space="0" w:color="C9CCD1"/>
+          <w:right w:val="single" w:sz="4" w:space="0" w:color="C9CCD1"/>
+          <w:insideH w:val="single" w:sz="4" w:space="0" w:color="C9CCD1"/>
+          <w:insideV w:val="single" w:sz="4" w:space="0" w:color="C9CCD1"/>
+        </w:tblBorders>
+        <w:tblLayout w:type="fixed"/>
+      </w:tblPr>
+      <w:tblGrid>
+        <w:gridCol w:w="3360"/>
+        <w:gridCol w:w="3360"/>
+        <w:gridCol w:w="3360"/>
+      </w:tblGrid>
+      <w:tr>
+        <w:trPr>
+          <w:tblHeader/>
+        </w:trPr>
+        <w:tc>
+          <w:tcPr>
+            <w:tcW w:w="3360" w:type="dxa"/>
+            <w:shd w:val="clear" w:color="auto" w:fill="EFF1F3"/>
+          </w:tcPr>
+          <w:p>
+            <w:pPr>
+              <w:spacing w:before="40" w:after="40"/>
+            </w:pPr>
+            <w:r>
+              <w:rPr>
+                <w:b/>
+                <w:sz w:val="18"/>
+              </w:rPr>
+              <w:t xml:space="preserve">Role / service</w:t>
+            </w:r>
+          </w:p>
+        </w:tc>
+        <w:tc>
+          <w:tcPr>
+            <w:tcW w:w="3360" w:type="dxa"/>
+            <w:shd w:val="clear" w:color="auto" w:fill="EFF1F3"/>
+          </w:tcPr>
+          <w:p>
+            <w:pPr>
+              <w:spacing w:before="40" w:after="40"/>
+            </w:pPr>
+            <w:r>
+              <w:rPr>
+                <w:b/>
+                <w:sz w:val="18"/>
+              </w:rPr>
+              <w:t xml:space="preserve">Price</w:t>
+            </w:r>
+          </w:p>
+        </w:tc>
+        <w:tc>
+          <w:tcPr>
+            <w:tcW w:w="3360" w:type="dxa"/>
+            <w:shd w:val="clear" w:color="auto" w:fill="EFF1F3"/>
+          </w:tcPr>
+          <w:p>
+            <w:pPr>
+              <w:spacing w:before="40" w:after="40"/>
+            </w:pPr>
+            <w:r>
+              <w:rPr>
+                <w:b/>
+                <w:sz w:val="18"/>
+              </w:rPr>
+              <w:t xml:space="preserve">Source</w:t>
+            </w:r>
+          </w:p>
+        </w:tc>
+      </w:tr>
+      <w:tr>
+        <w:tc>
+          <w:tcPr>
+            <w:tcW w:w="3360" w:type="dxa"/>
+          </w:tcPr>
+          <w:p>
+            <w:pPr>
+              <w:spacing w:before="40" w:after="40"/>
+            </w:pPr>
+            <w:r>
+              <w:rPr>
+                <w:b/>
+                <w:sz w:val="18"/>
+              </w:rPr>
+              <w:t xml:space="preserve">Fractional CFO (hourly)</w:t>
+            </w:r>
+          </w:p>
+        </w:tc>
+        <w:tc>
+          <w:tcPr>
+            <w:tcW w:w="3360" w:type="dxa"/>
+          </w:tcPr>
+          <w:p>
+            <w:pPr>
+              <w:spacing w:before="40" w:after="40"/>
+            </w:pPr>
+            <w:r>
+              <w:rPr>
+                <w:b/>
+                <w:sz w:val="18"/>
+              </w:rPr>
+              <w:t xml:space="preserve">$150–$500/hr</w:t>
+            </w:r>
+            <w:r>
+              <w:rPr>
+                <w:sz w:val="18"/>
+              </w:rPr>
+              <w:t xml:space="preserve"> — $150–250 (5–10 yrs), $250–350 (10–15 yrs), $350–500 (15+ yrs, fundraising/M&amp;A specialists)</w:t>
+            </w:r>
+          </w:p>
+        </w:tc>
+        <w:tc>
+          <w:tcPr>
+            <w:tcW w:w="3360" w:type="dxa"/>
+          </w:tcPr>
+          <w:p>
+            <w:pPr>
+              <w:spacing w:before="40" w:after="40"/>
+            </w:pPr>
+            <w:hyperlink r:id="rHl41">
+              <w:r>
+                <w:rPr>
+                  <w:rStyle w:val="Hyperlink"/>
+                  <w:sz w:val="18"/>
+                </w:rPr>
+                <w:t xml:space="preserve">Fiscallion</w:t>
+              </w:r>
+            </w:hyperlink>
+            <w:r>
+              <w:rPr>
+                <w:sz w:val="18"/>
+              </w:rPr>
+              <w:t xml:space="preserve">; </w:t>
+            </w:r>
+            <w:hyperlink r:id="rHl42">
+              <w:r>
+                <w:rPr>
+                  <w:rStyle w:val="Hyperlink"/>
+                  <w:sz w:val="18"/>
+                </w:rPr>
+                <w:t xml:space="preserve">Graphite</w:t>
+              </w:r>
+            </w:hyperlink>
+          </w:p>
+        </w:tc>
+      </w:tr>
+      <w:tr>
+        <w:tc>
+          <w:tcPr>
+            <w:tcW w:w="3360" w:type="dxa"/>
+          </w:tcPr>
+          <w:p>
+            <w:pPr>
+              <w:spacing w:before="40" w:after="40"/>
+            </w:pPr>
+            <w:r>
+              <w:rPr>
+                <w:b/>
+                <w:sz w:val="18"/>
+              </w:rPr>
+              <w:t xml:space="preserve">Fractional CFO (retainer)</w:t>
+            </w:r>
+          </w:p>
+        </w:tc>
+        <w:tc>
+          <w:tcPr>
+            <w:tcW w:w="3360" w:type="dxa"/>
+          </w:tcPr>
+          <w:p>
+            <w:pPr>
+              <w:spacing w:before="40" w:after="40"/>
+            </w:pPr>
+            <w:r>
+              <w:rPr>
+                <w:b/>
+                <w:sz w:val="18"/>
+              </w:rPr>
+              <w:t xml:space="preserve">$3,000–$20,000+/month</w:t>
+            </w:r>
+            <w:r>
+              <w:rPr>
+                <w:sz w:val="18"/>
+              </w:rPr>
+              <w:t xml:space="preserve">; seed–Series A typically </w:t>
+            </w:r>
+            <w:r>
+              <w:rPr>
+                <w:b/>
+                <w:sz w:val="18"/>
+              </w:rPr>
+              <w:t xml:space="preserve">$3,500–$7,500/month</w:t>
+            </w:r>
+          </w:p>
+        </w:tc>
+        <w:tc>
+          <w:tcPr>
+            <w:tcW w:w="3360" w:type="dxa"/>
+          </w:tcPr>
+          <w:p>
+            <w:pPr>
+              <w:spacing w:before="40" w:after="40"/>
+            </w:pPr>
+            <w:hyperlink r:id="rHl41">
+              <w:r>
+                <w:rPr>
+                  <w:rStyle w:val="Hyperlink"/>
+                  <w:sz w:val="18"/>
+                </w:rPr>
+                <w:t xml:space="preserve">Fiscallion</w:t>
+              </w:r>
+            </w:hyperlink>
+            <w:r>
+              <w:rPr>
+                <w:sz w:val="18"/>
+              </w:rPr>
+              <w:t xml:space="preserve">; </w:t>
+            </w:r>
+            <w:hyperlink r:id="rHl43">
+              <w:r>
+                <w:rPr>
+                  <w:rStyle w:val="Hyperlink"/>
+                  <w:sz w:val="18"/>
+                </w:rPr>
+                <w:t xml:space="preserve">Kruze</w:t>
+              </w:r>
+            </w:hyperlink>
+          </w:p>
+        </w:tc>
+      </w:tr>
+      <w:tr>
+        <w:tc>
+          <w:tcPr>
+            <w:tcW w:w="3360" w:type="dxa"/>
+          </w:tcPr>
+          <w:p>
+            <w:pPr>
+              <w:spacing w:before="40" w:after="40"/>
+            </w:pPr>
+            <w:r>
+              <w:rPr>
+                <w:b/>
+                <w:sz w:val="18"/>
+              </w:rPr>
+              <w:t xml:space="preserve">Fundraising consultant</w:t>
+            </w:r>
+          </w:p>
+        </w:tc>
+        <w:tc>
+          <w:tcPr>
+            <w:tcW w:w="3360" w:type="dxa"/>
+          </w:tcPr>
+          <w:p>
+            <w:pPr>
+              <w:spacing w:before="40" w:after="40"/>
+            </w:pPr>
+            <w:r>
+              <w:rPr>
+                <w:b/>
+                <w:sz w:val="18"/>
+              </w:rPr>
+              <w:t xml:space="preserve">$5,000–$50,000 retainer</w:t>
+            </w:r>
+            <w:r>
+              <w:rPr>
+                <w:sz w:val="18"/>
+              </w:rPr>
+              <w:t xml:space="preserve"> or </w:t>
+            </w:r>
+            <w:r>
+              <w:rPr>
+                <w:b/>
+                <w:sz w:val="18"/>
+              </w:rPr>
+              <w:t xml:space="preserve">3–8% success fee</w:t>
+            </w:r>
+            <w:r>
+              <w:rPr>
+                <w:sz w:val="18"/>
+              </w:rPr>
+              <w:t xml:space="preserve">; </w:t>
+            </w:r>
+            <w:r>
+              <w:rPr>
+                <w:b/>
+                <w:sz w:val="18"/>
+              </w:rPr>
+              <w:t xml:space="preserve">$250–$750/hr</w:t>
+            </w:r>
+          </w:p>
+        </w:tc>
+        <w:tc>
+          <w:tcPr>
+            <w:tcW w:w="3360" w:type="dxa"/>
+          </w:tcPr>
+          <w:p>
+            <w:pPr>
+              <w:spacing w:before="40" w:after="40"/>
+            </w:pPr>
+            <w:hyperlink r:id="rHl44">
+              <w:r>
+                <w:rPr>
+                  <w:rStyle w:val="Hyperlink"/>
+                  <w:sz w:val="18"/>
+                </w:rPr>
+                <w:t xml:space="preserve">FreeStartupFunding cost guide</w:t>
+              </w:r>
+            </w:hyperlink>
+          </w:p>
+        </w:tc>
+      </w:tr>
+      <w:tr>
+        <w:tc>
+          <w:tcPr>
+            <w:tcW w:w="3360" w:type="dxa"/>
+          </w:tcPr>
+          <w:p>
+            <w:pPr>
+              <w:spacing w:before="40" w:after="40"/>
+            </w:pPr>
+            <w:r>
+              <w:rPr>
+                <w:b/>
+                <w:sz w:val="18"/>
+              </w:rPr>
+              <w:t xml:space="preserve">Placement agent</w:t>
+            </w:r>
+          </w:p>
+        </w:tc>
+        <w:tc>
+          <w:tcPr>
+            <w:tcW w:w="3360" w:type="dxa"/>
+          </w:tcPr>
+          <w:p>
+            <w:pPr>
+              <w:spacing w:before="40" w:after="40"/>
+            </w:pPr>
+            <w:r>
+              <w:rPr>
+                <w:b/>
+                <w:sz w:val="18"/>
+              </w:rPr>
+              <w:t xml:space="preserve">1.5–2.5% of committed capital</w:t>
+            </w:r>
+            <w:r>
+              <w:rPr>
+                <w:sz w:val="18"/>
+              </w:rPr>
+              <w:t xml:space="preserve">, plus 0.25–1%/yr trailing fees for 3–7 years, with 12–24 month tail provisions</w:t>
+            </w:r>
+          </w:p>
+        </w:tc>
+        <w:tc>
+          <w:tcPr>
+            <w:tcW w:w="3360" w:type="dxa"/>
+          </w:tcPr>
+          <w:p>
+            <w:pPr>
+              <w:spacing w:before="40" w:after="40"/>
+            </w:pPr>
+            <w:hyperlink r:id="rHl45">
+              <w:r>
+                <w:rPr>
+                  <w:rStyle w:val="Hyperlink"/>
+                  <w:sz w:val="18"/>
+                </w:rPr>
+                <w:t xml:space="preserve">PipelineRoad</w:t>
+              </w:r>
+            </w:hyperlink>
+          </w:p>
+        </w:tc>
+      </w:tr>
+      <w:tr>
+        <w:tc>
+          <w:tcPr>
+            <w:tcW w:w="3360" w:type="dxa"/>
+          </w:tcPr>
+          <w:p>
+            <w:pPr>
+              <w:spacing w:before="40" w:after="40"/>
+            </w:pPr>
+            <w:r>
+              <w:rPr>
+                <w:b/>
+                <w:sz w:val="18"/>
+              </w:rPr>
+              <w:t xml:space="preserve">Lehman / Double Lehman formula</w:t>
+            </w:r>
+          </w:p>
+        </w:tc>
+        <w:tc>
+          <w:tcPr>
+            <w:tcW w:w="3360" w:type="dxa"/>
+          </w:tcPr>
+          <w:p>
+            <w:pPr>
+              <w:spacing w:before="40" w:after="40"/>
+            </w:pPr>
+            <w:r>
+              <w:rPr>
+                <w:sz w:val="18"/>
+              </w:rPr>
+              <w:t xml:space="preserve">5% of the first $1M, 4% of the next, 3%, 2%, then 1% above $4M — </w:t>
+            </w:r>
+            <w:r>
+              <w:rPr>
+                <w:b/>
+                <w:sz w:val="18"/>
+              </w:rPr>
+              <w:t xml:space="preserve">doubled</w:t>
+            </w:r>
+            <w:r>
+              <w:rPr>
+                <w:sz w:val="18"/>
+              </w:rPr>
+              <w:t xml:space="preserve"> on smaller deals in current practice</w:t>
+            </w:r>
+          </w:p>
+        </w:tc>
+        <w:tc>
+          <w:tcPr>
+            <w:tcW w:w="3360" w:type="dxa"/>
+          </w:tcPr>
+          <w:p>
+            <w:pPr>
+              <w:spacing w:before="40" w:after="40"/>
+            </w:pPr>
+            <w:hyperlink r:id="rHl46">
+              <w:r>
+                <w:rPr>
+                  <w:rStyle w:val="Hyperlink"/>
+                  <w:sz w:val="18"/>
+                </w:rPr>
+                <w:t xml:space="preserve">Wikipedia — Lehman Formula</w:t>
+              </w:r>
+            </w:hyperlink>
+            <w:r>
+              <w:rPr>
+                <w:sz w:val="18"/>
+              </w:rPr>
+              <w:t xml:space="preserve">; </w:t>
+            </w:r>
+            <w:hyperlink r:id="rHl45">
+              <w:r>
+                <w:rPr>
+                  <w:rStyle w:val="Hyperlink"/>
+                  <w:sz w:val="18"/>
+                </w:rPr>
+                <w:t xml:space="preserve">PipelineRoad</w:t>
+              </w:r>
+            </w:hyperlink>
+          </w:p>
+        </w:tc>
+      </w:tr>
+    </w:tbl>
+    <w:p>
+      <w:pPr>
+        <w:spacing w:after="0"/>
+      </w:pPr>
+    </w:p>
+    <w:p>
+      <w:pPr>
+        <w:pStyle w:val="Heading2"/>
+      </w:pPr>
+      <w:r>
+        <w:t xml:space="preserve">What this means for pricing the app</w:t>
+      </w:r>
+    </w:p>
+    <w:p>
+      <w:r>
+        <w:t xml:space="preserve">Work the numbers for one founder raising a </w:t>
+      </w:r>
+      <w:r>
+        <w:rPr>
+          <w:b/>
+        </w:rPr>
+        <w:t xml:space="preserve">$2M seed</w:t>
+      </w:r>
+      <w:r>
+        <w:t xml:space="preserve">:</w:t>
+      </w:r>
+    </w:p>
+    <w:p>
+      <w:pPr>
+        <w:numPr>
+          <w:ilvl w:val="0"/>
+          <w:numId w:val="1"/>
+        </w:numPr>
+      </w:pPr>
+      <w:r>
+        <w:rPr>
+          <w:b/>
+        </w:rPr>
+        <w:t xml:space="preserve">Valuation:</w:t>
+      </w:r>
+      <w:r>
+        <w:t xml:space="preserve"> $2,000–$5,000 for a 409A (or $499–$1,500 from an AI-assisted provider)</w:t>
+      </w:r>
+    </w:p>
+    <w:p>
+      <w:pPr>
+        <w:numPr>
+          <w:ilvl w:val="0"/>
+          <w:numId w:val="1"/>
+        </w:numPr>
+      </w:pPr>
+      <w:r>
+        <w:rPr>
+          <w:b/>
+        </w:rPr>
+        <w:t xml:space="preserve">Finding investors:</w:t>
+      </w:r>
+      <w:r>
+        <w:t xml:space="preserve"> a fundraising consultant at 3–8% of $2M = </w:t>
+      </w:r>
+      <w:r>
+        <w:rPr>
+          <w:b/>
+        </w:rPr>
+        <w:t xml:space="preserve">$60,000–$160,000</w:t>
+      </w:r>
+      <w:r>
+        <w:t xml:space="preserve">, or a fractional CFO at $5,000/month × 6 months = </w:t>
+      </w:r>
+      <w:r>
+        <w:rPr>
+          <w:b/>
+        </w:rPr>
+        <w:t xml:space="preserve">$30,000</w:t>
+      </w:r>
+    </w:p>
+    <w:p>
+      <w:pPr>
+        <w:numPr>
+          <w:ilvl w:val="0"/>
+          <w:numId w:val="1"/>
+        </w:numPr>
+      </w:pPr>
+      <w:r>
+        <w:rPr>
+          <w:b/>
+        </w:rPr>
+        <w:t xml:space="preserve">Total human cost of the job this app proposes to do: roughly $32,000–$165,000 per raise</w:t>
+      </w:r>
+    </w:p>
+    <w:p>
+      <w:r>
+        <w:rPr>
+          <w:b/>
+        </w:rPr>
+        <w:t xml:space="preserve">The asymmetry is the whole business case.</w:t>
+      </w:r>
+      <w:r>
+        <w:t xml:space="preserve"> Job A (the number) is already commoditized toward $499. Job B (finding and reaching the right investors) is where tens of thousands of dollars are actually spent — and Section 1 showed the existing tools for it are rated 1.4★ and 1.7★.</w:t>
+      </w:r>
+    </w:p>
+    <w:p>
+      <w:r>
+        <w:rPr>
+          <w:b/>
+        </w:rPr>
+        <w:t xml:space="preserve">If this product is priced as a valuation calculator, it competes with a $499 floor. If it's priced as fundraising labor, it competes with a $30,000 fractional CFO.</w:t>
+      </w:r>
+      <w:r>
+        <w:t xml:space="preserve"> That choice, not the algorithm, decides the business.</w:t>
+      </w:r>
+    </w:p>
+    <w:p>
+      <w:pPr>
+        <w:pBdr>
+          <w:bottom w:val="single" w:sz="6" w:space="6" w:color="C9CCD1"/>
+        </w:pBdr>
+      </w:pPr>
+    </w:p>
+    <w:p>
+      <w:pPr>
+        <w:pStyle w:val="Heading1"/>
+      </w:pPr>
+      <w:r>
+        <w:t xml:space="preserve">Flags</w:t>
+      </w:r>
+    </w:p>
+    <w:tbl>
+      <w:tblPr>
+        <w:tblW w:w="10080" w:type="dxa"/>
+        <w:tblBorders>
+          <w:top w:val="single" w:sz="4" w:space="0" w:color="C9CCD1"/>
+          <w:left w:val="single" w:sz="4" w:space="0" w:color="C9CCD1"/>
+          <w:bottom w:val="single" w:sz="4" w:space="0" w:color="C9CCD1"/>
+          <w:right w:val="single" w:sz="4" w:space="0" w:color="C9CCD1"/>
+          <w:insideH w:val="single" w:sz="4" w:space="0" w:color="C9CCD1"/>
+          <w:insideV w:val="single" w:sz="4" w:space="0" w:color="C9CCD1"/>
+        </w:tblBorders>
+        <w:tblLayout w:type="fixed"/>
+      </w:tblPr>
+      <w:tblGrid>
+        <w:gridCol w:w="5040"/>
+        <w:gridCol w:w="5040"/>
+      </w:tblGrid>
+      <w:tr>
+        <w:trPr>
+          <w:tblHeader/>
+        </w:trPr>
+        <w:tc>
+          <w:tcPr>
+            <w:tcW w:w="5040" w:type="dxa"/>
+            <w:shd w:val="clear" w:color="auto" w:fill="EFF1F3"/>
+          </w:tcPr>
+          <w:p>
+            <w:pPr>
+              <w:spacing w:before="40" w:after="40"/>
+            </w:pPr>
+            <w:r>
+              <w:rPr>
+                <w:b/>
+                <w:sz w:val="18"/>
+              </w:rPr>
+              <w:t xml:space="preserve">Item</w:t>
+            </w:r>
+          </w:p>
+        </w:tc>
+        <w:tc>
+          <w:tcPr>
+            <w:tcW w:w="5040" w:type="dxa"/>
+            <w:shd w:val="clear" w:color="auto" w:fill="EFF1F3"/>
+          </w:tcPr>
+          <w:p>
+            <w:pPr>
+              <w:spacing w:before="40" w:after="40"/>
+            </w:pPr>
+            <w:r>
+              <w:rPr>
+                <w:b/>
+                <w:sz w:val="18"/>
+              </w:rPr>
+              <w:t xml:space="preserve">Status</w:t>
+            </w:r>
+          </w:p>
+        </w:tc>
+      </w:tr>
+      <w:tr>
+        <w:tc>
+          <w:tcPr>
+            <w:tcW w:w="5040" w:type="dxa"/>
+          </w:tcPr>
+          <w:p>
+            <w:pPr>
+              <w:spacing w:before="40" w:after="40"/>
+            </w:pPr>
+            <w:r>
+              <w:rPr>
+                <w:b/>
+                <w:sz w:val="18"/>
+              </w:rPr>
+              <w:t xml:space="preserve">G2</w:t>
+            </w:r>
+          </w:p>
+        </w:tc>
+        <w:tc>
+          <w:tcPr>
+            <w:tcW w:w="5040" w:type="dxa"/>
+          </w:tcPr>
+          <w:p>
+            <w:pPr>
+              <w:spacing w:before="40" w:after="40"/>
+            </w:pPr>
+            <w:r>
+              <w:rPr>
+                <w:sz w:val="18"/>
+              </w:rPr>
+              <w:t xml:space="preserve">❌ Blocked (403, blank in browser). Requested, unavailable.</w:t>
+            </w:r>
+          </w:p>
+        </w:tc>
+      </w:tr>
+      <w:tr>
+        <w:tc>
+          <w:tcPr>
+            <w:tcW w:w="5040" w:type="dxa"/>
+          </w:tcPr>
+          <w:p>
+            <w:pPr>
+              <w:spacing w:before="40" w:after="40"/>
+            </w:pPr>
+            <w:r>
+              <w:rPr>
+                <w:b/>
+                <w:sz w:val="18"/>
+              </w:rPr>
+              <w:t xml:space="preserve">Reddit</w:t>
+            </w:r>
+          </w:p>
+        </w:tc>
+        <w:tc>
+          <w:tcPr>
+            <w:tcW w:w="5040" w:type="dxa"/>
+          </w:tcPr>
+          <w:p>
+            <w:pPr>
+              <w:spacing w:before="40" w:after="40"/>
+            </w:pPr>
+            <w:r>
+              <w:rPr>
+                <w:sz w:val="18"/>
+              </w:rPr>
+              <w:t xml:space="preserve">❌ Blocked for search and pages. Requested, unavailable.</w:t>
+            </w:r>
+          </w:p>
+        </w:tc>
+      </w:tr>
+      <w:tr>
+        <w:tc>
+          <w:tcPr>
+            <w:tcW w:w="5040" w:type="dxa"/>
+          </w:tcPr>
+          <w:p>
+            <w:pPr>
+              <w:spacing w:before="40" w:after="40"/>
+            </w:pPr>
+            <w:r>
+              <w:rPr>
+                <w:b/>
+                <w:sz w:val="18"/>
+              </w:rPr>
+              <w:t xml:space="preserve">Verbatim quotes</w:t>
+            </w:r>
+          </w:p>
+        </w:tc>
+        <w:tc>
+          <w:tcPr>
+            <w:tcW w:w="5040" w:type="dxa"/>
+          </w:tcPr>
+          <w:p>
+            <w:pPr>
+              <w:spacing w:before="40" w:after="40"/>
+            </w:pPr>
+            <w:r>
+              <w:rPr>
+                <w:sz w:val="18"/>
+              </w:rPr>
+              <w:t xml:space="preserve">⚠️ Paraphrased; originals in the JSON file beside this one.</w:t>
+            </w:r>
+          </w:p>
+        </w:tc>
+      </w:tr>
+      <w:tr>
+        <w:tc>
+          <w:tcPr>
+            <w:tcW w:w="5040" w:type="dxa"/>
+          </w:tcPr>
+          <w:p>
+            <w:pPr>
+              <w:spacing w:before="40" w:after="40"/>
+            </w:pPr>
+            <w:r>
+              <w:rPr>
+                <w:b/>
+                <w:sz w:val="18"/>
+              </w:rPr>
+              <w:t xml:space="preserve">Sample size</w:t>
+            </w:r>
+          </w:p>
+        </w:tc>
+        <w:tc>
+          <w:tcPr>
+            <w:tcW w:w="5040" w:type="dxa"/>
+          </w:tcPr>
+          <w:p>
+            <w:pPr>
+              <w:spacing w:before="40" w:after="40"/>
+            </w:pPr>
+            <w:r>
+              <w:rPr>
+                <w:sz w:val="18"/>
+              </w:rPr>
+              <w:t xml:space="preserve">⚠️ </w:t>
+            </w:r>
+            <w:r>
+              <w:rPr>
+                <w:b/>
+                <w:sz w:val="18"/>
+              </w:rPr>
+              <w:t xml:space="preserve">Small.</w:t>
+            </w:r>
+            <w:r>
+              <w:rPr>
+                <w:sz w:val="18"/>
+              </w:rPr>
+              <w:t xml:space="preserve"> Only 40 founder-facing App Store reviews, and the valuation platforms have 15–38 reviews each. Percentages are indicative, not statistical.</w:t>
+            </w:r>
+          </w:p>
+        </w:tc>
+      </w:tr>
+      <w:tr>
+        <w:tc>
+          <w:tcPr>
+            <w:tcW w:w="5040" w:type="dxa"/>
+          </w:tcPr>
+          <w:p>
+            <w:pPr>
+              <w:spacing w:before="40" w:after="40"/>
+            </w:pPr>
+            <w:r>
+              <w:rPr>
+                <w:b/>
+                <w:sz w:val="18"/>
+              </w:rPr>
+              <w:t xml:space="preserve">Proxy products</w:t>
+            </w:r>
+          </w:p>
+        </w:tc>
+        <w:tc>
+          <w:tcPr>
+            <w:tcW w:w="5040" w:type="dxa"/>
+          </w:tcPr>
+          <w:p>
+            <w:pPr>
+              <w:spacing w:before="40" w:after="40"/>
+            </w:pPr>
+            <w:r>
+              <w:rPr>
+                <w:sz w:val="18"/>
+              </w:rPr>
+              <w:t xml:space="preserve">⚠️ Skip (grants) and Nav (small-business credit/funding) are </w:t>
+            </w:r>
+            <w:r>
+              <w:rPr>
+                <w:b/>
+                <w:sz w:val="18"/>
+              </w:rPr>
+              <w:t xml:space="preserve">analogs</w:t>
+            </w:r>
+            <w:r>
+              <w:rPr>
+                <w:sz w:val="18"/>
+              </w:rPr>
+              <w:t xml:space="preserve">, not startup-valuation apps. They are included because they are the closest founder-facing "app finds you money" products with real review volume — treat their complaint pattern as a risk model, not as competitor data.</w:t>
+            </w:r>
+          </w:p>
+        </w:tc>
+      </w:tr>
+      <w:tr>
+        <w:tc>
+          <w:tcPr>
+            <w:tcW w:w="5040" w:type="dxa"/>
+          </w:tcPr>
+          <w:p>
+            <w:pPr>
+              <w:spacing w:before="40" w:after="40"/>
+            </w:pPr>
+            <w:r>
+              <w:rPr>
+                <w:b/>
+                <w:sz w:val="18"/>
+              </w:rPr>
+              <w:t xml:space="preserve">RAISE365</w:t>
+            </w:r>
+          </w:p>
+        </w:tc>
+        <w:tc>
+          <w:tcPr>
+            <w:tcW w:w="5040" w:type="dxa"/>
+          </w:tcPr>
+          <w:p>
+            <w:pPr>
+              <w:spacing w:before="40" w:after="40"/>
+            </w:pPr>
+            <w:r>
+              <w:rPr>
+                <w:sz w:val="18"/>
+              </w:rPr>
+              <w:t xml:space="preserve">⚠️ 49 reviews pulled and excluded — it is a school-sports fundraising app, irrelevant despite matching the search terms.</w:t>
+            </w:r>
+          </w:p>
+        </w:tc>
+      </w:tr>
+      <w:tr>
+        <w:tc>
+          <w:tcPr>
+            <w:tcW w:w="5040" w:type="dxa"/>
+          </w:tcPr>
+          <w:p>
+            <w:pPr>
+              <w:spacing w:before="40" w:after="40"/>
+            </w:pPr>
+            <w:r>
+              <w:rPr>
+                <w:b/>
+                <w:sz w:val="18"/>
+              </w:rPr>
+              <w:t xml:space="preserve">409A cost figures</w:t>
+            </w:r>
+          </w:p>
+        </w:tc>
+        <w:tc>
+          <w:tcPr>
+            <w:tcW w:w="5040" w:type="dxa"/>
+          </w:tcPr>
+          <w:p>
+            <w:pPr>
+              <w:spacing w:before="40" w:after="40"/>
+            </w:pPr>
+            <w:r>
+              <w:rPr>
+                <w:sz w:val="18"/>
+              </w:rPr>
+              <w:t xml:space="preserve">⚠️ From valuation-provider blogs (Sofer, 409a-valuation.com, Pulley, Cake), i.e. parties with an interest in the price anchor. Consistent across sources but not independent.</w:t>
+            </w:r>
+          </w:p>
+        </w:tc>
+      </w:tr>
+      <w:tr>
+        <w:tc>
+          <w:tcPr>
+            <w:tcW w:w="5040" w:type="dxa"/>
+          </w:tcPr>
+          <w:p>
+            <w:pPr>
+              <w:spacing w:before="40" w:after="40"/>
+            </w:pPr>
+            <w:r>
+              <w:rPr>
+                <w:b/>
+                <w:sz w:val="18"/>
+              </w:rPr>
+              <w:t xml:space="preserve">Fractional CFO / consultant fees</w:t>
+            </w:r>
+          </w:p>
+        </w:tc>
+        <w:tc>
+          <w:tcPr>
+            <w:tcW w:w="5040" w:type="dxa"/>
+          </w:tcPr>
+          <w:p>
+            <w:pPr>
+              <w:spacing w:before="40" w:after="40"/>
+            </w:pPr>
+            <w:r>
+              <w:rPr>
+                <w:sz w:val="18"/>
+              </w:rPr>
+              <w:t xml:space="preserve">⚠️ From advisory-firm marketing pages; no government wage series covers "fractional CFO."</w:t>
+            </w:r>
+          </w:p>
+        </w:tc>
+      </w:tr>
+      <w:tr>
+        <w:tc>
+          <w:tcPr>
+            <w:tcW w:w="5040" w:type="dxa"/>
+          </w:tcPr>
+          <w:p>
+            <w:pPr>
+              <w:spacing w:before="40" w:after="40"/>
+            </w:pPr>
+            <w:r>
+              <w:rPr>
+                <w:b/>
+                <w:sz w:val="18"/>
+              </w:rPr>
+              <w:t xml:space="preserve">Grocery job postings</w:t>
+            </w:r>
+          </w:p>
+        </w:tc>
+        <w:tc>
+          <w:tcPr>
+            <w:tcW w:w="5040" w:type="dxa"/>
+          </w:tcPr>
+          <w:p>
+            <w:pPr>
+              <w:spacing w:before="40" w:after="40"/>
+            </w:pPr>
+            <w:r>
+              <w:rPr>
+                <w:sz w:val="18"/>
+              </w:rPr>
+              <w:t xml:space="preserve">❌ Not researched here — see the note at the top. Already covered in the DietGroceryApp dossier, Section 2.</w:t>
             </w:r>
           </w:p>
         </w:tc>

</xml_diff>

<commit_message>
Add competitor teardown of seven valuation and investor platforms
Co-Authored-By: Claude Opus 5 <noreply@anthropic.com>
</commit_message>
<xml_diff>
--- a/08_StartupValuationApp/ResearchAgents/StartupValuationApp_Research.docx
+++ b/08_StartupValuationApp/ResearchAgents/StartupValuationApp_Research.docx
@@ -82,6 +82,17 @@
       </w:pPr>
       <w:r>
         <w:t xml:space="preserve">Section 2 — Complaint Themes &amp; What Humans Charge: seven themes from founder-facing tool reviews, plus the cost of the human version of this job. *(Added Sept 22, 2026)*</w:t>
+      </w:r>
+    </w:p>
+    <w:p>
+      <w:pPr>
+        <w:numPr>
+          <w:ilvl w:val="0"/>
+          <w:numId w:val="1"/>
+        </w:numPr>
+      </w:pPr>
+      <w:r>
+        <w:t xml:space="preserve">Section 3 — Competitor Teardown: pricing, features, target customer, funding and complaints for seven platforms, plus the gaps nobody serves. *(Added Sept 22, 2026)*</w:t>
       </w:r>
     </w:p>
     <w:p>
@@ -7375,6 +7386,3070 @@
                 <w:sz w:val="18"/>
               </w:rPr>
               <w:t xml:space="preserve">❌ Not researched here — see the note at the top. Already covered in the DietGroceryApp dossier, Section 2.</w:t>
+            </w:r>
+          </w:p>
+        </w:tc>
+      </w:tr>
+    </w:tbl>
+    <w:p>
+      <w:pPr>
+        <w:spacing w:after="0"/>
+      </w:pPr>
+    </w:p>
+    <w:p>
+      <w:r>
+        <w:br w:type="page"/>
+      </w:r>
+    </w:p>
+    <w:p>
+      <w:pPr>
+        <w:pStyle w:val="Title"/>
+      </w:pPr>
+      <w:r>
+        <w:t xml:space="preserve">Competitor Teardown — 7 Platforms</w:t>
+      </w:r>
+    </w:p>
+    <w:p>
+      <w:r>
+        <w:rPr>
+          <w:b/>
+        </w:rPr>
+        <w:t xml:space="preserve">Prepared:</w:t>
+      </w:r>
+      <w:r>
+        <w:t xml:space="preserve"> September 22, 2026</w:t>
+      </w:r>
+    </w:p>
+    <w:p>
+      <w:r>
+        <w:rPr>
+          <w:b/>
+        </w:rPr>
+        <w:t xml:space="preserve">Method:</w:t>
+      </w:r>
+      <w:r>
+        <w:t xml:space="preserve"> Prices taken from each company's own pricing page where it is published and reachable. </w:t>
+      </w:r>
+      <w:r>
+        <w:rPr>
+          <w:b/>
+        </w:rPr>
+        <w:t xml:space="preserve">Three of the seven don't publish prices at all</w:t>
+      </w:r>
+      <w:r>
+        <w:t xml:space="preserve"> (Carta beyond its free tier, Valutico, PitchBook) — those rows use third-party pricing intelligence and are marked. Complaints come from Trustpilot, Capterra and the App Store; complaints are paraphrased with reviewer, rating and date (I don't reproduce reviews verbatim — originals are in </w:t>
+      </w:r>
+      <w:hyperlink r:id="rHl36">
+        <w:r>
+          <w:rPr>
+            <w:rStyle w:val="Hyperlink"/>
+          </w:rPr>
+          <w:t xml:space="preserve">appstore-reviews-2025-2026.json</w:t>
+        </w:r>
+      </w:hyperlink>
+      <w:r>
+        <w:t xml:space="preserve">).</w:t>
+      </w:r>
+    </w:p>
+    <w:p>
+      <w:r>
+        <w:rPr>
+          <w:b/>
+        </w:rPr>
+        <w:t xml:space="preserve">Everything inferred rather than read is tagged `[UNVERIFIED]`.</w:t>
+      </w:r>
+    </w:p>
+    <w:p>
+      <w:pPr>
+        <w:pBdr>
+          <w:bottom w:val="single" w:sz="6" w:space="6" w:color="C9CCD1"/>
+        </w:pBdr>
+      </w:pPr>
+    </w:p>
+    <w:p>
+      <w:pPr>
+        <w:pStyle w:val="Heading1"/>
+      </w:pPr>
+      <w:r>
+        <w:t xml:space="preserve">Master comparison table</w:t>
+      </w:r>
+    </w:p>
+    <w:tbl>
+      <w:tblPr>
+        <w:tblW w:w="10080" w:type="dxa"/>
+        <w:tblBorders>
+          <w:top w:val="single" w:sz="4" w:space="0" w:color="C9CCD1"/>
+          <w:left w:val="single" w:sz="4" w:space="0" w:color="C9CCD1"/>
+          <w:bottom w:val="single" w:sz="4" w:space="0" w:color="C9CCD1"/>
+          <w:right w:val="single" w:sz="4" w:space="0" w:color="C9CCD1"/>
+          <w:insideH w:val="single" w:sz="4" w:space="0" w:color="C9CCD1"/>
+          <w:insideV w:val="single" w:sz="4" w:space="0" w:color="C9CCD1"/>
+        </w:tblBorders>
+        <w:tblLayout w:type="fixed"/>
+      </w:tblPr>
+      <w:tblGrid>
+        <w:gridCol w:w="1680"/>
+        <w:gridCol w:w="1680"/>
+        <w:gridCol w:w="1680"/>
+        <w:gridCol w:w="1680"/>
+        <w:gridCol w:w="1680"/>
+        <w:gridCol w:w="1680"/>
+      </w:tblGrid>
+      <w:tr>
+        <w:trPr>
+          <w:tblHeader/>
+        </w:trPr>
+        <w:tc>
+          <w:tcPr>
+            <w:tcW w:w="1680" w:type="dxa"/>
+            <w:shd w:val="clear" w:color="auto" w:fill="EFF1F3"/>
+          </w:tcPr>
+          <w:p>
+            <w:pPr>
+              <w:spacing w:before="40" w:after="40"/>
+            </w:pPr>
+            <w:r>
+              <w:rPr>
+                <w:b/>
+                <w:sz w:val="18"/>
+              </w:rPr>
+              <w:t xml:space="preserve">Platform</w:t>
+            </w:r>
+          </w:p>
+        </w:tc>
+        <w:tc>
+          <w:tcPr>
+            <w:tcW w:w="1680" w:type="dxa"/>
+            <w:shd w:val="clear" w:color="auto" w:fill="EFF1F3"/>
+          </w:tcPr>
+          <w:p>
+            <w:pPr>
+              <w:spacing w:before="40" w:after="40"/>
+            </w:pPr>
+            <w:r>
+              <w:rPr>
+                <w:b/>
+                <w:sz w:val="18"/>
+              </w:rPr>
+              <w:t xml:space="preserve">Price (source)</w:t>
+            </w:r>
+          </w:p>
+        </w:tc>
+        <w:tc>
+          <w:tcPr>
+            <w:tcW w:w="1680" w:type="dxa"/>
+            <w:shd w:val="clear" w:color="auto" w:fill="EFF1F3"/>
+          </w:tcPr>
+          <w:p>
+            <w:pPr>
+              <w:spacing w:before="40" w:after="40"/>
+            </w:pPr>
+            <w:r>
+              <w:rPr>
+                <w:b/>
+                <w:sz w:val="18"/>
+              </w:rPr>
+              <w:t xml:space="preserve">Three core features</w:t>
+            </w:r>
+          </w:p>
+        </w:tc>
+        <w:tc>
+          <w:tcPr>
+            <w:tcW w:w="1680" w:type="dxa"/>
+            <w:shd w:val="clear" w:color="auto" w:fill="EFF1F3"/>
+          </w:tcPr>
+          <w:p>
+            <w:pPr>
+              <w:spacing w:before="40" w:after="40"/>
+            </w:pPr>
+            <w:r>
+              <w:rPr>
+                <w:b/>
+                <w:sz w:val="18"/>
+              </w:rPr>
+              <w:t xml:space="preserve">Target customer</w:t>
+            </w:r>
+          </w:p>
+        </w:tc>
+        <w:tc>
+          <w:tcPr>
+            <w:tcW w:w="1680" w:type="dxa"/>
+            <w:shd w:val="clear" w:color="auto" w:fill="EFF1F3"/>
+          </w:tcPr>
+          <w:p>
+            <w:pPr>
+              <w:spacing w:before="40" w:after="40"/>
+            </w:pPr>
+            <w:r>
+              <w:rPr>
+                <w:b/>
+                <w:sz w:val="18"/>
+              </w:rPr>
+              <w:t xml:space="preserve">Funding / ownership</w:t>
+            </w:r>
+          </w:p>
+        </w:tc>
+        <w:tc>
+          <w:tcPr>
+            <w:tcW w:w="1680" w:type="dxa"/>
+            <w:shd w:val="clear" w:color="auto" w:fill="EFF1F3"/>
+          </w:tcPr>
+          <w:p>
+            <w:pPr>
+              <w:spacing w:before="40" w:after="40"/>
+            </w:pPr>
+            <w:r>
+              <w:rPr>
+                <w:b/>
+                <w:sz w:val="18"/>
+              </w:rPr>
+              <w:t xml:space="preserve">Top 3 complaints</w:t>
+            </w:r>
+          </w:p>
+        </w:tc>
+      </w:tr>
+      <w:tr>
+        <w:tc>
+          <w:tcPr>
+            <w:tcW w:w="1680" w:type="dxa"/>
+          </w:tcPr>
+          <w:p>
+            <w:pPr>
+              <w:spacing w:before="40" w:after="40"/>
+            </w:pPr>
+            <w:r>
+              <w:rPr>
+                <w:b/>
+                <w:sz w:val="18"/>
+              </w:rPr>
+              <w:t xml:space="preserve">Carta</w:t>
+            </w:r>
+          </w:p>
+        </w:tc>
+        <w:tc>
+          <w:tcPr>
+            <w:tcW w:w="1680" w:type="dxa"/>
+          </w:tcPr>
+          <w:p>
+            <w:pPr>
+              <w:spacing w:before="40" w:after="40"/>
+            </w:pPr>
+            <w:r>
+              <w:rPr>
+                <w:b/>
+                <w:sz w:val="18"/>
+              </w:rPr>
+              <w:t xml:space="preserve">Launch: free</w:t>
+            </w:r>
+            <w:r>
+              <w:rPr>
+                <w:sz w:val="18"/>
+              </w:rPr>
+              <w:t xml:space="preserve"> (≤25 stakeholders, ≤$1M raised). </w:t>
+            </w:r>
+            <w:r>
+              <w:rPr>
+                <w:b/>
+                <w:sz w:val="18"/>
+              </w:rPr>
+              <w:t xml:space="preserve">Build / Grow / Scale: contact sales</w:t>
+            </w:r>
+            <w:r>
+              <w:rPr>
+                <w:sz w:val="18"/>
+              </w:rPr>
+              <w:t xml:space="preserve"> — "price per stakeholder with a minimum annual fee," no dollar figures published. 409A included from </w:t>
+            </w:r>
+            <w:r>
+              <w:rPr>
+                <w:b/>
+                <w:sz w:val="18"/>
+              </w:rPr>
+              <w:t xml:space="preserve">Grow</w:t>
+            </w:r>
+            <w:r>
+              <w:rPr>
+                <w:sz w:val="18"/>
+              </w:rPr>
+              <w:t xml:space="preserve"> up. — </w:t>
+            </w:r>
+            <w:hyperlink r:id="rHl47">
+              <w:r>
+                <w:rPr>
+                  <w:rStyle w:val="Hyperlink"/>
+                  <w:sz w:val="18"/>
+                </w:rPr>
+                <w:t xml:space="preserve">pricing page</w:t>
+              </w:r>
+            </w:hyperlink>
+          </w:p>
+        </w:tc>
+        <w:tc>
+          <w:tcPr>
+            <w:tcW w:w="1680" w:type="dxa"/>
+          </w:tcPr>
+          <w:p>
+            <w:pPr>
+              <w:spacing w:before="40" w:after="40"/>
+            </w:pPr>
+            <w:r>
+              <w:rPr>
+                <w:sz w:val="18"/>
+              </w:rPr>
+              <w:t xml:space="preserve">1. Cap table + SEC-registered transfer agent 2. 409A valuations + audit support 3. Priced-round modeling, deal closings, ASC 718</w:t>
+            </w:r>
+          </w:p>
+        </w:tc>
+        <w:tc>
+          <w:tcPr>
+            <w:tcW w:w="1680" w:type="dxa"/>
+          </w:tcPr>
+          <w:p>
+            <w:pPr>
+              <w:spacing w:before="40" w:after="40"/>
+            </w:pPr>
+            <w:r>
+              <w:rPr>
+                <w:sz w:val="18"/>
+              </w:rPr>
+              <w:t xml:space="preserve">Funded startups and their finance/people-ops admins</w:t>
+            </w:r>
+          </w:p>
+        </w:tc>
+        <w:tc>
+          <w:tcPr>
+            <w:tcW w:w="1680" w:type="dxa"/>
+          </w:tcPr>
+          <w:p>
+            <w:pPr>
+              <w:spacing w:before="40" w:after="40"/>
+            </w:pPr>
+            <w:r>
+              <w:rPr>
+                <w:b/>
+                <w:sz w:val="18"/>
+              </w:rPr>
+              <w:t xml:space="preserve">~$1.29B raised</w:t>
+            </w:r>
+            <w:r>
+              <w:rPr>
+                <w:sz w:val="18"/>
+              </w:rPr>
+              <w:t xml:space="preserve">; $7.4B valuation at $500M Series G (Silver Lake, Aug 2021); more recent third-party marks put it near </w:t>
+            </w:r>
+            <w:r>
+              <w:rPr>
+                <w:b/>
+                <w:sz w:val="18"/>
+              </w:rPr>
+              <w:t xml:space="preserve">$3.5B / ~$500M ARR</w:t>
+            </w:r>
+            <w:r>
+              <w:rPr>
+                <w:sz w:val="18"/>
+              </w:rPr>
+              <w:t xml:space="preserve"> </w:t>
+            </w:r>
+            <w:r>
+              <w:rPr>
+                <w:rFonts w:ascii="Consolas" w:hAnsi="Consolas"/>
+                <w:sz w:val="18"/>
+              </w:rPr>
+              <w:t xml:space="preserve">[UNVERIFIED — Latka/Sacra secondary]</w:t>
+            </w:r>
+            <w:r>
+              <w:rPr>
+                <w:sz w:val="18"/>
+              </w:rPr>
+              <w:t xml:space="preserve"> (</w:t>
+            </w:r>
+            <w:hyperlink r:id="rHl48">
+              <w:r>
+                <w:rPr>
+                  <w:rStyle w:val="Hyperlink"/>
+                  <w:sz w:val="18"/>
+                </w:rPr>
+                <w:t xml:space="preserve">Sacra</w:t>
+              </w:r>
+            </w:hyperlink>
+            <w:r>
+              <w:rPr>
+                <w:sz w:val="18"/>
+              </w:rPr>
+              <w:t xml:space="preserve">)</w:t>
+            </w:r>
+          </w:p>
+        </w:tc>
+        <w:tc>
+          <w:tcPr>
+            <w:tcW w:w="1680" w:type="dxa"/>
+          </w:tcPr>
+          <w:p>
+            <w:pPr>
+              <w:spacing w:before="40" w:after="40"/>
+            </w:pPr>
+            <w:r>
+              <w:rPr>
+                <w:sz w:val="18"/>
+              </w:rPr>
+              <w:t xml:space="preserve">~$8,000/yr vs competitors' hundreds; 409A sales claims called misleading; price escalates with stakeholder count + slow support</w:t>
+            </w:r>
+          </w:p>
+        </w:tc>
+      </w:tr>
+      <w:tr>
+        <w:tc>
+          <w:tcPr>
+            <w:tcW w:w="1680" w:type="dxa"/>
+          </w:tcPr>
+          <w:p>
+            <w:pPr>
+              <w:spacing w:before="40" w:after="40"/>
+            </w:pPr>
+            <w:r>
+              <w:rPr>
+                <w:b/>
+                <w:sz w:val="18"/>
+              </w:rPr>
+              <w:t xml:space="preserve">Equidam</w:t>
+            </w:r>
+          </w:p>
+        </w:tc>
+        <w:tc>
+          <w:tcPr>
+            <w:tcW w:w="1680" w:type="dxa"/>
+          </w:tcPr>
+          <w:p>
+            <w:pPr>
+              <w:spacing w:before="40" w:after="40"/>
+            </w:pPr>
+            <w:r>
+              <w:rPr>
+                <w:b/>
+                <w:sz w:val="18"/>
+              </w:rPr>
+              <w:t xml:space="preserve">Published.</w:t>
+            </w:r>
+            <w:r>
+              <w:rPr>
+                <w:sz w:val="18"/>
+              </w:rPr>
+              <w:t xml:space="preserve"> Essential </w:t>
+            </w:r>
+            <w:r>
+              <w:rPr>
+                <w:b/>
+                <w:sz w:val="18"/>
+              </w:rPr>
+              <w:t xml:space="preserve">free</w:t>
+            </w:r>
+            <w:r>
+              <w:rPr>
+                <w:sz w:val="18"/>
+              </w:rPr>
+              <w:t xml:space="preserve">; Advanced </w:t>
+            </w:r>
+            <w:r>
+              <w:rPr>
+                <w:b/>
+                <w:sz w:val="18"/>
+              </w:rPr>
+              <w:t xml:space="preserve">$412.25</w:t>
+            </w:r>
+            <w:r>
+              <w:rPr>
+                <w:sz w:val="18"/>
+              </w:rPr>
+              <w:t xml:space="preserve">; Expert </w:t>
+            </w:r>
+            <w:r>
+              <w:rPr>
+                <w:b/>
+                <w:sz w:val="18"/>
+              </w:rPr>
+              <w:t xml:space="preserve">$1,063.25</w:t>
+            </w:r>
+            <w:r>
+              <w:rPr>
+                <w:sz w:val="18"/>
+              </w:rPr>
+              <w:t xml:space="preserve"> (both = 2-month access on a 12-month valuation cycle); </w:t>
+            </w:r>
+            <w:r>
+              <w:rPr>
+                <w:b/>
+                <w:sz w:val="18"/>
+              </w:rPr>
+              <w:t xml:space="preserve">409A: $1,990/yr</w:t>
+            </w:r>
+            <w:r>
+              <w:rPr>
+                <w:sz w:val="18"/>
+              </w:rPr>
+              <w:t xml:space="preserve"> — </w:t>
+            </w:r>
+            <w:hyperlink r:id="rHl49">
+              <w:r>
+                <w:rPr>
+                  <w:rStyle w:val="Hyperlink"/>
+                  <w:sz w:val="18"/>
+                </w:rPr>
+                <w:t xml:space="preserve">pricing page</w:t>
+              </w:r>
+            </w:hyperlink>
+          </w:p>
+        </w:tc>
+        <w:tc>
+          <w:tcPr>
+            <w:tcW w:w="1680" w:type="dxa"/>
+          </w:tcPr>
+          <w:p>
+            <w:pPr>
+              <w:spacing w:before="40" w:after="40"/>
+            </w:pPr>
+            <w:r>
+              <w:rPr>
+                <w:sz w:val="18"/>
+              </w:rPr>
+              <w:t xml:space="preserve">1. Five-method valuation engine with scenarios 2. Benchmarks: funding-round, revenue/EBITDA, "Valuation Delta" 3. Expert review call + exportable report; 409A safe-harbor option</w:t>
+            </w:r>
+          </w:p>
+        </w:tc>
+        <w:tc>
+          <w:tcPr>
+            <w:tcW w:w="1680" w:type="dxa"/>
+          </w:tcPr>
+          <w:p>
+            <w:pPr>
+              <w:spacing w:before="40" w:after="40"/>
+            </w:pPr>
+            <w:r>
+              <w:rPr>
+                <w:b/>
+                <w:sz w:val="18"/>
+              </w:rPr>
+              <w:t xml:space="preserve">Founders preparing to negotiate</w:t>
+            </w:r>
+            <w:r>
+              <w:rPr>
+                <w:sz w:val="18"/>
+              </w:rPr>
+              <w:t xml:space="preserve"> — the only founder-first valuation tool in this set</w:t>
+            </w:r>
+          </w:p>
+        </w:tc>
+        <w:tc>
+          <w:tcPr>
+            <w:tcW w:w="1680" w:type="dxa"/>
+          </w:tcPr>
+          <w:p>
+            <w:pPr>
+              <w:spacing w:before="40" w:after="40"/>
+            </w:pPr>
+            <w:r>
+              <w:rPr>
+                <w:sz w:val="18"/>
+              </w:rPr>
+              <w:t xml:space="preserve">Bootstrapped, then </w:t>
+            </w:r>
+            <w:r>
+              <w:rPr>
+                <w:b/>
+                <w:sz w:val="18"/>
+              </w:rPr>
+              <w:t xml:space="preserve">€60k crowdfunding (2013)</w:t>
+            </w:r>
+            <w:r>
+              <w:rPr>
+                <w:sz w:val="18"/>
+              </w:rPr>
+              <w:t xml:space="preserve"> and </w:t>
+            </w:r>
+            <w:r>
+              <w:rPr>
+                <w:b/>
+                <w:sz w:val="18"/>
+              </w:rPr>
+              <w:t xml:space="preserve">€225k seed (2014)</w:t>
+            </w:r>
+            <w:r>
+              <w:rPr>
+                <w:sz w:val="18"/>
+              </w:rPr>
+              <w:t xml:space="preserve">; Rotterdam; </w:t>
+            </w:r>
+            <w:r>
+              <w:rPr>
+                <w:b/>
+                <w:sz w:val="18"/>
+              </w:rPr>
+              <w:t xml:space="preserve">merged with Share Council (Feb 2026)</w:t>
+            </w:r>
+            <w:r>
+              <w:rPr>
+                <w:sz w:val="18"/>
+              </w:rPr>
+              <w:t xml:space="preserve"> </w:t>
+            </w:r>
+            <w:r>
+              <w:rPr>
+                <w:rFonts w:ascii="Consolas" w:hAnsi="Consolas"/>
+                <w:sz w:val="18"/>
+              </w:rPr>
+              <w:t xml:space="preserve">[merger from secondary sources]</w:t>
+            </w:r>
+          </w:p>
+        </w:tc>
+        <w:tc>
+          <w:tcPr>
+            <w:tcW w:w="1680" w:type="dxa"/>
+          </w:tcPr>
+          <w:p>
+            <w:pPr>
+              <w:spacing w:before="40" w:after="40"/>
+            </w:pPr>
+            <w:r>
+              <w:rPr>
+                <w:sz w:val="18"/>
+              </w:rPr>
+              <w:t xml:space="preserve">Only 15 Trustpilot reviews (2 in the past year) — €300 trial cost called expensive; workflow mismatch for one user; </w:t>
+            </w:r>
+            <w:r>
+              <w:rPr>
+                <w:b/>
+                <w:sz w:val="18"/>
+              </w:rPr>
+              <w:t xml:space="preserve">thin evidence base overall</w:t>
+            </w:r>
+          </w:p>
+        </w:tc>
+      </w:tr>
+      <w:tr>
+        <w:tc>
+          <w:tcPr>
+            <w:tcW w:w="1680" w:type="dxa"/>
+          </w:tcPr>
+          <w:p>
+            <w:pPr>
+              <w:spacing w:before="40" w:after="40"/>
+            </w:pPr>
+            <w:r>
+              <w:rPr>
+                <w:b/>
+                <w:sz w:val="18"/>
+              </w:rPr>
+              <w:t xml:space="preserve">Valutico</w:t>
+            </w:r>
+          </w:p>
+        </w:tc>
+        <w:tc>
+          <w:tcPr>
+            <w:tcW w:w="1680" w:type="dxa"/>
+          </w:tcPr>
+          <w:p>
+            <w:pPr>
+              <w:spacing w:before="40" w:after="40"/>
+            </w:pPr>
+            <w:r>
+              <w:rPr>
+                <w:b/>
+                <w:sz w:val="18"/>
+              </w:rPr>
+              <w:t xml:space="preserve">Not published — quote only.</w:t>
+            </w:r>
+            <w:r>
+              <w:rPr>
+                <w:sz w:val="18"/>
+              </w:rPr>
+              <w:t xml:space="preserve"> Demo/VDR trial CTAs, no tiers — </w:t>
+            </w:r>
+            <w:hyperlink r:id="rHl50">
+              <w:r>
+                <w:rPr>
+                  <w:rStyle w:val="Hyperlink"/>
+                  <w:sz w:val="18"/>
+                </w:rPr>
+                <w:t xml:space="preserve">pricing page</w:t>
+              </w:r>
+            </w:hyperlink>
+          </w:p>
+        </w:tc>
+        <w:tc>
+          <w:tcPr>
+            <w:tcW w:w="1680" w:type="dxa"/>
+          </w:tcPr>
+          <w:p>
+            <w:pPr>
+              <w:spacing w:before="40" w:after="40"/>
+            </w:pPr>
+            <w:r>
+              <w:rPr>
+                <w:sz w:val="18"/>
+              </w:rPr>
+              <w:t xml:space="preserve">1. 28 valuation techniques 2. Large transaction/peer comp database (1M+ transactions, 53k+ peers, vendor-stated) 3. Modules: diligence, credit, forecast, Eva AI, data room</w:t>
+            </w:r>
+          </w:p>
+        </w:tc>
+        <w:tc>
+          <w:tcPr>
+            <w:tcW w:w="1680" w:type="dxa"/>
+          </w:tcPr>
+          <w:p>
+            <w:pPr>
+              <w:spacing w:before="40" w:after="40"/>
+            </w:pPr>
+            <w:r>
+              <w:rPr>
+                <w:b/>
+                <w:sz w:val="18"/>
+              </w:rPr>
+              <w:t xml:space="preserve">Advisors, not founders</w:t>
+            </w:r>
+            <w:r>
+              <w:rPr>
+                <w:sz w:val="18"/>
+              </w:rPr>
+              <w:t xml:space="preserve"> — M&amp;A teams, accounting/audit firms, PE, banks</w:t>
+            </w:r>
+          </w:p>
+        </w:tc>
+        <w:tc>
+          <w:tcPr>
+            <w:tcW w:w="1680" w:type="dxa"/>
+          </w:tcPr>
+          <w:p>
+            <w:pPr>
+              <w:spacing w:before="40" w:after="40"/>
+            </w:pPr>
+            <w:r>
+              <w:rPr>
+                <w:b/>
+                <w:sz w:val="18"/>
+              </w:rPr>
+              <w:t xml:space="preserve">$2.18M total</w:t>
+            </w:r>
+            <w:r>
+              <w:rPr>
+                <w:sz w:val="18"/>
+              </w:rPr>
+              <w:t xml:space="preserve">, seed from PUSH Ventures, aws Gründerfonds, Erste Group; Vienna, founded 2017 (</w:t>
+            </w:r>
+            <w:hyperlink r:id="rHl51">
+              <w:r>
+                <w:rPr>
+                  <w:rStyle w:val="Hyperlink"/>
+                  <w:sz w:val="18"/>
+                </w:rPr>
+                <w:t xml:space="preserve">Tech.eu</w:t>
+              </w:r>
+            </w:hyperlink>
+            <w:r>
+              <w:rPr>
+                <w:sz w:val="18"/>
+              </w:rPr>
+              <w:t xml:space="preserve">)</w:t>
+            </w:r>
+          </w:p>
+        </w:tc>
+        <w:tc>
+          <w:tcPr>
+            <w:tcW w:w="1680" w:type="dxa"/>
+          </w:tcPr>
+          <w:p>
+            <w:pPr>
+              <w:spacing w:before="40" w:after="40"/>
+            </w:pPr>
+            <w:r>
+              <w:rPr>
+                <w:sz w:val="18"/>
+              </w:rPr>
+              <w:t xml:space="preserve">Renewal charges after cancellation pursued by debt collectors (Dec 2024, 1★); comparable-transaction set missing many deals (Apr 2025); "best for larger enterprises, not small business" (Apr 2024)</w:t>
+            </w:r>
+          </w:p>
+        </w:tc>
+      </w:tr>
+      <w:tr>
+        <w:tc>
+          <w:tcPr>
+            <w:tcW w:w="1680" w:type="dxa"/>
+          </w:tcPr>
+          <w:p>
+            <w:pPr>
+              <w:spacing w:before="40" w:after="40"/>
+            </w:pPr>
+            <w:r>
+              <w:rPr>
+                <w:b/>
+                <w:sz w:val="18"/>
+              </w:rPr>
+              <w:t xml:space="preserve">Eqvista</w:t>
+            </w:r>
+          </w:p>
+        </w:tc>
+        <w:tc>
+          <w:tcPr>
+            <w:tcW w:w="1680" w:type="dxa"/>
+          </w:tcPr>
+          <w:p>
+            <w:pPr>
+              <w:spacing w:before="40" w:after="40"/>
+            </w:pPr>
+            <w:r>
+              <w:rPr>
+                <w:b/>
+                <w:sz w:val="18"/>
+              </w:rPr>
+              <w:t xml:space="preserve">Published.</w:t>
+            </w:r>
+            <w:r>
+              <w:rPr>
+                <w:sz w:val="18"/>
+              </w:rPr>
+              <w:t xml:space="preserve"> Cap table: </w:t>
+            </w:r>
+            <w:r>
+              <w:rPr>
+                <w:b/>
+                <w:sz w:val="18"/>
+              </w:rPr>
+              <w:t xml:space="preserve">free</w:t>
+            </w:r>
+            <w:r>
+              <w:rPr>
+                <w:sz w:val="18"/>
+              </w:rPr>
+              <w:t xml:space="preserve"> &lt;20 stakeholders; </w:t>
+            </w:r>
+            <w:r>
+              <w:rPr>
+                <w:b/>
+                <w:sz w:val="18"/>
+              </w:rPr>
+              <w:t xml:space="preserve">$2/stakeholder/month</w:t>
+            </w:r>
+            <w:r>
+              <w:rPr>
+                <w:sz w:val="18"/>
+              </w:rPr>
+              <w:t xml:space="preserve"> premium. </w:t>
+            </w:r>
+            <w:r>
+              <w:rPr>
+                <w:b/>
+                <w:sz w:val="18"/>
+              </w:rPr>
+              <w:t xml:space="preserve">409A + cap table bundles: $990</w:t>
+            </w:r>
+            <w:r>
+              <w:rPr>
+                <w:sz w:val="18"/>
+              </w:rPr>
+              <w:t xml:space="preserve"> (pre-revenue), </w:t>
+            </w:r>
+            <w:r>
+              <w:rPr>
+                <w:b/>
+                <w:sz w:val="18"/>
+              </w:rPr>
+              <w:t xml:space="preserve">$1,290</w:t>
+            </w:r>
+            <w:r>
+              <w:rPr>
+                <w:sz w:val="18"/>
+              </w:rPr>
+              <w:t xml:space="preserve"> (angel), </w:t>
+            </w:r>
+            <w:r>
+              <w:rPr>
+                <w:b/>
+                <w:sz w:val="18"/>
+              </w:rPr>
+              <w:t xml:space="preserve">$1,990</w:t>
+            </w:r>
+            <w:r>
+              <w:rPr>
+                <w:sz w:val="18"/>
+              </w:rPr>
+              <w:t xml:space="preserve"> (seed), </w:t>
+            </w:r>
+            <w:r>
+              <w:rPr>
+                <w:b/>
+                <w:sz w:val="18"/>
+              </w:rPr>
+              <w:t xml:space="preserve">$2,590</w:t>
+            </w:r>
+            <w:r>
+              <w:rPr>
+                <w:sz w:val="18"/>
+              </w:rPr>
+              <w:t xml:space="preserve"> (Series A), custom B+. ASC 718 $500+, QSBS $1,000+ — </w:t>
+            </w:r>
+            <w:hyperlink r:id="rHl52">
+              <w:r>
+                <w:rPr>
+                  <w:rStyle w:val="Hyperlink"/>
+                  <w:sz w:val="18"/>
+                </w:rPr>
+                <w:t xml:space="preserve">pricing page</w:t>
+              </w:r>
+            </w:hyperlink>
+          </w:p>
+        </w:tc>
+        <w:tc>
+          <w:tcPr>
+            <w:tcW w:w="1680" w:type="dxa"/>
+          </w:tcPr>
+          <w:p>
+            <w:pPr>
+              <w:spacing w:before="40" w:after="40"/>
+            </w:pPr>
+            <w:r>
+              <w:rPr>
+                <w:sz w:val="18"/>
+              </w:rPr>
+              <w:t xml:space="preserve">1. Cap table + ESOP management 2. </w:t>
+            </w:r>
+            <w:r>
+              <w:rPr>
+                <w:b/>
+                <w:sz w:val="18"/>
+              </w:rPr>
+              <w:t xml:space="preserve">Unlimited 409A updates/renewals</w:t>
+            </w:r>
+            <w:r>
+              <w:rPr>
+                <w:sz w:val="18"/>
+              </w:rPr>
+              <w:t xml:space="preserve"> inside the bundle 3. Waterfall and funding-round modeling</w:t>
+            </w:r>
+          </w:p>
+        </w:tc>
+        <w:tc>
+          <w:tcPr>
+            <w:tcW w:w="1680" w:type="dxa"/>
+          </w:tcPr>
+          <w:p>
+            <w:pPr>
+              <w:spacing w:before="40" w:after="40"/>
+            </w:pPr>
+            <w:r>
+              <w:rPr>
+                <w:sz w:val="18"/>
+              </w:rPr>
+              <w:t xml:space="preserve">Price-sensitive early-stage startups — the explicit Carta alternative</w:t>
+            </w:r>
+          </w:p>
+        </w:tc>
+        <w:tc>
+          <w:tcPr>
+            <w:tcW w:w="1680" w:type="dxa"/>
+          </w:tcPr>
+          <w:p>
+            <w:pPr>
+              <w:spacing w:before="40" w:after="40"/>
+            </w:pPr>
+            <w:r>
+              <w:rPr>
+                <w:b/>
+                <w:sz w:val="18"/>
+              </w:rPr>
+              <w:t xml:space="preserve">$5M raised</w:t>
+            </w:r>
+            <w:r>
+              <w:rPr>
+                <w:sz w:val="18"/>
+              </w:rPr>
+              <w:t xml:space="preserve">; founded 2018, Las Vegas, founder Tomas Milar </w:t>
+            </w:r>
+            <w:r>
+              <w:rPr>
+                <w:rFonts w:ascii="Consolas" w:hAnsi="Consolas"/>
+                <w:sz w:val="18"/>
+              </w:rPr>
+              <w:t xml:space="preserve">[UNVERIFIED — aggregator profiles]</w:t>
+            </w:r>
+          </w:p>
+        </w:tc>
+        <w:tc>
+          <w:tcPr>
+            <w:tcW w:w="1680" w:type="dxa"/>
+          </w:tcPr>
+          <w:p>
+            <w:pPr>
+              <w:spacing w:before="40" w:after="40"/>
+            </w:pPr>
+            <w:r>
+              <w:rPr>
+                <w:sz w:val="18"/>
+              </w:rPr>
+              <w:t xml:space="preserve">Charges continuing after cancellation (1★); slowness on large data sets (Apr 2026); email-only support, reports need Excel export</w:t>
+            </w:r>
+          </w:p>
+        </w:tc>
+      </w:tr>
+      <w:tr>
+        <w:tc>
+          <w:tcPr>
+            <w:tcW w:w="1680" w:type="dxa"/>
+          </w:tcPr>
+          <w:p>
+            <w:pPr>
+              <w:spacing w:before="40" w:after="40"/>
+            </w:pPr>
+            <w:r>
+              <w:rPr>
+                <w:b/>
+                <w:sz w:val="18"/>
+              </w:rPr>
+              <w:t xml:space="preserve">Crunchbase</w:t>
+            </w:r>
+          </w:p>
+        </w:tc>
+        <w:tc>
+          <w:tcPr>
+            <w:tcW w:w="1680" w:type="dxa"/>
+          </w:tcPr>
+          <w:p>
+            <w:pPr>
+              <w:spacing w:before="40" w:after="40"/>
+            </w:pPr>
+            <w:r>
+              <w:rPr>
+                <w:b/>
+                <w:sz w:val="18"/>
+              </w:rPr>
+              <w:t xml:space="preserve">Free tier</w:t>
+            </w:r>
+            <w:r>
+              <w:rPr>
+                <w:sz w:val="18"/>
+              </w:rPr>
+              <w:t xml:space="preserve">; </w:t>
+            </w:r>
+            <w:r>
+              <w:rPr>
+                <w:b/>
+                <w:sz w:val="18"/>
+              </w:rPr>
+              <w:t xml:space="preserve">Pro $99/mo or $588/yr</w:t>
+            </w:r>
+            <w:r>
+              <w:rPr>
+                <w:sz w:val="18"/>
+              </w:rPr>
+              <w:t xml:space="preserve"> (2,000 export rows, 10 contact unlocks); </w:t>
+            </w:r>
+            <w:r>
+              <w:rPr>
+                <w:b/>
+                <w:sz w:val="18"/>
+              </w:rPr>
+              <w:t xml:space="preserve">Business $199/mo annual</w:t>
+            </w:r>
+            <w:r>
+              <w:rPr>
+                <w:sz w:val="18"/>
+              </w:rPr>
+              <w:t xml:space="preserve"> (5,000 rows, CRM, Predictions &amp; Insights) — </w:t>
+            </w:r>
+            <w:r>
+              <w:rPr>
+                <w:b/>
+                <w:sz w:val="18"/>
+              </w:rPr>
+              <w:t xml:space="preserve">pricing page is Cloudflare-blocked to this tool</w:t>
+            </w:r>
+            <w:r>
+              <w:rPr>
+                <w:sz w:val="18"/>
+              </w:rPr>
+              <w:t xml:space="preserve">, figures from </w:t>
+            </w:r>
+            <w:hyperlink r:id="rHl53">
+              <w:r>
+                <w:rPr>
+                  <w:rStyle w:val="Hyperlink"/>
+                  <w:sz w:val="18"/>
+                </w:rPr>
+                <w:t xml:space="preserve">G2</w:t>
+              </w:r>
+            </w:hyperlink>
+            <w:r>
+              <w:rPr>
+                <w:sz w:val="18"/>
+              </w:rPr>
+              <w:t xml:space="preserve"> / </w:t>
+            </w:r>
+            <w:hyperlink r:id="rHl54">
+              <w:r>
+                <w:rPr>
+                  <w:rStyle w:val="Hyperlink"/>
+                  <w:sz w:val="18"/>
+                </w:rPr>
+                <w:t xml:space="preserve">Vendr</w:t>
+              </w:r>
+            </w:hyperlink>
+            <w:r>
+              <w:rPr>
+                <w:sz w:val="18"/>
+              </w:rPr>
+              <w:t xml:space="preserve"> </w:t>
+            </w:r>
+            <w:r>
+              <w:rPr>
+                <w:rFonts w:ascii="Consolas" w:hAnsi="Consolas"/>
+                <w:sz w:val="18"/>
+              </w:rPr>
+              <w:t xml:space="preserve">[secondary]</w:t>
+            </w:r>
+          </w:p>
+        </w:tc>
+        <w:tc>
+          <w:tcPr>
+            <w:tcW w:w="1680" w:type="dxa"/>
+          </w:tcPr>
+          <w:p>
+            <w:pPr>
+              <w:spacing w:before="40" w:after="40"/>
+            </w:pPr>
+            <w:r>
+              <w:rPr>
+                <w:sz w:val="18"/>
+              </w:rPr>
+              <w:t xml:space="preserve">1. Search across 4M+ companies 2. </w:t>
+            </w:r>
+            <w:r>
+              <w:rPr>
+                <w:b/>
+                <w:sz w:val="18"/>
+              </w:rPr>
+              <w:t xml:space="preserve">Predictive funding intelligence with ranked investor matches</w:t>
+            </w:r>
+            <w:r>
+              <w:rPr>
+                <w:sz w:val="18"/>
+              </w:rPr>
+              <w:t xml:space="preserve"> 3. AI natural-language search, alerts, CRM sync</w:t>
+            </w:r>
+          </w:p>
+        </w:tc>
+        <w:tc>
+          <w:tcPr>
+            <w:tcW w:w="1680" w:type="dxa"/>
+          </w:tcPr>
+          <w:p>
+            <w:pPr>
+              <w:spacing w:before="40" w:after="40"/>
+            </w:pPr>
+            <w:r>
+              <w:rPr>
+                <w:sz w:val="18"/>
+              </w:rPr>
+              <w:t xml:space="preserve">Sales/BD teams, investors, researchers — </w:t>
+            </w:r>
+            <w:r>
+              <w:rPr>
+                <w:b/>
+                <w:sz w:val="18"/>
+              </w:rPr>
+              <w:t xml:space="preserve">founders are not the primary buyer</w:t>
+            </w:r>
+          </w:p>
+        </w:tc>
+        <w:tc>
+          <w:tcPr>
+            <w:tcW w:w="1680" w:type="dxa"/>
+          </w:tcPr>
+          <w:p>
+            <w:pPr>
+              <w:spacing w:before="40" w:after="40"/>
+            </w:pPr>
+            <w:r>
+              <w:rPr>
+                <w:b/>
+                <w:sz w:val="18"/>
+              </w:rPr>
+              <w:t xml:space="preserve">$106.5M total</w:t>
+            </w:r>
+            <w:r>
+              <w:rPr>
+                <w:sz w:val="18"/>
+              </w:rPr>
+              <w:t xml:space="preserve">; $50M Series D (2022), $30M Series C (2019, OMERS-led); spun out of AOL/Verizon in 2015 (</w:t>
+            </w:r>
+            <w:hyperlink r:id="rHl55">
+              <w:r>
+                <w:rPr>
+                  <w:rStyle w:val="Hyperlink"/>
+                  <w:sz w:val="18"/>
+                </w:rPr>
+                <w:t xml:space="preserve">TechCrunch</w:t>
+              </w:r>
+            </w:hyperlink>
+            <w:r>
+              <w:rPr>
+                <w:sz w:val="18"/>
+              </w:rPr>
+              <w:t xml:space="preserve">)</w:t>
+            </w:r>
+          </w:p>
+        </w:tc>
+        <w:tc>
+          <w:tcPr>
+            <w:tcW w:w="1680" w:type="dxa"/>
+          </w:tcPr>
+          <w:p>
+            <w:pPr>
+              <w:spacing w:before="40" w:after="40"/>
+            </w:pPr>
+            <w:r>
+              <w:rPr>
+                <w:sz w:val="18"/>
+              </w:rPr>
+              <w:t xml:space="preserve">Plan auto-upgraded $88 → $588/yr (Mar 2026); charged after cancelling in trial (Jul 2023); wrong industry classification / conflated companies (Sep 2026). </w:t>
+            </w:r>
+            <w:r>
+              <w:rPr>
+                <w:b/>
+                <w:sz w:val="18"/>
+              </w:rPr>
+              <w:t xml:space="preserve">Trustpilot 1.4★ across 51 reviews</w:t>
+            </w:r>
+          </w:p>
+        </w:tc>
+      </w:tr>
+      <w:tr>
+        <w:tc>
+          <w:tcPr>
+            <w:tcW w:w="1680" w:type="dxa"/>
+          </w:tcPr>
+          <w:p>
+            <w:pPr>
+              <w:spacing w:before="40" w:after="40"/>
+            </w:pPr>
+            <w:r>
+              <w:rPr>
+                <w:b/>
+                <w:sz w:val="18"/>
+              </w:rPr>
+              <w:t xml:space="preserve">PitchBook</w:t>
+            </w:r>
+          </w:p>
+        </w:tc>
+        <w:tc>
+          <w:tcPr>
+            <w:tcW w:w="1680" w:type="dxa"/>
+          </w:tcPr>
+          <w:p>
+            <w:pPr>
+              <w:spacing w:before="40" w:after="40"/>
+            </w:pPr>
+            <w:r>
+              <w:rPr>
+                <w:b/>
+                <w:sz w:val="18"/>
+              </w:rPr>
+              <w:t xml:space="preserve">Not published.</w:t>
+            </w:r>
+            <w:r>
+              <w:rPr>
+                <w:sz w:val="18"/>
+              </w:rPr>
+              <w:t xml:space="preserve"> Third-party reporting: </w:t>
+            </w:r>
+            <w:r>
+              <w:rPr>
+                <w:b/>
+                <w:sz w:val="18"/>
+              </w:rPr>
+              <w:t xml:space="preserve">~$15,000–$20,000/yr single seat</w:t>
+            </w:r>
+            <w:r>
+              <w:rPr>
+                <w:sz w:val="18"/>
+              </w:rPr>
+              <w:t xml:space="preserve">, ~$7,000 per additional seat, $8,000–$12,000/user at enterprise scale; overall range $12k–$70k+ — </w:t>
+            </w:r>
+            <w:hyperlink r:id="rHl56">
+              <w:r>
+                <w:rPr>
+                  <w:rStyle w:val="Hyperlink"/>
+                  <w:sz w:val="18"/>
+                </w:rPr>
+                <w:t xml:space="preserve">Vendr</w:t>
+              </w:r>
+            </w:hyperlink>
+            <w:r>
+              <w:rPr>
+                <w:sz w:val="18"/>
+              </w:rPr>
+              <w:t xml:space="preserve">, </w:t>
+            </w:r>
+            <w:hyperlink r:id="rHl57">
+              <w:r>
+                <w:rPr>
+                  <w:rStyle w:val="Hyperlink"/>
+                  <w:sz w:val="18"/>
+                </w:rPr>
+                <w:t xml:space="preserve">EasyVC</w:t>
+              </w:r>
+            </w:hyperlink>
+            <w:r>
+              <w:rPr>
+                <w:sz w:val="18"/>
+              </w:rPr>
+              <w:t xml:space="preserve"> </w:t>
+            </w:r>
+            <w:r>
+              <w:rPr>
+                <w:rFonts w:ascii="Consolas" w:hAnsi="Consolas"/>
+                <w:sz w:val="18"/>
+              </w:rPr>
+              <w:t xml:space="preserve">[secondary — PitchBook deliberately publishes nothing]</w:t>
+            </w:r>
+          </w:p>
+        </w:tc>
+        <w:tc>
+          <w:tcPr>
+            <w:tcW w:w="1680" w:type="dxa"/>
+          </w:tcPr>
+          <w:p>
+            <w:pPr>
+              <w:spacing w:before="40" w:after="40"/>
+            </w:pPr>
+            <w:r>
+              <w:rPr>
+                <w:sz w:val="18"/>
+              </w:rPr>
+              <w:t xml:space="preserve">1. Private-market company/fund/deal data 2. Benchmarks, comps, VC Exit Predictor 3. AI natural-language deal screening (added 2025)</w:t>
+            </w:r>
+          </w:p>
+        </w:tc>
+        <w:tc>
+          <w:tcPr>
+            <w:tcW w:w="1680" w:type="dxa"/>
+          </w:tcPr>
+          <w:p>
+            <w:pPr>
+              <w:spacing w:before="40" w:after="40"/>
+            </w:pPr>
+            <w:r>
+              <w:rPr>
+                <w:sz w:val="18"/>
+              </w:rPr>
+              <w:t xml:space="preserve">Institutional investors, bankers, advisors, corporates</w:t>
+            </w:r>
+          </w:p>
+        </w:tc>
+        <w:tc>
+          <w:tcPr>
+            <w:tcW w:w="1680" w:type="dxa"/>
+          </w:tcPr>
+          <w:p>
+            <w:pPr>
+              <w:spacing w:before="40" w:after="40"/>
+            </w:pPr>
+            <w:r>
+              <w:rPr>
+                <w:b/>
+                <w:sz w:val="18"/>
+              </w:rPr>
+              <w:t xml:space="preserve">Owned by Morningstar (NASDAQ: MORN)</w:t>
+            </w:r>
+            <w:r>
+              <w:rPr>
+                <w:sz w:val="18"/>
+              </w:rPr>
+              <w:t xml:space="preserve"> — acquired the remaining ~80% for </w:t>
+            </w:r>
+            <w:r>
+              <w:rPr>
+                <w:b/>
+                <w:sz w:val="18"/>
+              </w:rPr>
+              <w:t xml:space="preserve">~$180M at a $225M valuation</w:t>
+            </w:r>
+            <w:r>
+              <w:rPr>
+                <w:sz w:val="18"/>
+              </w:rPr>
+              <w:t xml:space="preserve">, Oct 2016 (</w:t>
+            </w:r>
+            <w:hyperlink r:id="rHl58">
+              <w:r>
+                <w:rPr>
+                  <w:rStyle w:val="Hyperlink"/>
+                  <w:sz w:val="18"/>
+                </w:rPr>
+                <w:t xml:space="preserve">Morningstar</w:t>
+              </w:r>
+            </w:hyperlink>
+            <w:r>
+              <w:rPr>
+                <w:sz w:val="18"/>
+              </w:rPr>
+              <w:t xml:space="preserve">)</w:t>
+            </w:r>
+          </w:p>
+        </w:tc>
+        <w:tc>
+          <w:tcPr>
+            <w:tcW w:w="1680" w:type="dxa"/>
+          </w:tcPr>
+          <w:p>
+            <w:pPr>
+              <w:spacing w:before="40" w:after="40"/>
+            </w:pPr>
+            <w:r>
+              <w:rPr>
+                <w:sz w:val="18"/>
+              </w:rPr>
+              <w:t xml:space="preserve">Data accuracy dismissed outright (Oct 2025); "free trial" advertised then denied by reps (Mar 2025); profiles maintained without consent / GDPR objections (Feb 2024). </w:t>
+            </w:r>
+            <w:r>
+              <w:rPr>
+                <w:b/>
+                <w:sz w:val="18"/>
+              </w:rPr>
+              <w:t xml:space="preserve">Trustpilot 1.7★, 87% one-star</w:t>
+            </w:r>
+          </w:p>
+        </w:tc>
+      </w:tr>
+      <w:tr>
+        <w:tc>
+          <w:tcPr>
+            <w:tcW w:w="1680" w:type="dxa"/>
+          </w:tcPr>
+          <w:p>
+            <w:pPr>
+              <w:spacing w:before="40" w:after="40"/>
+            </w:pPr>
+            <w:r>
+              <w:rPr>
+                <w:b/>
+                <w:sz w:val="18"/>
+              </w:rPr>
+              <w:t xml:space="preserve">Foundersuite</w:t>
+            </w:r>
+          </w:p>
+        </w:tc>
+        <w:tc>
+          <w:tcPr>
+            <w:tcW w:w="1680" w:type="dxa"/>
+          </w:tcPr>
+          <w:p>
+            <w:pPr>
+              <w:spacing w:before="40" w:after="40"/>
+            </w:pPr>
+            <w:r>
+              <w:rPr>
+                <w:b/>
+                <w:sz w:val="18"/>
+              </w:rPr>
+              <w:t xml:space="preserve">Published.</w:t>
+            </w:r>
+            <w:r>
+              <w:rPr>
+                <w:sz w:val="18"/>
+              </w:rPr>
+              <w:t xml:space="preserve"> Basic </w:t>
+            </w:r>
+            <w:r>
+              <w:rPr>
+                <w:b/>
+                <w:sz w:val="18"/>
+              </w:rPr>
+              <w:t xml:space="preserve">free</w:t>
+            </w:r>
+            <w:r>
+              <w:rPr>
+                <w:sz w:val="18"/>
+              </w:rPr>
+              <w:t xml:space="preserve"> (75 investors/pipeline); </w:t>
+            </w:r>
+            <w:r>
+              <w:rPr>
+                <w:b/>
+                <w:sz w:val="18"/>
+              </w:rPr>
+              <w:t xml:space="preserve">Silver $745/yr</w:t>
+            </w:r>
+            <w:r>
+              <w:rPr>
+                <w:sz w:val="18"/>
+              </w:rPr>
+              <w:t xml:space="preserve">; </w:t>
+            </w:r>
+            <w:r>
+              <w:rPr>
+                <w:b/>
+                <w:sz w:val="18"/>
+              </w:rPr>
+              <w:t xml:space="preserve">Gold $1,069/yr</w:t>
+            </w:r>
+            <w:r>
+              <w:rPr>
+                <w:sz w:val="18"/>
+              </w:rPr>
+              <w:t xml:space="preserve">; </w:t>
+            </w:r>
+            <w:r>
+              <w:rPr>
+                <w:b/>
+                <w:sz w:val="18"/>
+              </w:rPr>
+              <w:t xml:space="preserve">Platinum $1,609/yr</w:t>
+            </w:r>
+            <w:r>
+              <w:rPr>
+                <w:sz w:val="18"/>
+              </w:rPr>
+              <w:t xml:space="preserve">. All tiers include the full </w:t>
+            </w:r>
+            <w:r>
+              <w:rPr>
+                <w:b/>
+                <w:sz w:val="18"/>
+              </w:rPr>
+              <w:t xml:space="preserve">227,000-investor database with contact info</w:t>
+            </w:r>
+            <w:r>
+              <w:rPr>
+                <w:sz w:val="18"/>
+              </w:rPr>
+              <w:t xml:space="preserve"> — </w:t>
+            </w:r>
+            <w:hyperlink r:id="rHl59">
+              <w:r>
+                <w:rPr>
+                  <w:rStyle w:val="Hyperlink"/>
+                  <w:sz w:val="18"/>
+                </w:rPr>
+                <w:t xml:space="preserve">pricing page</w:t>
+              </w:r>
+            </w:hyperlink>
+          </w:p>
+        </w:tc>
+        <w:tc>
+          <w:tcPr>
+            <w:tcW w:w="1680" w:type="dxa"/>
+          </w:tcPr>
+          <w:p>
+            <w:pPr>
+              <w:spacing w:before="40" w:after="40"/>
+            </w:pPr>
+            <w:r>
+              <w:rPr>
+                <w:sz w:val="18"/>
+              </w:rPr>
+              <w:t xml:space="preserve">1. Investor database + CRM pipelines 2. Investor updates and deck hosting with view tracking 3. AI email generation, "Get Intro" warm-intro requests</w:t>
+            </w:r>
+          </w:p>
+        </w:tc>
+        <w:tc>
+          <w:tcPr>
+            <w:tcW w:w="1680" w:type="dxa"/>
+          </w:tcPr>
+          <w:p>
+            <w:pPr>
+              <w:spacing w:before="40" w:after="40"/>
+            </w:pPr>
+            <w:r>
+              <w:rPr>
+                <w:b/>
+                <w:sz w:val="18"/>
+              </w:rPr>
+              <w:t xml:space="preserve">Founders actively raising</w:t>
+            </w:r>
+            <w:r>
+              <w:rPr>
+                <w:sz w:val="18"/>
+              </w:rPr>
+              <w:t xml:space="preserve"> — the only investor-side tool in this set priced for founders</w:t>
+            </w:r>
+          </w:p>
+        </w:tc>
+        <w:tc>
+          <w:tcPr>
+            <w:tcW w:w="1680" w:type="dxa"/>
+          </w:tcPr>
+          <w:p>
+            <w:pPr>
+              <w:spacing w:before="40" w:after="40"/>
+            </w:pPr>
+            <w:r>
+              <w:rPr>
+                <w:sz w:val="18"/>
+              </w:rPr>
+              <w:t xml:space="preserve">Founded 2015, San Francisco; last round reported </w:t>
+            </w:r>
+            <w:r>
+              <w:rPr>
+                <w:b/>
+                <w:sz w:val="18"/>
+              </w:rPr>
+              <w:t xml:space="preserve">$13M, Sept 30 2024</w:t>
+            </w:r>
+            <w:r>
+              <w:rPr>
+                <w:sz w:val="18"/>
+              </w:rPr>
+              <w:t xml:space="preserve"> </w:t>
+            </w:r>
+            <w:r>
+              <w:rPr>
+                <w:rFonts w:ascii="Consolas" w:hAnsi="Consolas"/>
+                <w:sz w:val="18"/>
+              </w:rPr>
+              <w:t xml:space="preserve">[UNVERIFIED — aggregator profile; unusually large for this company, treat with suspicion]</w:t>
+            </w:r>
+          </w:p>
+        </w:tc>
+        <w:tc>
+          <w:tcPr>
+            <w:tcW w:w="1680" w:type="dxa"/>
+          </w:tcPr>
+          <w:p>
+            <w:pPr>
+              <w:spacing w:before="40" w:after="40"/>
+            </w:pPr>
+            <w:r>
+              <w:rPr>
+                <w:sz w:val="18"/>
+              </w:rPr>
+              <w:t xml:space="preserve">Incomplete data when searching for investors; can't send email from inside the system; "clunky and overpriced for early stage"; no cap table</w:t>
+            </w:r>
+          </w:p>
+        </w:tc>
+      </w:tr>
+    </w:tbl>
+    <w:p>
+      <w:pPr>
+        <w:spacing w:after="0"/>
+      </w:pPr>
+    </w:p>
+    <w:p>
+      <w:pPr>
+        <w:pStyle w:val="Heading2"/>
+      </w:pPr>
+      <w:r>
+        <w:t xml:space="preserve">Review bases, for calibration</w:t>
+      </w:r>
+    </w:p>
+    <w:tbl>
+      <w:tblPr>
+        <w:tblW w:w="10080" w:type="dxa"/>
+        <w:tblBorders>
+          <w:top w:val="single" w:sz="4" w:space="0" w:color="C9CCD1"/>
+          <w:left w:val="single" w:sz="4" w:space="0" w:color="C9CCD1"/>
+          <w:bottom w:val="single" w:sz="4" w:space="0" w:color="C9CCD1"/>
+          <w:right w:val="single" w:sz="4" w:space="0" w:color="C9CCD1"/>
+          <w:insideH w:val="single" w:sz="4" w:space="0" w:color="C9CCD1"/>
+          <w:insideV w:val="single" w:sz="4" w:space="0" w:color="C9CCD1"/>
+        </w:tblBorders>
+        <w:tblLayout w:type="fixed"/>
+      </w:tblPr>
+      <w:tblGrid>
+        <w:gridCol w:w="2520"/>
+        <w:gridCol w:w="2520"/>
+        <w:gridCol w:w="2520"/>
+        <w:gridCol w:w="2520"/>
+      </w:tblGrid>
+      <w:tr>
+        <w:trPr>
+          <w:tblHeader/>
+        </w:trPr>
+        <w:tc>
+          <w:tcPr>
+            <w:tcW w:w="2520" w:type="dxa"/>
+            <w:shd w:val="clear" w:color="auto" w:fill="EFF1F3"/>
+          </w:tcPr>
+          <w:p>
+            <w:pPr>
+              <w:spacing w:before="40" w:after="40"/>
+            </w:pPr>
+            <w:r>
+              <w:rPr>
+                <w:b/>
+                <w:sz w:val="18"/>
+              </w:rPr>
+              <w:t xml:space="preserve">Platform</w:t>
+            </w:r>
+          </w:p>
+        </w:tc>
+        <w:tc>
+          <w:tcPr>
+            <w:tcW w:w="2520" w:type="dxa"/>
+            <w:shd w:val="clear" w:color="auto" w:fill="EFF1F3"/>
+          </w:tcPr>
+          <w:p>
+            <w:pPr>
+              <w:spacing w:before="40" w:after="40"/>
+            </w:pPr>
+            <w:r>
+              <w:rPr>
+                <w:b/>
+                <w:sz w:val="18"/>
+              </w:rPr>
+              <w:t xml:space="preserve">Trustpilot</w:t>
+            </w:r>
+          </w:p>
+        </w:tc>
+        <w:tc>
+          <w:tcPr>
+            <w:tcW w:w="2520" w:type="dxa"/>
+            <w:shd w:val="clear" w:color="auto" w:fill="EFF1F3"/>
+          </w:tcPr>
+          <w:p>
+            <w:pPr>
+              <w:spacing w:before="40" w:after="40"/>
+            </w:pPr>
+            <w:r>
+              <w:rPr>
+                <w:b/>
+                <w:sz w:val="18"/>
+              </w:rPr>
+              <w:t xml:space="preserve">Capterra</w:t>
+            </w:r>
+          </w:p>
+        </w:tc>
+        <w:tc>
+          <w:tcPr>
+            <w:tcW w:w="2520" w:type="dxa"/>
+            <w:shd w:val="clear" w:color="auto" w:fill="EFF1F3"/>
+          </w:tcPr>
+          <w:p>
+            <w:pPr>
+              <w:spacing w:before="40" w:after="40"/>
+            </w:pPr>
+            <w:r>
+              <w:rPr>
+                <w:b/>
+                <w:sz w:val="18"/>
+              </w:rPr>
+              <w:t xml:space="preserve">Note</w:t>
+            </w:r>
+          </w:p>
+        </w:tc>
+      </w:tr>
+      <w:tr>
+        <w:tc>
+          <w:tcPr>
+            <w:tcW w:w="2520" w:type="dxa"/>
+          </w:tcPr>
+          <w:p>
+            <w:pPr>
+              <w:spacing w:before="40" w:after="40"/>
+            </w:pPr>
+            <w:r>
+              <w:rPr>
+                <w:sz w:val="18"/>
+              </w:rPr>
+              <w:t xml:space="preserve">Crunchbase</w:t>
+            </w:r>
+          </w:p>
+        </w:tc>
+        <w:tc>
+          <w:tcPr>
+            <w:tcW w:w="2520" w:type="dxa"/>
+          </w:tcPr>
+          <w:p>
+            <w:pPr>
+              <w:spacing w:before="40" w:after="40"/>
+            </w:pPr>
+            <w:r>
+              <w:rPr>
+                <w:b/>
+                <w:sz w:val="18"/>
+              </w:rPr>
+              <w:t xml:space="preserve">1.4★ / 51</w:t>
+            </w:r>
+          </w:p>
+        </w:tc>
+        <w:tc>
+          <w:tcPr>
+            <w:tcW w:w="2520" w:type="dxa"/>
+          </w:tcPr>
+          <w:p>
+            <w:pPr>
+              <w:spacing w:before="40" w:after="40"/>
+            </w:pPr>
+            <w:r>
+              <w:rPr>
+                <w:sz w:val="18"/>
+              </w:rPr>
+              <w:t xml:space="preserve">—</w:t>
+            </w:r>
+          </w:p>
+        </w:tc>
+        <w:tc>
+          <w:tcPr>
+            <w:tcW w:w="2520" w:type="dxa"/>
+          </w:tcPr>
+          <w:p>
+            <w:pPr>
+              <w:spacing w:before="40" w:after="40"/>
+            </w:pPr>
+            <w:r>
+              <w:rPr>
+                <w:sz w:val="18"/>
+              </w:rPr>
+              <w:t xml:space="preserve">88% one-star in past 12 months</w:t>
+            </w:r>
+          </w:p>
+        </w:tc>
+      </w:tr>
+      <w:tr>
+        <w:tc>
+          <w:tcPr>
+            <w:tcW w:w="2520" w:type="dxa"/>
+          </w:tcPr>
+          <w:p>
+            <w:pPr>
+              <w:spacing w:before="40" w:after="40"/>
+            </w:pPr>
+            <w:r>
+              <w:rPr>
+                <w:sz w:val="18"/>
+              </w:rPr>
+              <w:t xml:space="preserve">PitchBook</w:t>
+            </w:r>
+          </w:p>
+        </w:tc>
+        <w:tc>
+          <w:tcPr>
+            <w:tcW w:w="2520" w:type="dxa"/>
+          </w:tcPr>
+          <w:p>
+            <w:pPr>
+              <w:spacing w:before="40" w:after="40"/>
+            </w:pPr>
+            <w:r>
+              <w:rPr>
+                <w:b/>
+                <w:sz w:val="18"/>
+              </w:rPr>
+              <w:t xml:space="preserve">1.7★ / 23</w:t>
+            </w:r>
+          </w:p>
+        </w:tc>
+        <w:tc>
+          <w:tcPr>
+            <w:tcW w:w="2520" w:type="dxa"/>
+          </w:tcPr>
+          <w:p>
+            <w:pPr>
+              <w:spacing w:before="40" w:after="40"/>
+            </w:pPr>
+            <w:r>
+              <w:rPr>
+                <w:sz w:val="18"/>
+              </w:rPr>
+              <w:t xml:space="preserve">—</w:t>
+            </w:r>
+          </w:p>
+        </w:tc>
+        <w:tc>
+          <w:tcPr>
+            <w:tcW w:w="2520" w:type="dxa"/>
+          </w:tcPr>
+          <w:p>
+            <w:pPr>
+              <w:spacing w:before="40" w:after="40"/>
+            </w:pPr>
+            <w:r>
+              <w:rPr>
+                <w:sz w:val="18"/>
+              </w:rPr>
+              <w:t xml:space="preserve">87% one-star</w:t>
+            </w:r>
+          </w:p>
+        </w:tc>
+      </w:tr>
+      <w:tr>
+        <w:tc>
+          <w:tcPr>
+            <w:tcW w:w="2520" w:type="dxa"/>
+          </w:tcPr>
+          <w:p>
+            <w:pPr>
+              <w:spacing w:before="40" w:after="40"/>
+            </w:pPr>
+            <w:r>
+              <w:rPr>
+                <w:sz w:val="18"/>
+              </w:rPr>
+              <w:t xml:space="preserve">Carta</w:t>
+            </w:r>
+          </w:p>
+        </w:tc>
+        <w:tc>
+          <w:tcPr>
+            <w:tcW w:w="2520" w:type="dxa"/>
+          </w:tcPr>
+          <w:p>
+            <w:pPr>
+              <w:spacing w:before="40" w:after="40"/>
+            </w:pPr>
+            <w:r>
+              <w:rPr>
+                <w:b/>
+                <w:sz w:val="18"/>
+              </w:rPr>
+              <w:t xml:space="preserve">2.1★ / 18</w:t>
+            </w:r>
+          </w:p>
+        </w:tc>
+        <w:tc>
+          <w:tcPr>
+            <w:tcW w:w="2520" w:type="dxa"/>
+          </w:tcPr>
+          <w:p>
+            <w:pPr>
+              <w:spacing w:before="40" w:after="40"/>
+            </w:pPr>
+            <w:r>
+              <w:rPr>
+                <w:sz w:val="18"/>
+              </w:rPr>
+              <w:t xml:space="preserve">4.2★ / 65</w:t>
+            </w:r>
+          </w:p>
+        </w:tc>
+        <w:tc>
+          <w:tcPr>
+            <w:tcW w:w="2520" w:type="dxa"/>
+          </w:tcPr>
+          <w:p>
+            <w:pPr>
+              <w:spacing w:before="40" w:after="40"/>
+            </w:pPr>
+            <w:r>
+              <w:rPr>
+                <w:sz w:val="18"/>
+              </w:rPr>
+              <w:t xml:space="preserve">App Store 4.8★ / 9,461 (employee-facing app)</w:t>
+            </w:r>
+          </w:p>
+        </w:tc>
+      </w:tr>
+      <w:tr>
+        <w:tc>
+          <w:tcPr>
+            <w:tcW w:w="2520" w:type="dxa"/>
+          </w:tcPr>
+          <w:p>
+            <w:pPr>
+              <w:spacing w:before="40" w:after="40"/>
+            </w:pPr>
+            <w:r>
+              <w:rPr>
+                <w:sz w:val="18"/>
+              </w:rPr>
+              <w:t xml:space="preserve">Equidam</w:t>
+            </w:r>
+          </w:p>
+        </w:tc>
+        <w:tc>
+          <w:tcPr>
+            <w:tcW w:w="2520" w:type="dxa"/>
+          </w:tcPr>
+          <w:p>
+            <w:pPr>
+              <w:spacing w:before="40" w:after="40"/>
+            </w:pPr>
+            <w:r>
+              <w:rPr>
+                <w:b/>
+                <w:sz w:val="18"/>
+              </w:rPr>
+              <w:t xml:space="preserve">4.5★ / 15</w:t>
+            </w:r>
+          </w:p>
+        </w:tc>
+        <w:tc>
+          <w:tcPr>
+            <w:tcW w:w="2520" w:type="dxa"/>
+          </w:tcPr>
+          <w:p>
+            <w:pPr>
+              <w:spacing w:before="40" w:after="40"/>
+            </w:pPr>
+            <w:r>
+              <w:rPr>
+                <w:sz w:val="18"/>
+              </w:rPr>
+              <w:t xml:space="preserve">—</w:t>
+            </w:r>
+          </w:p>
+        </w:tc>
+        <w:tc>
+          <w:tcPr>
+            <w:tcW w:w="2520" w:type="dxa"/>
+          </w:tcPr>
+          <w:p>
+            <w:pPr>
+              <w:spacing w:before="40" w:after="40"/>
+            </w:pPr>
+            <w:r>
+              <w:rPr>
+                <w:sz w:val="18"/>
+              </w:rPr>
+              <w:t xml:space="preserve">Only 2 reviews in past 12 months</w:t>
+            </w:r>
+          </w:p>
+        </w:tc>
+      </w:tr>
+      <w:tr>
+        <w:tc>
+          <w:tcPr>
+            <w:tcW w:w="2520" w:type="dxa"/>
+          </w:tcPr>
+          <w:p>
+            <w:pPr>
+              <w:spacing w:before="40" w:after="40"/>
+            </w:pPr>
+            <w:r>
+              <w:rPr>
+                <w:sz w:val="18"/>
+              </w:rPr>
+              <w:t xml:space="preserve">Eqvista</w:t>
+            </w:r>
+          </w:p>
+        </w:tc>
+        <w:tc>
+          <w:tcPr>
+            <w:tcW w:w="2520" w:type="dxa"/>
+          </w:tcPr>
+          <w:p>
+            <w:pPr>
+              <w:spacing w:before="40" w:after="40"/>
+            </w:pPr>
+            <w:r>
+              <w:rPr>
+                <w:sz w:val="18"/>
+              </w:rPr>
+              <w:t xml:space="preserve">4.0★ / 3</w:t>
+            </w:r>
+          </w:p>
+        </w:tc>
+        <w:tc>
+          <w:tcPr>
+            <w:tcW w:w="2520" w:type="dxa"/>
+          </w:tcPr>
+          <w:p>
+            <w:pPr>
+              <w:spacing w:before="40" w:after="40"/>
+            </w:pPr>
+            <w:r>
+              <w:rPr>
+                <w:b/>
+                <w:sz w:val="18"/>
+              </w:rPr>
+              <w:t xml:space="preserve">4.9★ / 31</w:t>
+            </w:r>
+          </w:p>
+        </w:tc>
+        <w:tc>
+          <w:tcPr>
+            <w:tcW w:w="2520" w:type="dxa"/>
+          </w:tcPr>
+          <w:p>
+            <w:pPr>
+              <w:spacing w:before="40" w:after="40"/>
+            </w:pPr>
+            <w:r>
+              <w:rPr>
+                <w:sz w:val="18"/>
+              </w:rPr>
+              <w:t xml:space="preserve">Tiny sample</w:t>
+            </w:r>
+          </w:p>
+        </w:tc>
+      </w:tr>
+      <w:tr>
+        <w:tc>
+          <w:tcPr>
+            <w:tcW w:w="2520" w:type="dxa"/>
+          </w:tcPr>
+          <w:p>
+            <w:pPr>
+              <w:spacing w:before="40" w:after="40"/>
+            </w:pPr>
+            <w:r>
+              <w:rPr>
+                <w:sz w:val="18"/>
+              </w:rPr>
+              <w:t xml:space="preserve">Valutico</w:t>
+            </w:r>
+          </w:p>
+        </w:tc>
+        <w:tc>
+          <w:tcPr>
+            <w:tcW w:w="2520" w:type="dxa"/>
+          </w:tcPr>
+          <w:p>
+            <w:pPr>
+              <w:spacing w:before="40" w:after="40"/>
+            </w:pPr>
+            <w:r>
+              <w:rPr>
+                <w:sz w:val="18"/>
+              </w:rPr>
+              <w:t xml:space="preserve">—</w:t>
+            </w:r>
+          </w:p>
+        </w:tc>
+        <w:tc>
+          <w:tcPr>
+            <w:tcW w:w="2520" w:type="dxa"/>
+          </w:tcPr>
+          <w:p>
+            <w:pPr>
+              <w:spacing w:before="40" w:after="40"/>
+            </w:pPr>
+            <w:r>
+              <w:rPr>
+                <w:b/>
+                <w:sz w:val="18"/>
+              </w:rPr>
+              <w:t xml:space="preserve">4.4★ / 38</w:t>
+            </w:r>
+          </w:p>
+        </w:tc>
+        <w:tc>
+          <w:tcPr>
+            <w:tcW w:w="2520" w:type="dxa"/>
+          </w:tcPr>
+          <w:p>
+            <w:pPr>
+              <w:spacing w:before="40" w:after="40"/>
+            </w:pPr>
+            <w:r>
+              <w:rPr>
+                <w:sz w:val="18"/>
+              </w:rPr>
+              <w:t xml:space="preserve">Advisor-heavy reviewer base</w:t>
+            </w:r>
+          </w:p>
+        </w:tc>
+      </w:tr>
+      <w:tr>
+        <w:tc>
+          <w:tcPr>
+            <w:tcW w:w="2520" w:type="dxa"/>
+          </w:tcPr>
+          <w:p>
+            <w:pPr>
+              <w:spacing w:before="40" w:after="40"/>
+            </w:pPr>
+            <w:r>
+              <w:rPr>
+                <w:sz w:val="18"/>
+              </w:rPr>
+              <w:t xml:space="preserve">Foundersuite</w:t>
+            </w:r>
+          </w:p>
+        </w:tc>
+        <w:tc>
+          <w:tcPr>
+            <w:tcW w:w="2520" w:type="dxa"/>
+          </w:tcPr>
+          <w:p>
+            <w:pPr>
+              <w:spacing w:before="40" w:after="40"/>
+            </w:pPr>
+            <w:r>
+              <w:rPr>
+                <w:sz w:val="18"/>
+              </w:rPr>
+              <w:t xml:space="preserve">—</w:t>
+            </w:r>
+          </w:p>
+        </w:tc>
+        <w:tc>
+          <w:tcPr>
+            <w:tcW w:w="2520" w:type="dxa"/>
+          </w:tcPr>
+          <w:p>
+            <w:pPr>
+              <w:spacing w:before="40" w:after="40"/>
+            </w:pPr>
+            <w:r>
+              <w:rPr>
+                <w:b/>
+                <w:sz w:val="18"/>
+              </w:rPr>
+              <w:t xml:space="preserve">4.7★ / 110</w:t>
+            </w:r>
+          </w:p>
+        </w:tc>
+        <w:tc>
+          <w:tcPr>
+            <w:tcW w:w="2520" w:type="dxa"/>
+          </w:tcPr>
+          <w:p>
+            <w:pPr>
+              <w:spacing w:before="40" w:after="40"/>
+            </w:pPr>
+            <w:r>
+              <w:rPr>
+                <w:sz w:val="18"/>
+              </w:rPr>
+              <w:t xml:space="preserve">Largest founder-side sample here</w:t>
+            </w:r>
+          </w:p>
+        </w:tc>
+      </w:tr>
+    </w:tbl>
+    <w:p>
+      <w:pPr>
+        <w:spacing w:after="0"/>
+      </w:pPr>
+    </w:p>
+    <w:p>
+      <w:r>
+        <w:rPr>
+          <w:b/>
+        </w:rPr>
+        <w:t xml:space="preserve">The pattern is stark:</w:t>
+      </w:r>
+      <w:r>
+        <w:t xml:space="preserve"> the two big *data* platforms are rated ~1.5★ by the public; the small *valuation* tools are rated 4.4–4.9★ by tiny samples. High ratings on 15–38 reviews are not evidence of quality — they're evidence of low usage.</w:t>
+      </w:r>
+    </w:p>
+    <w:p>
+      <w:pPr>
+        <w:pBdr>
+          <w:bottom w:val="single" w:sz="6" w:space="6" w:color="C9CCD1"/>
+        </w:pBdr>
+      </w:pPr>
+    </w:p>
+    <w:p>
+      <w:pPr>
+        <w:pStyle w:val="Heading1"/>
+      </w:pPr>
+      <w:r>
+        <w:t xml:space="preserve">Per-platform notes</w:t>
+      </w:r>
+    </w:p>
+    <w:p>
+      <w:pPr>
+        <w:pStyle w:val="Heading2"/>
+      </w:pPr>
+      <w:r>
+        <w:t xml:space="preserve">Carta — the default, and the most expensive to leave</w:t>
+      </w:r>
+    </w:p>
+    <w:p>
+      <w:r>
+        <w:t xml:space="preserve">Carta is an equity *administration* system that sells valuations as an attached service, not a valuation product. Its free Launch tier (≤25 stakeholders, ≤$1M raised) is a deliberate funnel: the moment you raise a real round, you're into contact-sales pricing that reviewers describe in the thousands. It is also the only platform here that is an SEC-registered transfer agent — a genuine moat that has nothing to do with valuation quality.</w:t>
+      </w:r>
+    </w:p>
+    <w:p>
+      <w:pPr>
+        <w:pStyle w:val="Heading2"/>
+      </w:pPr>
+      <w:r>
+        <w:t xml:space="preserve">Equidam — the closest thing to this project that already exists</w:t>
+      </w:r>
+    </w:p>
+    <w:p>
+      <w:r>
+        <w:t xml:space="preserve">Five-method valuation, founder-facing, published prices, free tier, benchmark data, and a $1,990 409A option. </w:t>
+      </w:r>
+      <w:r>
+        <w:rPr>
+          <w:b/>
+        </w:rPr>
+        <w:t xml:space="preserve">If you build a founder-facing valuation app, this is your direct competitor</w:t>
+      </w:r>
+      <w:r>
+        <w:t xml:space="preserve"> — and its review base (15 lifetime, 2 in the past year) says almost nobody is using it. That is either the opening or the warning, and the same ambiguity flagged in Section 2. </w:t>
+      </w:r>
+      <w:r>
+        <w:rPr>
+          <w:rFonts w:ascii="Consolas" w:hAnsi="Consolas"/>
+        </w:rPr>
+        <w:t xml:space="preserve">[UNVERIFIED: no usage data beyond their marketing claim of 140,000+ founders served]</w:t>
+      </w:r>
+    </w:p>
+    <w:p>
+      <w:pPr>
+        <w:pStyle w:val="Heading2"/>
+      </w:pPr>
+      <w:r>
+        <w:t xml:space="preserve">Valutico — proof the professional tier is a different market</w:t>
+      </w:r>
+    </w:p>
+    <w:p>
+      <w:r>
+        <w:t xml:space="preserve">28 techniques, a serious comps database, quote-only pricing, and a reviewer base of bankers and valuation analysts. A 5★ reviewer states plainly it suits larger enterprises rather than small business. </w:t>
+      </w:r>
+      <w:r>
+        <w:rPr>
+          <w:b/>
+        </w:rPr>
+        <w:t xml:space="preserve">Not a competitor for founders — a reminder that the good comps data lives where founders can't afford it.</w:t>
+      </w:r>
+    </w:p>
+    <w:p>
+      <w:pPr>
+        <w:pStyle w:val="Heading2"/>
+      </w:pPr>
+      <w:r>
+        <w:t xml:space="preserve">Eqvista — the price floor for compliance</w:t>
+      </w:r>
+    </w:p>
+    <w:p>
+      <w:r>
+        <w:t xml:space="preserve">$990/yr for a pre-revenue 409A *with unlimited updates and a cap table* is the number that any valuation-adjacent product has to beat or route around. It also shows where the category is heading: valuation as a subscription commodity, not a per-report engagement.</w:t>
+      </w:r>
+    </w:p>
+    <w:p>
+      <w:pPr>
+        <w:pStyle w:val="Heading2"/>
+      </w:pPr>
+      <w:r>
+        <w:t xml:space="preserve">Crunchbase — has already shipped the investor-matching half</w:t>
+      </w:r>
+    </w:p>
+    <w:p>
+      <w:r>
+        <w:t xml:space="preserve">Ranked investor matches off predictive funding signals, $588/yr, free tier for discovery. The product risk for this project is not that matching is hard — it's that a $588/yr incumbent with 4M company profiles already does it. The opening is their reputation: </w:t>
+      </w:r>
+      <w:r>
+        <w:rPr>
+          <w:b/>
+        </w:rPr>
+        <w:t xml:space="preserve">1.4★, with billing and data-accuracy complaints dominating.</w:t>
+      </w:r>
+    </w:p>
+    <w:p>
+      <w:pPr>
+        <w:pStyle w:val="Heading2"/>
+      </w:pPr>
+      <w:r>
+        <w:t xml:space="preserve">PitchBook — the data everyone wants, at a price founders won't pay</w:t>
+      </w:r>
+    </w:p>
+    <w:p>
+      <w:r>
+        <w:t xml:space="preserve">$15k–$20k for a seat, owned by a public company, no published price, 1.7★ public reputation. Founders are not customers and will never be. </w:t>
+      </w:r>
+      <w:r>
+        <w:rPr>
+          <w:b/>
+        </w:rPr>
+        <w:t xml:space="preserve">Any product that gives founders defensible comps at a founder price is competing with PitchBook's data, not its business model.</w:t>
+      </w:r>
+    </w:p>
+    <w:p>
+      <w:pPr>
+        <w:pStyle w:val="Heading2"/>
+      </w:pPr>
+      <w:r>
+        <w:t xml:space="preserve">Foundersuite — the one built for the founder, and the one with real reviews</w:t>
+      </w:r>
+    </w:p>
+    <w:p>
+      <w:r>
+        <w:t xml:space="preserve">$745–$1,609/yr, 227,000 investors, free tier, 110 Capterra reviews at 4.7★. Its gaps are precise and documented: </w:t>
+      </w:r>
+      <w:r>
+        <w:rPr>
+          <w:b/>
+        </w:rPr>
+        <w:t xml:space="preserve">incomplete investor data, no cap table, no valuation.</w:t>
+      </w:r>
+    </w:p>
+    <w:p>
+      <w:pPr>
+        <w:pBdr>
+          <w:bottom w:val="single" w:sz="6" w:space="6" w:color="C9CCD1"/>
+        </w:pBdr>
+      </w:pPr>
+    </w:p>
+    <w:p>
+      <w:pPr>
+        <w:pStyle w:val="Heading1"/>
+      </w:pPr>
+      <w:r>
+        <w:t xml:space="preserve">What does nobody serve well?</w:t>
+      </w:r>
+    </w:p>
+    <w:p>
+      <w:r>
+        <w:rPr>
+          <w:b/>
+        </w:rPr>
+        <w:t xml:space="preserve">1. The negotiation number.</w:t>
+      </w:r>
+      <w:r>
+        <w:t xml:space="preserve"> Every platform here produces either a *compliance* number (409A — Carta, Eqvista, Equidam's $1,990 tier) or a *professional* number (Valutico, for advisors valuing someone else's company). </w:t>
+      </w:r>
+      <w:r>
+        <w:rPr>
+          <w:b/>
+        </w:rPr>
+        <w:t xml:space="preserve">Nobody produces the number a founder argues for in a room</w:t>
+      </w:r>
+      <w:r>
+        <w:t xml:space="preserve"> — the pre-money they should ask for, with comparables attached, at their stage, sector and geography. The 409A is deliberately lower than the preferred-share price; handing a founder their 409A as "your valuation" is actively misleading.</w:t>
+      </w:r>
+    </w:p>
+    <w:p>
+      <w:r>
+        <w:rPr>
+          <w:b/>
+        </w:rPr>
+        <w:t xml:space="preserve">2. Valuation joined to investor targeting.</w:t>
+      </w:r>
+      <w:r>
+        <w:t xml:space="preserve"> Carta and Eqvista know your equity and nothing about investors. Crunchbase and PitchBook know investors and nothing about you. Foundersuite has the investors but </w:t>
+      </w:r>
+      <w:r>
+        <w:rPr>
+          <w:b/>
+        </w:rPr>
+        <w:t xml:space="preserve">no cap table and no valuation</w:t>
+      </w:r>
+      <w:r>
+        <w:t xml:space="preserve"> — its own reviewers say so. </w:t>
+      </w:r>
+      <w:r>
+        <w:rPr>
+          <w:b/>
+        </w:rPr>
+        <w:t xml:space="preserve">No product in this set answers "here's what you're worth, here's who funds companies worth that, at your stage, in your sector."</w:t>
+      </w:r>
+      <w:r>
+        <w:t xml:space="preserve"> That specific join is empty.</w:t>
+      </w:r>
+    </w:p>
+    <w:p>
+      <w:r>
+        <w:rPr>
+          <w:b/>
+        </w:rPr>
+        <w:t xml:space="preserve">3. Continuous valuation.</w:t>
+      </w:r>
+      <w:r>
+        <w:t xml:space="preserve"> Everything here is point-in-time: a 409A is annual, Equidam runs a 12-month valuation cycle, Valutico is engagement-based. </w:t>
+      </w:r>
+      <w:r>
+        <w:rPr>
+          <w:b/>
+        </w:rPr>
+        <w:t xml:space="preserve">Nobody answers "what am I worth today?" continuously as revenue, headcount and the market move</w:t>
+      </w:r>
+      <w:r>
+        <w:t xml:space="preserve"> — which is precisely what the project proposes.</w:t>
+      </w:r>
+    </w:p>
+    <w:p>
+      <w:r>
+        <w:rPr>
+          <w:b/>
+        </w:rPr>
+        <w:t xml:space="preserve">4. The pre-institutional founder.</w:t>
+      </w:r>
+      <w:r>
+        <w:t xml:space="preserve"> Carta's free tier caps at $1M raised. PitchBook starts at $15,000. Valutico is built for enterprises. Crunchbase is sold to salespeople. </w:t>
+      </w:r>
+      <w:r>
+        <w:rPr>
+          <w:b/>
+        </w:rPr>
+        <w:t xml:space="preserve">The 40,000 annual Shark Tank applicants, the 1.7M high-propensity new businesses, and the founders raising their first $250k have no product in this comparison built for them</w:t>
+      </w:r>
+      <w:r>
+        <w:t xml:space="preserve"> — they have spreadsheets.</w:t>
+      </w:r>
+    </w:p>
+    <w:p>
+      <w:r>
+        <w:rPr>
+          <w:b/>
+        </w:rPr>
+        <w:t xml:space="preserve">5. Published outcomes.</w:t>
+      </w:r>
+      <w:r>
+        <w:t xml:space="preserve"> Not one of these platforms publishes how many of its users actually raised money. Section 2 showed that's exactly the grievance that turns paying users hostile ("I applied to 60 programs and got nothing").</w:t>
+      </w:r>
+    </w:p>
+    <w:p>
+      <w:r>
+        <w:rPr>
+          <w:b/>
+        </w:rPr>
+        <w:t xml:space="preserve">6. Honest pricing.</w:t>
+      </w:r>
+      <w:r>
+        <w:t xml:space="preserve"> </w:t>
+      </w:r>
+      <w:r>
+        <w:rPr>
+          <w:b/>
+        </w:rPr>
+        <w:t xml:space="preserve">Three of seven don't publish a price at all</w:t>
+      </w:r>
+      <w:r>
+        <w:t xml:space="preserve">, and the two that dominate the category are rated 1.4★ and 1.7★ largely over billing conduct. In a market this opaque, a published price is a product feature.</w:t>
+      </w:r>
+    </w:p>
+    <w:p>
+      <w:r>
+        <w:rPr>
+          <w:b/>
+        </w:rPr>
+        <w:t xml:space="preserve">7. Non-equity capital paths.</w:t>
+      </w:r>
+      <w:r>
+        <w:t xml:space="preserve"> All seven assume a priced equity round. None routes a founder toward revenue-based financing, grants, SBA lending or crowdfunding when that's the better fit — even though most of the 5.67M annual business applicants will never be VC-fundable.</w:t>
+      </w:r>
+    </w:p>
+    <w:p>
+      <w:pPr>
+        <w:pStyle w:val="Heading2"/>
+      </w:pPr>
+      <w:r>
+        <w:t xml:space="preserve">The sharpest wedge</w:t>
+      </w:r>
+    </w:p>
+    <w:p>
+      <w:r>
+        <w:rPr>
+          <w:b/>
+        </w:rPr>
+        <w:t xml:space="preserve">Continuous, defensible, founder-facing valuation joined to ranked investor targeting, at a published price under $1,000/year, for companies below the institutional threshold.</w:t>
+      </w:r>
+      <w:r>
+        <w:t xml:space="preserve"> Every element of that sentence is empty in the table above. The two hard parts are comparables data (PitchBook's moat) and proving outcomes (nobody's doing it, and it's what users punish you for).</w:t>
+      </w:r>
+    </w:p>
+    <w:p>
+      <w:pPr>
+        <w:pBdr>
+          <w:bottom w:val="single" w:sz="6" w:space="6" w:color="C9CCD1"/>
+        </w:pBdr>
+      </w:pPr>
+    </w:p>
+    <w:p>
+      <w:pPr>
+        <w:pStyle w:val="Heading1"/>
+      </w:pPr>
+      <w:r>
+        <w:t xml:space="preserve">Flags</w:t>
+      </w:r>
+    </w:p>
+    <w:tbl>
+      <w:tblPr>
+        <w:tblW w:w="10080" w:type="dxa"/>
+        <w:tblBorders>
+          <w:top w:val="single" w:sz="4" w:space="0" w:color="C9CCD1"/>
+          <w:left w:val="single" w:sz="4" w:space="0" w:color="C9CCD1"/>
+          <w:bottom w:val="single" w:sz="4" w:space="0" w:color="C9CCD1"/>
+          <w:right w:val="single" w:sz="4" w:space="0" w:color="C9CCD1"/>
+          <w:insideH w:val="single" w:sz="4" w:space="0" w:color="C9CCD1"/>
+          <w:insideV w:val="single" w:sz="4" w:space="0" w:color="C9CCD1"/>
+        </w:tblBorders>
+        <w:tblLayout w:type="fixed"/>
+      </w:tblPr>
+      <w:tblGrid>
+        <w:gridCol w:w="5040"/>
+        <w:gridCol w:w="5040"/>
+      </w:tblGrid>
+      <w:tr>
+        <w:trPr>
+          <w:tblHeader/>
+        </w:trPr>
+        <w:tc>
+          <w:tcPr>
+            <w:tcW w:w="5040" w:type="dxa"/>
+            <w:shd w:val="clear" w:color="auto" w:fill="EFF1F3"/>
+          </w:tcPr>
+          <w:p>
+            <w:pPr>
+              <w:spacing w:before="40" w:after="40"/>
+            </w:pPr>
+            <w:r>
+              <w:rPr>
+                <w:b/>
+                <w:sz w:val="18"/>
+              </w:rPr>
+              <w:t xml:space="preserve">Item</w:t>
+            </w:r>
+          </w:p>
+        </w:tc>
+        <w:tc>
+          <w:tcPr>
+            <w:tcW w:w="5040" w:type="dxa"/>
+            <w:shd w:val="clear" w:color="auto" w:fill="EFF1F3"/>
+          </w:tcPr>
+          <w:p>
+            <w:pPr>
+              <w:spacing w:before="40" w:after="40"/>
+            </w:pPr>
+            <w:r>
+              <w:rPr>
+                <w:b/>
+                <w:sz w:val="18"/>
+              </w:rPr>
+              <w:t xml:space="preserve">Status</w:t>
+            </w:r>
+          </w:p>
+        </w:tc>
+      </w:tr>
+      <w:tr>
+        <w:tc>
+          <w:tcPr>
+            <w:tcW w:w="5040" w:type="dxa"/>
+          </w:tcPr>
+          <w:p>
+            <w:pPr>
+              <w:spacing w:before="40" w:after="40"/>
+            </w:pPr>
+            <w:r>
+              <w:rPr>
+                <w:b/>
+                <w:sz w:val="18"/>
+              </w:rPr>
+              <w:t xml:space="preserve">Carta prices beyond the free tier</w:t>
+            </w:r>
+          </w:p>
+        </w:tc>
+        <w:tc>
+          <w:tcPr>
+            <w:tcW w:w="5040" w:type="dxa"/>
+          </w:tcPr>
+          <w:p>
+            <w:pPr>
+              <w:spacing w:before="40" w:after="40"/>
+            </w:pPr>
+            <w:r>
+              <w:rPr>
+                <w:sz w:val="18"/>
+              </w:rPr>
+              <w:t xml:space="preserve">❌ Not published. The page states per-stakeholder pricing with a minimum annual fee and routes to sales. Dollar figures in reviews ($8,000/yr) and third-party guides ($2,800/yr Starter) are </w:t>
+            </w:r>
+            <w:r>
+              <w:rPr>
+                <w:rFonts w:ascii="Consolas" w:hAnsi="Consolas"/>
+                <w:sz w:val="18"/>
+              </w:rPr>
+              <w:t xml:space="preserve">[UNVERIFIED]</w:t>
+            </w:r>
+            <w:r>
+              <w:rPr>
+                <w:sz w:val="18"/>
+              </w:rPr>
+              <w:t xml:space="preserve"> and may describe older packaging.</w:t>
+            </w:r>
+          </w:p>
+        </w:tc>
+      </w:tr>
+      <w:tr>
+        <w:tc>
+          <w:tcPr>
+            <w:tcW w:w="5040" w:type="dxa"/>
+          </w:tcPr>
+          <w:p>
+            <w:pPr>
+              <w:spacing w:before="40" w:after="40"/>
+            </w:pPr>
+            <w:r>
+              <w:rPr>
+                <w:b/>
+                <w:sz w:val="18"/>
+              </w:rPr>
+              <w:t xml:space="preserve">Crunchbase pricing page</w:t>
+            </w:r>
+          </w:p>
+        </w:tc>
+        <w:tc>
+          <w:tcPr>
+            <w:tcW w:w="5040" w:type="dxa"/>
+          </w:tcPr>
+          <w:p>
+            <w:pPr>
+              <w:spacing w:before="40" w:after="40"/>
+            </w:pPr>
+            <w:r>
+              <w:rPr>
+                <w:sz w:val="18"/>
+              </w:rPr>
+              <w:t xml:space="preserve">⚠️ Cloudflare challenge blocked direct access; prices are from G2/Vendr/secondary write-ups and corroborated by a Trustpilot complaint citing $588.</w:t>
+            </w:r>
+          </w:p>
+        </w:tc>
+      </w:tr>
+      <w:tr>
+        <w:tc>
+          <w:tcPr>
+            <w:tcW w:w="5040" w:type="dxa"/>
+          </w:tcPr>
+          <w:p>
+            <w:pPr>
+              <w:spacing w:before="40" w:after="40"/>
+            </w:pPr>
+            <w:r>
+              <w:rPr>
+                <w:b/>
+                <w:sz w:val="18"/>
+              </w:rPr>
+              <w:t xml:space="preserve">PitchBook pricing</w:t>
+            </w:r>
+          </w:p>
+        </w:tc>
+        <w:tc>
+          <w:tcPr>
+            <w:tcW w:w="5040" w:type="dxa"/>
+          </w:tcPr>
+          <w:p>
+            <w:pPr>
+              <w:spacing w:before="40" w:after="40"/>
+            </w:pPr>
+            <w:r>
+              <w:rPr>
+                <w:sz w:val="18"/>
+              </w:rPr>
+              <w:t xml:space="preserve">⚠️ Entirely third-party. PitchBook publishes nothing.</w:t>
+            </w:r>
+          </w:p>
+        </w:tc>
+      </w:tr>
+      <w:tr>
+        <w:tc>
+          <w:tcPr>
+            <w:tcW w:w="5040" w:type="dxa"/>
+          </w:tcPr>
+          <w:p>
+            <w:pPr>
+              <w:spacing w:before="40" w:after="40"/>
+            </w:pPr>
+            <w:r>
+              <w:rPr>
+                <w:b/>
+                <w:sz w:val="18"/>
+              </w:rPr>
+              <w:t xml:space="preserve">Valutico data-scale claims</w:t>
+            </w:r>
+            <w:r>
+              <w:rPr>
+                <w:sz w:val="18"/>
+              </w:rPr>
+              <w:t xml:space="preserve"> (1M+ transactions, 53k+ peers, 28 techniques)</w:t>
+            </w:r>
+          </w:p>
+        </w:tc>
+        <w:tc>
+          <w:tcPr>
+            <w:tcW w:w="5040" w:type="dxa"/>
+          </w:tcPr>
+          <w:p>
+            <w:pPr>
+              <w:spacing w:before="40" w:after="40"/>
+            </w:pPr>
+            <w:r>
+              <w:rPr>
+                <w:sz w:val="18"/>
+              </w:rPr>
+              <w:t xml:space="preserve">⚠️ Vendor-stated, not independently verified.</w:t>
+            </w:r>
+          </w:p>
+        </w:tc>
+      </w:tr>
+      <w:tr>
+        <w:tc>
+          <w:tcPr>
+            <w:tcW w:w="5040" w:type="dxa"/>
+          </w:tcPr>
+          <w:p>
+            <w:pPr>
+              <w:spacing w:before="40" w:after="40"/>
+            </w:pPr>
+            <w:r>
+              <w:rPr>
+                <w:b/>
+                <w:sz w:val="18"/>
+              </w:rPr>
+              <w:t xml:space="preserve">Foundersuite $13M round (Sept 2024)</w:t>
+            </w:r>
+          </w:p>
+        </w:tc>
+        <w:tc>
+          <w:tcPr>
+            <w:tcW w:w="5040" w:type="dxa"/>
+          </w:tcPr>
+          <w:p>
+            <w:pPr>
+              <w:spacing w:before="40" w:after="40"/>
+            </w:pPr>
+            <w:r>
+              <w:rPr>
+                <w:rFonts w:ascii="Consolas" w:hAnsi="Consolas"/>
+                <w:sz w:val="18"/>
+              </w:rPr>
+              <w:t xml:space="preserve">[UNVERIFIED]</w:t>
+            </w:r>
+            <w:r>
+              <w:rPr>
+                <w:sz w:val="18"/>
+              </w:rPr>
+              <w:t xml:space="preserve"> — from an aggregator snippet, not a press release or SEC filing. Implausibly large for this company's size; </w:t>
+            </w:r>
+            <w:r>
+              <w:rPr>
+                <w:b/>
+                <w:sz w:val="18"/>
+              </w:rPr>
+              <w:t xml:space="preserve">do not cite without confirming</w:t>
+            </w:r>
+            <w:r>
+              <w:rPr>
+                <w:sz w:val="18"/>
+              </w:rPr>
+              <w:t xml:space="preserve">.</w:t>
+            </w:r>
+          </w:p>
+        </w:tc>
+      </w:tr>
+      <w:tr>
+        <w:tc>
+          <w:tcPr>
+            <w:tcW w:w="5040" w:type="dxa"/>
+          </w:tcPr>
+          <w:p>
+            <w:pPr>
+              <w:spacing w:before="40" w:after="40"/>
+            </w:pPr>
+            <w:r>
+              <w:rPr>
+                <w:b/>
+                <w:sz w:val="18"/>
+              </w:rPr>
+              <w:t xml:space="preserve">Carta's current valuation (~$3.5B) and ARR (~$500M)</w:t>
+            </w:r>
+          </w:p>
+        </w:tc>
+        <w:tc>
+          <w:tcPr>
+            <w:tcW w:w="5040" w:type="dxa"/>
+          </w:tcPr>
+          <w:p>
+            <w:pPr>
+              <w:spacing w:before="40" w:after="40"/>
+            </w:pPr>
+            <w:r>
+              <w:rPr>
+                <w:rFonts w:ascii="Consolas" w:hAnsi="Consolas"/>
+                <w:sz w:val="18"/>
+              </w:rPr>
+              <w:t xml:space="preserve">[UNVERIFIED]</w:t>
+            </w:r>
+            <w:r>
+              <w:rPr>
+                <w:sz w:val="18"/>
+              </w:rPr>
+              <w:t xml:space="preserve"> — secondary market trackers, not company disclosure. The $7.4B / Series G / $1.29B figures are from 2021 reporting.</w:t>
+            </w:r>
+          </w:p>
+        </w:tc>
+      </w:tr>
+      <w:tr>
+        <w:tc>
+          <w:tcPr>
+            <w:tcW w:w="5040" w:type="dxa"/>
+          </w:tcPr>
+          <w:p>
+            <w:pPr>
+              <w:spacing w:before="40" w:after="40"/>
+            </w:pPr>
+            <w:r>
+              <w:rPr>
+                <w:b/>
+                <w:sz w:val="18"/>
+              </w:rPr>
+              <w:t xml:space="preserve">Eqvista funding ($5M, Series A)</w:t>
+            </w:r>
+          </w:p>
+        </w:tc>
+        <w:tc>
+          <w:tcPr>
+            <w:tcW w:w="5040" w:type="dxa"/>
+          </w:tcPr>
+          <w:p>
+            <w:pPr>
+              <w:spacing w:before="40" w:after="40"/>
+            </w:pPr>
+            <w:r>
+              <w:rPr>
+                <w:rFonts w:ascii="Consolas" w:hAnsi="Consolas"/>
+                <w:sz w:val="18"/>
+              </w:rPr>
+              <w:t xml:space="preserve">[UNVERIFIED]</w:t>
+            </w:r>
+            <w:r>
+              <w:rPr>
+                <w:sz w:val="18"/>
+              </w:rPr>
+              <w:t xml:space="preserve"> — aggregator profile.</w:t>
+            </w:r>
+          </w:p>
+        </w:tc>
+      </w:tr>
+      <w:tr>
+        <w:tc>
+          <w:tcPr>
+            <w:tcW w:w="5040" w:type="dxa"/>
+          </w:tcPr>
+          <w:p>
+            <w:pPr>
+              <w:spacing w:before="40" w:after="40"/>
+            </w:pPr>
+            <w:r>
+              <w:rPr>
+                <w:b/>
+                <w:sz w:val="18"/>
+              </w:rPr>
+              <w:t xml:space="preserve">Equidam / Share Council merger (Feb 2026)</w:t>
+            </w:r>
+          </w:p>
+        </w:tc>
+        <w:tc>
+          <w:tcPr>
+            <w:tcW w:w="5040" w:type="dxa"/>
+          </w:tcPr>
+          <w:p>
+            <w:pPr>
+              <w:spacing w:before="40" w:after="40"/>
+            </w:pPr>
+            <w:r>
+              <w:rPr>
+                <w:sz w:val="18"/>
+              </w:rPr>
+              <w:t xml:space="preserve">⚠️ Company blog and secondary coverage; no filing reviewed.</w:t>
+            </w:r>
+          </w:p>
+        </w:tc>
+      </w:tr>
+      <w:tr>
+        <w:tc>
+          <w:tcPr>
+            <w:tcW w:w="5040" w:type="dxa"/>
+          </w:tcPr>
+          <w:p>
+            <w:pPr>
+              <w:spacing w:before="40" w:after="40"/>
+            </w:pPr>
+            <w:r>
+              <w:rPr>
+                <w:b/>
+                <w:sz w:val="18"/>
+              </w:rPr>
+              <w:t xml:space="preserve">Equidam's "140,000+ founders"</w:t>
+            </w:r>
+          </w:p>
+        </w:tc>
+        <w:tc>
+          <w:tcPr>
+            <w:tcW w:w="5040" w:type="dxa"/>
+          </w:tcPr>
+          <w:p>
+            <w:pPr>
+              <w:spacing w:before="40" w:after="40"/>
+            </w:pPr>
+            <w:r>
+              <w:rPr>
+                <w:sz w:val="18"/>
+              </w:rPr>
+              <w:t xml:space="preserve">⚠️ Marketing claim; the 15-review Trustpilot base suggests low active engagement </w:t>
+            </w:r>
+            <w:r>
+              <w:rPr>
+                <w:rFonts w:ascii="Consolas" w:hAnsi="Consolas"/>
+                <w:sz w:val="18"/>
+              </w:rPr>
+              <w:t xml:space="preserve">[inference]</w:t>
+            </w:r>
+            <w:r>
+              <w:rPr>
+                <w:sz w:val="18"/>
+              </w:rPr>
+              <w:t xml:space="preserve">.</w:t>
+            </w:r>
+          </w:p>
+        </w:tc>
+      </w:tr>
+      <w:tr>
+        <w:tc>
+          <w:tcPr>
+            <w:tcW w:w="5040" w:type="dxa"/>
+          </w:tcPr>
+          <w:p>
+            <w:pPr>
+              <w:spacing w:before="40" w:after="40"/>
+            </w:pPr>
+            <w:r>
+              <w:rPr>
+                <w:b/>
+                <w:sz w:val="18"/>
+              </w:rPr>
+              <w:t xml:space="preserve">G2 / Reddit</w:t>
+            </w:r>
+          </w:p>
+        </w:tc>
+        <w:tc>
+          <w:tcPr>
+            <w:tcW w:w="5040" w:type="dxa"/>
+          </w:tcPr>
+          <w:p>
+            <w:pPr>
+              <w:spacing w:before="40" w:after="40"/>
+            </w:pPr>
+            <w:r>
+              <w:rPr>
+                <w:sz w:val="18"/>
+              </w:rPr>
+              <w:t xml:space="preserve">❌ Both blocked. G2 ratings quoted anywhere in this file would be secondhand; none are included.</w:t>
+            </w:r>
+          </w:p>
+        </w:tc>
+      </w:tr>
+      <w:tr>
+        <w:tc>
+          <w:tcPr>
+            <w:tcW w:w="5040" w:type="dxa"/>
+          </w:tcPr>
+          <w:p>
+            <w:pPr>
+              <w:spacing w:before="40" w:after="40"/>
+            </w:pPr>
+            <w:r>
+              <w:rPr>
+                <w:b/>
+                <w:sz w:val="18"/>
+              </w:rPr>
+              <w:t xml:space="preserve">Review sample sizes</w:t>
+            </w:r>
+          </w:p>
+        </w:tc>
+        <w:tc>
+          <w:tcPr>
+            <w:tcW w:w="5040" w:type="dxa"/>
+          </w:tcPr>
+          <w:p>
+            <w:pPr>
+              <w:spacing w:before="40" w:after="40"/>
+            </w:pPr>
+            <w:r>
+              <w:rPr>
+                <w:sz w:val="18"/>
+              </w:rPr>
+              <w:t xml:space="preserve">⚠️ 15–110 reviews per platform, self-selected. Directional only.</w:t>
             </w:r>
           </w:p>
         </w:tc>

</xml_diff>

<commit_message>
Add adversarial test of the continuous valuation claim
Co-Authored-By: Claude Opus 5 <noreply@anthropic.com>
</commit_message>
<xml_diff>
--- a/08_StartupValuationApp/ResearchAgents/StartupValuationApp_Research.docx
+++ b/08_StartupValuationApp/ResearchAgents/StartupValuationApp_Research.docx
@@ -104,6 +104,17 @@
       </w:pPr>
       <w:r>
         <w:t xml:space="preserve">Section 4 — Bottom-Up Market Size: population-to-revenue funnel at $1,000/year, with conservative, base and optimistic cases and every assumption stated. *(Added Sept 22, 2026)*</w:t>
+      </w:r>
+    </w:p>
+    <w:p>
+      <w:pPr>
+        <w:numPr>
+          <w:ilvl w:val="0"/>
+          <w:numId w:val="1"/>
+        </w:numPr>
+      </w:pPr>
+      <w:r>
+        <w:t xml:space="preserve">Section 5 — Testing the "Newly Possible" Claim: evidence for and against, both counterarguments argued at full strength, and the narrowed claim that survives. *(Added Sept 22, 2026)*</w:t>
       </w:r>
     </w:p>
     <w:p>
@@ -15987,6 +15998,2231 @@
                 <w:sz w:val="18"/>
               </w:rPr>
               <w:t xml:space="preserve">⚠️ From a fan-run statistics site, not ABC. Widely repeated, never officially confirmed.</w:t>
+            </w:r>
+          </w:p>
+        </w:tc>
+      </w:tr>
+    </w:tbl>
+    <w:p>
+      <w:pPr>
+        <w:spacing w:after="0"/>
+      </w:pPr>
+    </w:p>
+    <w:p>
+      <w:r>
+        <w:br w:type="page"/>
+      </w:r>
+    </w:p>
+    <w:p>
+      <w:pPr>
+        <w:pStyle w:val="Title"/>
+      </w:pPr>
+      <w:r>
+        <w:t xml:space="preserve">Testing the Claim: "Continuous Founder-Facing Valuation Is Newly Possible"</w:t>
+      </w:r>
+    </w:p>
+    <w:p>
+      <w:r>
+        <w:rPr>
+          <w:b/>
+        </w:rPr>
+        <w:t xml:space="preserve">Prepared:</w:t>
+      </w:r>
+      <w:r>
+        <w:t xml:space="preserve"> September 22, 2026</w:t>
+      </w:r>
+    </w:p>
+    <w:p>
+      <w:r>
+        <w:rPr>
+          <w:b/>
+        </w:rPr>
+        <w:t xml:space="preserve">Window searched:</w:t>
+      </w:r>
+      <w:r>
+        <w:t xml:space="preserve"> March 2025 – September 2026, plus historical evidence needed to test counterargument 1.</w:t>
+      </w:r>
+    </w:p>
+    <w:p>
+      <w:pPr>
+        <w:pStyle w:val="Heading1"/>
+      </w:pPr>
+      <w:r>
+        <w:t xml:space="preserve">The claim, stated precisely</w:t>
+      </w:r>
+    </w:p>
+    <w:p>
+      <w:pPr>
+        <w:ind w:left="360"/>
+        <w:pBdr>
+          <w:left w:val="single" w:sz="18" w:space="8" w:color="9AA0A6"/>
+        </w:pBdr>
+      </w:pPr>
+      <w:r>
+        <w:t xml:space="preserve">A founder-facing app that </w:t>
+      </w:r>
+      <w:r>
+        <w:rPr>
+          <w:b/>
+        </w:rPr>
+        <w:t xml:space="preserve">continuously</w:t>
+      </w:r>
+      <w:r>
+        <w:t xml:space="preserve"> values a startup is </w:t>
+      </w:r>
+      <w:r>
+        <w:rPr>
+          <w:b/>
+        </w:rPr>
+        <w:t xml:space="preserve">newly possible</w:t>
+      </w:r>
+      <w:r>
+        <w:t xml:space="preserve">, because an AI agent can now compile the data and produce an ongoing valuation — </w:t>
+      </w:r>
+      <w:r>
+        <w:rPr>
+          <w:b/>
+        </w:rPr>
+        <w:t xml:space="preserve">and this is not currently in the market.</w:t>
+      </w:r>
+    </w:p>
+    <w:p>
+      <w:r>
+        <w:rPr>
+          <w:b/>
+        </w:rPr>
+        <w:t xml:space="preserve">Verdict up front: the "not currently in the market" half is false, and the "newly possible" half is half-true.</w:t>
+      </w:r>
+      <w:r>
+        <w:t xml:space="preserve"> An automated multi-method valuation engine for founders has existed since 2013, and </w:t>
+      </w:r>
+      <w:r>
+        <w:rPr>
+          <w:b/>
+        </w:rPr>
+        <w:t xml:space="preserve">a competitor shipped an AI-agent-callable version of exactly this on August 8, 2025.</w:t>
+      </w:r>
+      <w:r>
+        <w:t xml:space="preserve"> What is genuinely new is narrower — and stated at the end.</w:t>
+      </w:r>
+    </w:p>
+    <w:p>
+      <w:pPr>
+        <w:pBdr>
+          <w:bottom w:val="single" w:sz="6" w:space="6" w:color="C9CCD1"/>
+        </w:pBdr>
+      </w:pPr>
+    </w:p>
+    <w:p>
+      <w:pPr>
+        <w:pStyle w:val="Heading1"/>
+      </w:pPr>
+      <w:r>
+        <w:t xml:space="preserve">Part 1 — Evidence FOR</w:t>
+      </w:r>
+    </w:p>
+    <w:p>
+      <w:pPr>
+        <w:pStyle w:val="Heading2"/>
+      </w:pPr>
+      <w:r>
+        <w:t xml:space="preserve">1a. Product launches (last 18 months)</w:t>
+      </w:r>
+    </w:p>
+    <w:tbl>
+      <w:tblPr>
+        <w:tblW w:w="10080" w:type="dxa"/>
+        <w:tblBorders>
+          <w:top w:val="single" w:sz="4" w:space="0" w:color="C9CCD1"/>
+          <w:left w:val="single" w:sz="4" w:space="0" w:color="C9CCD1"/>
+          <w:bottom w:val="single" w:sz="4" w:space="0" w:color="C9CCD1"/>
+          <w:right w:val="single" w:sz="4" w:space="0" w:color="C9CCD1"/>
+          <w:insideH w:val="single" w:sz="4" w:space="0" w:color="C9CCD1"/>
+          <w:insideV w:val="single" w:sz="4" w:space="0" w:color="C9CCD1"/>
+        </w:tblBorders>
+        <w:tblLayout w:type="fixed"/>
+      </w:tblPr>
+      <w:tblGrid>
+        <w:gridCol w:w="3360"/>
+        <w:gridCol w:w="3360"/>
+        <w:gridCol w:w="3360"/>
+      </w:tblGrid>
+      <w:tr>
+        <w:trPr>
+          <w:tblHeader/>
+        </w:trPr>
+        <w:tc>
+          <w:tcPr>
+            <w:tcW w:w="3360" w:type="dxa"/>
+            <w:shd w:val="clear" w:color="auto" w:fill="EFF1F3"/>
+          </w:tcPr>
+          <w:p>
+            <w:pPr>
+              <w:spacing w:before="40" w:after="40"/>
+            </w:pPr>
+            <w:r>
+              <w:rPr>
+                <w:b/>
+                <w:sz w:val="18"/>
+              </w:rPr>
+              <w:t xml:space="preserve">Date</w:t>
+            </w:r>
+          </w:p>
+        </w:tc>
+        <w:tc>
+          <w:tcPr>
+            <w:tcW w:w="3360" w:type="dxa"/>
+            <w:shd w:val="clear" w:color="auto" w:fill="EFF1F3"/>
+          </w:tcPr>
+          <w:p>
+            <w:pPr>
+              <w:spacing w:before="40" w:after="40"/>
+            </w:pPr>
+            <w:r>
+              <w:rPr>
+                <w:b/>
+                <w:sz w:val="18"/>
+              </w:rPr>
+              <w:t xml:space="preserve">Launch</w:t>
+            </w:r>
+          </w:p>
+        </w:tc>
+        <w:tc>
+          <w:tcPr>
+            <w:tcW w:w="3360" w:type="dxa"/>
+            <w:shd w:val="clear" w:color="auto" w:fill="EFF1F3"/>
+          </w:tcPr>
+          <w:p>
+            <w:pPr>
+              <w:spacing w:before="40" w:after="40"/>
+            </w:pPr>
+            <w:r>
+              <w:rPr>
+                <w:b/>
+                <w:sz w:val="18"/>
+              </w:rPr>
+              <w:t xml:space="preserve">Relevance</w:t>
+            </w:r>
+          </w:p>
+        </w:tc>
+      </w:tr>
+      <w:tr>
+        <w:tc>
+          <w:tcPr>
+            <w:tcW w:w="3360" w:type="dxa"/>
+          </w:tcPr>
+          <w:p>
+            <w:pPr>
+              <w:spacing w:before="40" w:after="40"/>
+            </w:pPr>
+            <w:r>
+              <w:rPr>
+                <w:b/>
+                <w:sz w:val="18"/>
+              </w:rPr>
+              <w:t xml:space="preserve">Aug 8, 2025</w:t>
+            </w:r>
+          </w:p>
+        </w:tc>
+        <w:tc>
+          <w:tcPr>
+            <w:tcW w:w="3360" w:type="dxa"/>
+          </w:tcPr>
+          <w:p>
+            <w:pPr>
+              <w:spacing w:before="40" w:after="40"/>
+            </w:pPr>
+            <w:r>
+              <w:rPr>
+                <w:b/>
+                <w:sz w:val="18"/>
+              </w:rPr>
+              <w:t xml:space="preserve">Equidam MCP server</w:t>
+            </w:r>
+            <w:r>
+              <w:rPr>
+                <w:sz w:val="18"/>
+              </w:rPr>
+              <w:t xml:space="preserve"> — "the first professional-grade valuation tool available through Anthropic's open standard for AI integration." An AI assistant installs </w:t>
+            </w:r>
+            <w:r>
+              <w:rPr>
+                <w:rFonts w:ascii="Consolas" w:hAnsi="Consolas"/>
+                <w:sz w:val="18"/>
+              </w:rPr>
+              <w:t xml:space="preserve">@equidam/mcp-server</w:t>
+            </w:r>
+            <w:r>
+              <w:rPr>
+                <w:sz w:val="18"/>
+              </w:rPr>
+              <w:t xml:space="preserve">, classifies the company from a natural-language description, and runs a five-method valuation. Equidam states it moves a valuation from </w:t>
+            </w:r>
+            <w:r>
+              <w:rPr>
+                <w:b/>
+                <w:sz w:val="18"/>
+              </w:rPr>
+              <w:t xml:space="preserve">4–8 hours to 30 seconds</w:t>
+            </w:r>
+            <w:r>
+              <w:rPr>
+                <w:sz w:val="18"/>
+              </w:rPr>
+              <w:t xml:space="preserve">.</w:t>
+            </w:r>
+          </w:p>
+        </w:tc>
+        <w:tc>
+          <w:tcPr>
+            <w:tcW w:w="3360" w:type="dxa"/>
+          </w:tcPr>
+          <w:p>
+            <w:pPr>
+              <w:spacing w:before="40" w:after="40"/>
+            </w:pPr>
+            <w:r>
+              <w:rPr>
+                <w:b/>
+                <w:sz w:val="18"/>
+              </w:rPr>
+              <w:t xml:space="preserve">The capability the claim describes, shipped 13 months ago</w:t>
+            </w:r>
+            <w:r>
+              <w:rPr>
+                <w:sz w:val="18"/>
+              </w:rPr>
+              <w:t xml:space="preserve"> (</w:t>
+            </w:r>
+            <w:hyperlink r:id="rHl60">
+              <w:r>
+                <w:rPr>
+                  <w:rStyle w:val="Hyperlink"/>
+                  <w:sz w:val="18"/>
+                </w:rPr>
+                <w:t xml:space="preserve">Equidam</w:t>
+              </w:r>
+            </w:hyperlink>
+            <w:r>
+              <w:rPr>
+                <w:sz w:val="18"/>
+              </w:rPr>
+              <w:t xml:space="preserve">)</w:t>
+            </w:r>
+          </w:p>
+        </w:tc>
+      </w:tr>
+      <w:tr>
+        <w:tc>
+          <w:tcPr>
+            <w:tcW w:w="3360" w:type="dxa"/>
+          </w:tcPr>
+          <w:p>
+            <w:pPr>
+              <w:spacing w:before="40" w:after="40"/>
+            </w:pPr>
+            <w:r>
+              <w:rPr>
+                <w:b/>
+                <w:sz w:val="18"/>
+              </w:rPr>
+              <w:t xml:space="preserve">2025</w:t>
+            </w:r>
+          </w:p>
+        </w:tc>
+        <w:tc>
+          <w:tcPr>
+            <w:tcW w:w="3360" w:type="dxa"/>
+          </w:tcPr>
+          <w:p>
+            <w:pPr>
+              <w:spacing w:before="40" w:after="40"/>
+            </w:pPr>
+            <w:r>
+              <w:rPr>
+                <w:b/>
+                <w:sz w:val="18"/>
+              </w:rPr>
+              <w:t xml:space="preserve">Crunchbase predictive intelligence</w:t>
+            </w:r>
+            <w:r>
+              <w:rPr>
+                <w:sz w:val="18"/>
+              </w:rPr>
+              <w:t xml:space="preserve"> — funding predictions with </w:t>
+            </w:r>
+            <w:r>
+              <w:rPr>
+                <w:b/>
+                <w:sz w:val="18"/>
+              </w:rPr>
+              <w:t xml:space="preserve">ranked investor matches</w:t>
+            </w:r>
+          </w:p>
+        </w:tc>
+        <w:tc>
+          <w:tcPr>
+            <w:tcW w:w="3360" w:type="dxa"/>
+          </w:tcPr>
+          <w:p>
+            <w:pPr>
+              <w:spacing w:before="40" w:after="40"/>
+            </w:pPr>
+            <w:r>
+              <w:rPr>
+                <w:sz w:val="18"/>
+              </w:rPr>
+              <w:t xml:space="preserve">The investor-matching half, shipped (</w:t>
+            </w:r>
+            <w:hyperlink r:id="rHl28">
+              <w:r>
+                <w:rPr>
+                  <w:rStyle w:val="Hyperlink"/>
+                  <w:sz w:val="18"/>
+                </w:rPr>
+                <w:t xml:space="preserve">Crunchbase</w:t>
+              </w:r>
+            </w:hyperlink>
+            <w:r>
+              <w:rPr>
+                <w:sz w:val="18"/>
+              </w:rPr>
+              <w:t xml:space="preserve">)</w:t>
+            </w:r>
+          </w:p>
+        </w:tc>
+      </w:tr>
+      <w:tr>
+        <w:tc>
+          <w:tcPr>
+            <w:tcW w:w="3360" w:type="dxa"/>
+          </w:tcPr>
+          <w:p>
+            <w:pPr>
+              <w:spacing w:before="40" w:after="40"/>
+            </w:pPr>
+            <w:r>
+              <w:rPr>
+                <w:b/>
+                <w:sz w:val="18"/>
+              </w:rPr>
+              <w:t xml:space="preserve">Feb 20, 2026</w:t>
+            </w:r>
+          </w:p>
+        </w:tc>
+        <w:tc>
+          <w:tcPr>
+            <w:tcW w:w="3360" w:type="dxa"/>
+          </w:tcPr>
+          <w:p>
+            <w:pPr>
+              <w:spacing w:before="40" w:after="40"/>
+            </w:pPr>
+            <w:r>
+              <w:rPr>
+                <w:b/>
+                <w:sz w:val="18"/>
+              </w:rPr>
+              <w:t xml:space="preserve">Carta 2026 roadmap</w:t>
+            </w:r>
+            <w:r>
+              <w:rPr>
+                <w:sz w:val="18"/>
+              </w:rPr>
+              <w:t xml:space="preserve">: "moving beyond simple record-keeping to deliver a </w:t>
+            </w:r>
+            <w:r>
+              <w:rPr>
+                <w:b/>
+                <w:sz w:val="18"/>
+              </w:rPr>
+              <w:t xml:space="preserve">real-time</w:t>
+            </w:r>
+            <w:r>
+              <w:rPr>
+                <w:sz w:val="18"/>
+              </w:rPr>
+              <w:t xml:space="preserve">, interconnected system of record," AI-enabled data collection, expanded valuation methodologies (OPM, public comps, DCF)</w:t>
+            </w:r>
+          </w:p>
+        </w:tc>
+        <w:tc>
+          <w:tcPr>
+            <w:tcW w:w="3360" w:type="dxa"/>
+          </w:tcPr>
+          <w:p>
+            <w:pPr>
+              <w:spacing w:before="40" w:after="40"/>
+            </w:pPr>
+            <w:r>
+              <w:rPr>
+                <w:sz w:val="18"/>
+              </w:rPr>
+              <w:t xml:space="preserve">The incumbent is building continuous valuation machinery (</w:t>
+            </w:r>
+            <w:hyperlink r:id="rHl61">
+              <w:r>
+                <w:rPr>
+                  <w:rStyle w:val="Hyperlink"/>
+                  <w:sz w:val="18"/>
+                </w:rPr>
+                <w:t xml:space="preserve">Carta</w:t>
+              </w:r>
+            </w:hyperlink>
+            <w:r>
+              <w:rPr>
+                <w:sz w:val="18"/>
+              </w:rPr>
+              <w:t xml:space="preserve">)</w:t>
+            </w:r>
+          </w:p>
+        </w:tc>
+      </w:tr>
+      <w:tr>
+        <w:tc>
+          <w:tcPr>
+            <w:tcW w:w="3360" w:type="dxa"/>
+          </w:tcPr>
+          <w:p>
+            <w:pPr>
+              <w:spacing w:before="40" w:after="40"/>
+            </w:pPr>
+            <w:r>
+              <w:rPr>
+                <w:b/>
+                <w:sz w:val="18"/>
+              </w:rPr>
+              <w:t xml:space="preserve">Apr 6, 2026</w:t>
+            </w:r>
+          </w:p>
+        </w:tc>
+        <w:tc>
+          <w:tcPr>
+            <w:tcW w:w="3360" w:type="dxa"/>
+          </w:tcPr>
+          <w:p>
+            <w:pPr>
+              <w:spacing w:before="40" w:after="40"/>
+            </w:pPr>
+            <w:r>
+              <w:rPr>
+                <w:b/>
+                <w:sz w:val="18"/>
+              </w:rPr>
+              <w:t xml:space="preserve">Carta AI valuation workflow</w:t>
+            </w:r>
+            <w:r>
+              <w:rPr>
+                <w:sz w:val="18"/>
+              </w:rPr>
+              <w:t xml:space="preserve"> — AI extracts portfolio-company financials and KPIs from uploaded documents and pipes them straight into the valuation engine</w:t>
+            </w:r>
+          </w:p>
+        </w:tc>
+        <w:tc>
+          <w:tcPr>
+            <w:tcW w:w="3360" w:type="dxa"/>
+          </w:tcPr>
+          <w:p>
+            <w:pPr>
+              <w:spacing w:before="40" w:after="40"/>
+            </w:pPr>
+            <w:r>
+              <w:rPr>
+                <w:sz w:val="18"/>
+              </w:rPr>
+              <w:t xml:space="preserve">Automated data compilation → valuation, in production (</w:t>
+            </w:r>
+            <w:hyperlink r:id="rHl62">
+              <w:r>
+                <w:rPr>
+                  <w:rStyle w:val="Hyperlink"/>
+                  <w:sz w:val="18"/>
+                </w:rPr>
+                <w:t xml:space="preserve">Carta</w:t>
+              </w:r>
+            </w:hyperlink>
+            <w:r>
+              <w:rPr>
+                <w:sz w:val="18"/>
+              </w:rPr>
+              <w:t xml:space="preserve">)</w:t>
+            </w:r>
+          </w:p>
+        </w:tc>
+      </w:tr>
+      <w:tr>
+        <w:tc>
+          <w:tcPr>
+            <w:tcW w:w="3360" w:type="dxa"/>
+          </w:tcPr>
+          <w:p>
+            <w:pPr>
+              <w:spacing w:before="40" w:after="40"/>
+            </w:pPr>
+            <w:r>
+              <w:rPr>
+                <w:b/>
+                <w:sz w:val="18"/>
+              </w:rPr>
+              <w:t xml:space="preserve">2026</w:t>
+            </w:r>
+          </w:p>
+        </w:tc>
+        <w:tc>
+          <w:tcPr>
+            <w:tcW w:w="3360" w:type="dxa"/>
+          </w:tcPr>
+          <w:p>
+            <w:pPr>
+              <w:spacing w:before="40" w:after="40"/>
+            </w:pPr>
+            <w:r>
+              <w:rPr>
+                <w:b/>
+                <w:sz w:val="18"/>
+              </w:rPr>
+              <w:t xml:space="preserve">AI-powered 409A platforms</w:t>
+            </w:r>
+            <w:r>
+              <w:rPr>
+                <w:sz w:val="18"/>
+              </w:rPr>
+              <w:t xml:space="preserve"> ($499–$2,500) described as "the fastest-growing segment," delivering a completed valuation in </w:t>
+            </w:r>
+            <w:r>
+              <w:rPr>
+                <w:b/>
+                <w:sz w:val="18"/>
+              </w:rPr>
+              <w:t xml:space="preserve">3–7 business days</w:t>
+            </w:r>
+            <w:r>
+              <w:rPr>
+                <w:sz w:val="18"/>
+              </w:rPr>
+              <w:t xml:space="preserve">, with a qualified appraiser reviewing and signing</w:t>
+            </w:r>
+          </w:p>
+        </w:tc>
+        <w:tc>
+          <w:tcPr>
+            <w:tcW w:w="3360" w:type="dxa"/>
+          </w:tcPr>
+          <w:p>
+            <w:pPr>
+              <w:spacing w:before="40" w:after="40"/>
+            </w:pPr>
+            <w:r>
+              <w:rPr>
+                <w:sz w:val="18"/>
+              </w:rPr>
+              <w:t xml:space="preserve">AI valuation has already commoditized the compliance number (</w:t>
+            </w:r>
+            <w:hyperlink r:id="rHl39">
+              <w:r>
+                <w:rPr>
+                  <w:rStyle w:val="Hyperlink"/>
+                  <w:sz w:val="18"/>
+                </w:rPr>
+                <w:t xml:space="preserve">409a-valuation.com</w:t>
+              </w:r>
+            </w:hyperlink>
+            <w:r>
+              <w:rPr>
+                <w:sz w:val="18"/>
+              </w:rPr>
+              <w:t xml:space="preserve">) </w:t>
+            </w:r>
+            <w:r>
+              <w:rPr>
+                <w:rFonts w:ascii="Consolas" w:hAnsi="Consolas"/>
+                <w:sz w:val="18"/>
+              </w:rPr>
+              <w:t xml:space="preserve">[vendor-adjacent source]</w:t>
+            </w:r>
+          </w:p>
+        </w:tc>
+      </w:tr>
+      <w:tr>
+        <w:tc>
+          <w:tcPr>
+            <w:tcW w:w="3360" w:type="dxa"/>
+          </w:tcPr>
+          <w:p>
+            <w:pPr>
+              <w:spacing w:before="40" w:after="40"/>
+            </w:pPr>
+            <w:r>
+              <w:rPr>
+                <w:b/>
+                <w:sz w:val="18"/>
+              </w:rPr>
+              <w:t xml:space="preserve">Feb 2, 2025</w:t>
+            </w:r>
+          </w:p>
+        </w:tc>
+        <w:tc>
+          <w:tcPr>
+            <w:tcW w:w="3360" w:type="dxa"/>
+          </w:tcPr>
+          <w:p>
+            <w:pPr>
+              <w:spacing w:before="40" w:after="40"/>
+            </w:pPr>
+            <w:r>
+              <w:rPr>
+                <w:b/>
+                <w:sz w:val="18"/>
+              </w:rPr>
+              <w:t xml:space="preserve">OpenAI Deep Research</w:t>
+            </w:r>
+            <w:r>
+              <w:rPr>
+                <w:sz w:val="18"/>
+              </w:rPr>
+              <w:t xml:space="preserve"> — autonomous multi-step web research with citations</w:t>
+            </w:r>
+          </w:p>
+        </w:tc>
+        <w:tc>
+          <w:tcPr>
+            <w:tcW w:w="3360" w:type="dxa"/>
+          </w:tcPr>
+          <w:p>
+            <w:pPr>
+              <w:spacing w:before="40" w:after="40"/>
+            </w:pPr>
+            <w:r>
+              <w:rPr>
+                <w:sz w:val="18"/>
+              </w:rPr>
+              <w:t xml:space="preserve">The comparables-and-investor legwork (</w:t>
+            </w:r>
+            <w:hyperlink r:id="rHl26">
+              <w:r>
+                <w:rPr>
+                  <w:rStyle w:val="Hyperlink"/>
+                  <w:sz w:val="18"/>
+                </w:rPr>
+                <w:t xml:space="preserve">OpenAI</w:t>
+              </w:r>
+            </w:hyperlink>
+            <w:r>
+              <w:rPr>
+                <w:sz w:val="18"/>
+              </w:rPr>
+              <w:t xml:space="preserve">)</w:t>
+            </w:r>
+          </w:p>
+        </w:tc>
+      </w:tr>
+    </w:tbl>
+    <w:p>
+      <w:pPr>
+        <w:spacing w:after="0"/>
+      </w:pPr>
+    </w:p>
+    <w:p>
+      <w:pPr>
+        <w:pStyle w:val="Heading2"/>
+      </w:pPr>
+      <w:r>
+        <w:t xml:space="preserve">1b. The one structural point that genuinely favors the claim</w:t>
+      </w:r>
+    </w:p>
+    <w:p>
+      <w:r>
+        <w:rPr>
+          <w:b/>
+        </w:rPr>
+        <w:t xml:space="preserve">Carta's AI valuation machinery is pointed at fund middle offices, not founders.</w:t>
+      </w:r>
+      <w:r>
+        <w:t xml:space="preserve"> Read the April 2026 post: it is about *PE and VC teams valuing their portfolio companies* for auditors, LPs and carry — "weeks spent chasing portfolio companies for hundreds of KPIs." The GP/LP side is being automated aggressively. </w:t>
+      </w:r>
+      <w:r>
+        <w:rPr>
+          <w:b/>
+        </w:rPr>
+        <w:t xml:space="preserve">The founder-facing equivalent is not what Carta is building.</w:t>
+      </w:r>
+      <w:r>
+        <w:t xml:space="preserve"> (</w:t>
+      </w:r>
+      <w:hyperlink r:id="rHl62">
+        <w:r>
+          <w:rPr>
+            <w:rStyle w:val="Hyperlink"/>
+          </w:rPr>
+          <w:t xml:space="preserve">Carta</w:t>
+        </w:r>
+      </w:hyperlink>
+      <w:r>
+        <w:t xml:space="preserve">)</w:t>
+      </w:r>
+    </w:p>
+    <w:p>
+      <w:r>
+        <w:t xml:space="preserve">So the accurate version of the claim's second half is: *continuous valuation is being built for investors, not for founders.* That is a real, defensible gap — and a much narrower statement than "not currently in the market."</w:t>
+      </w:r>
+    </w:p>
+    <w:p>
+      <w:pPr>
+        <w:pStyle w:val="Heading2"/>
+      </w:pPr>
+      <w:r>
+        <w:t xml:space="preserve">1c. Adoption</w:t>
+      </w:r>
+    </w:p>
+    <w:p>
+      <w:r>
+        <w:t xml:space="preserve">Section 1 established that the founder-facing tools that do exist have almost no usage: Equidam has </w:t>
+      </w:r>
+      <w:r>
+        <w:rPr>
+          <w:b/>
+        </w:rPr>
+        <w:t xml:space="preserve">15 lifetime Trustpilot reviews, 2 in the past year</w:t>
+      </w:r>
+      <w:r>
+        <w:t xml:space="preserve">, despite claiming 160,000+ valuations across 90+ countries. </w:t>
+      </w:r>
+      <w:r>
+        <w:rPr>
+          <w:rFonts w:ascii="Consolas" w:hAnsi="Consolas"/>
+        </w:rPr>
+        <w:t xml:space="preserve">[The gap between those two numbers is unexplained and matters — see flags.]</w:t>
+      </w:r>
+    </w:p>
+    <w:p>
+      <w:pPr>
+        <w:pBdr>
+          <w:bottom w:val="single" w:sz="6" w:space="6" w:color="C9CCD1"/>
+        </w:pBdr>
+      </w:pPr>
+    </w:p>
+    <w:p>
+      <w:pPr>
+        <w:pStyle w:val="Heading1"/>
+      </w:pPr>
+      <w:r>
+        <w:t xml:space="preserve">Part 2 — Evidence AGAINST</w:t>
+      </w:r>
+    </w:p>
+    <w:p>
+      <w:pPr>
+        <w:pStyle w:val="Heading2"/>
+      </w:pPr>
+      <w:r>
+        <w:t xml:space="preserve">2a. Financial reasoning is the specific thing LLMs are worst at</w:t>
+      </w:r>
+    </w:p>
+    <w:tbl>
+      <w:tblPr>
+        <w:tblW w:w="10080" w:type="dxa"/>
+        <w:tblBorders>
+          <w:top w:val="single" w:sz="4" w:space="0" w:color="C9CCD1"/>
+          <w:left w:val="single" w:sz="4" w:space="0" w:color="C9CCD1"/>
+          <w:bottom w:val="single" w:sz="4" w:space="0" w:color="C9CCD1"/>
+          <w:right w:val="single" w:sz="4" w:space="0" w:color="C9CCD1"/>
+          <w:insideH w:val="single" w:sz="4" w:space="0" w:color="C9CCD1"/>
+          <w:insideV w:val="single" w:sz="4" w:space="0" w:color="C9CCD1"/>
+        </w:tblBorders>
+        <w:tblLayout w:type="fixed"/>
+      </w:tblPr>
+      <w:tblGrid>
+        <w:gridCol w:w="5040"/>
+        <w:gridCol w:w="5040"/>
+      </w:tblGrid>
+      <w:tr>
+        <w:trPr>
+          <w:tblHeader/>
+        </w:trPr>
+        <w:tc>
+          <w:tcPr>
+            <w:tcW w:w="5040" w:type="dxa"/>
+            <w:shd w:val="clear" w:color="auto" w:fill="EFF1F3"/>
+          </w:tcPr>
+          <w:p>
+            <w:pPr>
+              <w:spacing w:before="40" w:after="40"/>
+            </w:pPr>
+            <w:r>
+              <w:rPr>
+                <w:b/>
+                <w:sz w:val="18"/>
+              </w:rPr>
+              <w:t xml:space="preserve">Finding</w:t>
+            </w:r>
+          </w:p>
+        </w:tc>
+        <w:tc>
+          <w:tcPr>
+            <w:tcW w:w="5040" w:type="dxa"/>
+            <w:shd w:val="clear" w:color="auto" w:fill="EFF1F3"/>
+          </w:tcPr>
+          <w:p>
+            <w:pPr>
+              <w:spacing w:before="40" w:after="40"/>
+            </w:pPr>
+            <w:r>
+              <w:rPr>
+                <w:b/>
+                <w:sz w:val="18"/>
+              </w:rPr>
+              <w:t xml:space="preserve">Source</w:t>
+            </w:r>
+          </w:p>
+        </w:tc>
+      </w:tr>
+      <w:tr>
+        <w:tc>
+          <w:tcPr>
+            <w:tcW w:w="5040" w:type="dxa"/>
+          </w:tcPr>
+          <w:p>
+            <w:pPr>
+              <w:spacing w:before="40" w:after="40"/>
+            </w:pPr>
+            <w:r>
+              <w:rPr>
+                <w:b/>
+                <w:sz w:val="18"/>
+              </w:rPr>
+              <w:t xml:space="preserve">Four of six leading models fabricate financial data</w:t>
+            </w:r>
+            <w:r>
+              <w:rPr>
+                <w:sz w:val="18"/>
+              </w:rPr>
+              <w:t xml:space="preserve"> when source documents are incomplete; </w:t>
+            </w:r>
+            <w:r>
+              <w:rPr>
+                <w:b/>
+                <w:sz w:val="18"/>
+              </w:rPr>
+              <w:t xml:space="preserve">two do so confidently, without disclosure, in an authoritative format</w:t>
+            </w:r>
+            <w:r>
+              <w:rPr>
+                <w:sz w:val="18"/>
+              </w:rPr>
+              <w:t xml:space="preserve"> (2026 benchmark)</w:t>
+            </w:r>
+          </w:p>
+        </w:tc>
+        <w:tc>
+          <w:tcPr>
+            <w:tcW w:w="5040" w:type="dxa"/>
+          </w:tcPr>
+          <w:p>
+            <w:pPr>
+              <w:spacing w:before="40" w:after="40"/>
+            </w:pPr>
+            <w:hyperlink r:id="rHl63">
+              <w:r>
+                <w:rPr>
+                  <w:rStyle w:val="Hyperlink"/>
+                  <w:sz w:val="18"/>
+                </w:rPr>
+                <w:t xml:space="preserve">JurisTech 2026 LLM hallucination benchmark</w:t>
+              </w:r>
+            </w:hyperlink>
+          </w:p>
+        </w:tc>
+      </w:tr>
+      <w:tr>
+        <w:tc>
+          <w:tcPr>
+            <w:tcW w:w="5040" w:type="dxa"/>
+          </w:tcPr>
+          <w:p>
+            <w:pPr>
+              <w:spacing w:before="40" w:after="40"/>
+            </w:pPr>
+            <w:r>
+              <w:rPr>
+                <w:sz w:val="18"/>
+              </w:rPr>
+              <w:t xml:space="preserve">Top models fall from </w:t>
+            </w:r>
+            <w:r>
+              <w:rPr>
+                <w:b/>
+                <w:sz w:val="18"/>
+              </w:rPr>
+              <w:t xml:space="preserve">95.6% accuracy on simple lookups to near 0% on multivariate calculations</w:t>
+            </w:r>
+            <w:r>
+              <w:rPr>
+                <w:sz w:val="18"/>
+              </w:rPr>
+              <w:t xml:space="preserve">; perturbing financial statements drops predictive accuracy to chance — evidence of memorization, not reasoning</w:t>
+            </w:r>
+          </w:p>
+        </w:tc>
+        <w:tc>
+          <w:tcPr>
+            <w:tcW w:w="5040" w:type="dxa"/>
+          </w:tcPr>
+          <w:p>
+            <w:pPr>
+              <w:spacing w:before="40" w:after="40"/>
+            </w:pPr>
+            <w:hyperlink r:id="rHl64">
+              <w:r>
+                <w:rPr>
+                  <w:rStyle w:val="Hyperlink"/>
+                  <w:sz w:val="18"/>
+                </w:rPr>
+                <w:t xml:space="preserve">Evaluating Financial Intelligence in LLMs (arXiv 2603.08704)</w:t>
+              </w:r>
+            </w:hyperlink>
+          </w:p>
+        </w:tc>
+      </w:tr>
+      <w:tr>
+        <w:tc>
+          <w:tcPr>
+            <w:tcW w:w="5040" w:type="dxa"/>
+          </w:tcPr>
+          <w:p>
+            <w:pPr>
+              <w:spacing w:before="40" w:after="40"/>
+            </w:pPr>
+            <w:r>
+              <w:rPr>
+                <w:sz w:val="18"/>
+              </w:rPr>
+              <w:t xml:space="preserve">On the </w:t>
+            </w:r>
+            <w:r>
+              <w:rPr>
+                <w:b/>
+                <w:sz w:val="18"/>
+              </w:rPr>
+              <w:t xml:space="preserve">Finance Agent Benchmark</w:t>
+            </w:r>
+            <w:r>
+              <w:rPr>
+                <w:sz w:val="18"/>
+              </w:rPr>
+              <w:t xml:space="preserve"> of real financial research tasks, the best model (o3) reached </w:t>
+            </w:r>
+            <w:r>
+              <w:rPr>
+                <w:b/>
+                <w:sz w:val="18"/>
+              </w:rPr>
+              <w:t xml:space="preserve">46.8%</w:t>
+            </w:r>
+            <w:r>
+              <w:rPr>
+                <w:sz w:val="18"/>
+              </w:rPr>
+              <w:t xml:space="preserve"> at $3.79/query</w:t>
+            </w:r>
+          </w:p>
+        </w:tc>
+        <w:tc>
+          <w:tcPr>
+            <w:tcW w:w="5040" w:type="dxa"/>
+          </w:tcPr>
+          <w:p>
+            <w:pPr>
+              <w:spacing w:before="40" w:after="40"/>
+            </w:pPr>
+            <w:hyperlink r:id="rHl32">
+              <w:r>
+                <w:rPr>
+                  <w:rStyle w:val="Hyperlink"/>
+                  <w:sz w:val="18"/>
+                </w:rPr>
+                <w:t xml:space="preserve">arXiv 2508.00828</w:t>
+              </w:r>
+            </w:hyperlink>
+          </w:p>
+        </w:tc>
+      </w:tr>
+      <w:tr>
+        <w:tc>
+          <w:tcPr>
+            <w:tcW w:w="5040" w:type="dxa"/>
+          </w:tcPr>
+          <w:p>
+            <w:pPr>
+              <w:spacing w:before="40" w:after="40"/>
+            </w:pPr>
+            <w:r>
+              <w:rPr>
+                <w:b/>
+                <w:sz w:val="18"/>
+              </w:rPr>
+              <w:t xml:space="preserve">FinanceBench (2023):</w:t>
+            </w:r>
+            <w:r>
+              <w:rPr>
+                <w:sz w:val="18"/>
+              </w:rPr>
+              <w:t xml:space="preserve"> GPT-4-Turbo with retrieval was wrong or refused on </w:t>
+            </w:r>
+            <w:r>
+              <w:rPr>
+                <w:b/>
+                <w:sz w:val="18"/>
+              </w:rPr>
+              <w:t xml:space="preserve">81%</w:t>
+            </w:r>
+            <w:r>
+              <w:rPr>
+                <w:sz w:val="18"/>
+              </w:rPr>
+              <w:t xml:space="preserve"> of questions grounded in public filings</w:t>
+            </w:r>
+          </w:p>
+        </w:tc>
+        <w:tc>
+          <w:tcPr>
+            <w:tcW w:w="5040" w:type="dxa"/>
+          </w:tcPr>
+          <w:p>
+            <w:pPr>
+              <w:spacing w:before="40" w:after="40"/>
+            </w:pPr>
+            <w:hyperlink r:id="rHl31">
+              <w:r>
+                <w:rPr>
+                  <w:rStyle w:val="Hyperlink"/>
+                  <w:sz w:val="18"/>
+                </w:rPr>
+                <w:t xml:space="preserve">FinanceBench</w:t>
+              </w:r>
+            </w:hyperlink>
+          </w:p>
+        </w:tc>
+      </w:tr>
+      <w:tr>
+        <w:tc>
+          <w:tcPr>
+            <w:tcW w:w="5040" w:type="dxa"/>
+          </w:tcPr>
+          <w:p>
+            <w:pPr>
+              <w:spacing w:before="40" w:after="40"/>
+            </w:pPr>
+            <w:r>
+              <w:rPr>
+                <w:sz w:val="18"/>
+              </w:rPr>
+              <w:t xml:space="preserve">A 2024 study found LLMs hallucinate in </w:t>
+            </w:r>
+            <w:r>
+              <w:rPr>
+                <w:b/>
+                <w:sz w:val="18"/>
+              </w:rPr>
+              <w:t xml:space="preserve">up to 41% of finance-related queries</w:t>
+            </w:r>
+          </w:p>
+        </w:tc>
+        <w:tc>
+          <w:tcPr>
+            <w:tcW w:w="5040" w:type="dxa"/>
+          </w:tcPr>
+          <w:p>
+            <w:pPr>
+              <w:spacing w:before="40" w:after="40"/>
+            </w:pPr>
+            <w:r>
+              <w:rPr>
+                <w:sz w:val="18"/>
+              </w:rPr>
+              <w:t xml:space="preserve">via </w:t>
+            </w:r>
+            <w:hyperlink r:id="rHl65">
+              <w:r>
+                <w:rPr>
+                  <w:rStyle w:val="Hyperlink"/>
+                  <w:sz w:val="18"/>
+                </w:rPr>
+                <w:t xml:space="preserve">JurisTech</w:t>
+              </w:r>
+            </w:hyperlink>
+            <w:r>
+              <w:rPr>
+                <w:sz w:val="18"/>
+              </w:rPr>
+              <w:t xml:space="preserve"> </w:t>
+            </w:r>
+            <w:r>
+              <w:rPr>
+                <w:rFonts w:ascii="Consolas" w:hAnsi="Consolas"/>
+                <w:sz w:val="18"/>
+              </w:rPr>
+              <w:t xml:space="preserve">[secondary]</w:t>
+            </w:r>
+          </w:p>
+        </w:tc>
+      </w:tr>
+    </w:tbl>
+    <w:p>
+      <w:pPr>
+        <w:spacing w:after="0"/>
+      </w:pPr>
+    </w:p>
+    <w:p>
+      <w:r>
+        <w:rPr>
+          <w:b/>
+        </w:rPr>
+        <w:t xml:space="preserve">A valuation is a multivariate calculation over incomplete documents.</w:t>
+      </w:r>
+      <w:r>
+        <w:t xml:space="preserve"> That is the precise intersection of the two failure modes above.</w:t>
+      </w:r>
+    </w:p>
+    <w:p>
+      <w:pPr>
+        <w:pStyle w:val="Heading2"/>
+      </w:pPr>
+      <w:r>
+        <w:t xml:space="preserve">2b. The comparables data is gated — I hit the walls myself</w:t>
+      </w:r>
+    </w:p>
+    <w:p>
+      <w:r>
+        <w:t xml:space="preserve">While researching this dossier: </w:t>
+      </w:r>
+      <w:r>
+        <w:rPr>
+          <w:b/>
+        </w:rPr>
+        <w:t xml:space="preserve">Crunchbase's pricing page returned a Cloudflare bot challenge</w:t>
+      </w:r>
+      <w:r>
+        <w:t xml:space="preserve">, </w:t>
+      </w:r>
+      <w:r>
+        <w:rPr>
+          <w:b/>
+        </w:rPr>
+        <w:t xml:space="preserve">PitchBook returned 403</w:t>
+      </w:r>
+      <w:r>
+        <w:t xml:space="preserve">, </w:t>
+      </w:r>
+      <w:r>
+        <w:rPr>
+          <w:b/>
+        </w:rPr>
+        <w:t xml:space="preserve">Carta's pricing page returned 403</w:t>
+      </w:r>
+      <w:r>
+        <w:t xml:space="preserve"> to a standard fetch, and </w:t>
+      </w:r>
+      <w:r>
+        <w:rPr>
+          <w:b/>
+        </w:rPr>
+        <w:t xml:space="preserve">G2 has blocked every attempt across five sessions.</w:t>
+      </w:r>
+      <w:r>
+        <w:t xml:space="preserve"> A continuous-valuation product needs a continuous comps feed, and the owners of that data block automated access by default and sell seats at $15,000–$20,000. </w:t>
+      </w:r>
+      <w:r>
+        <w:rPr>
+          <w:b/>
+        </w:rPr>
+        <w:t xml:space="preserve">Access is a commercial negotiation, not an engineering task.</w:t>
+      </w:r>
+    </w:p>
+    <w:p>
+      <w:pPr>
+        <w:pStyle w:val="Heading2"/>
+      </w:pPr>
+      <w:r>
+        <w:t xml:space="preserve">2c. The legal layer on the investor-matching half</w:t>
+      </w:r>
+    </w:p>
+    <w:p>
+      <w:r>
+        <w:t xml:space="preserve">There is </w:t>
+      </w:r>
+      <w:r>
+        <w:rPr>
+          <w:b/>
+        </w:rPr>
+        <w:t xml:space="preserve">no general federal "finders" exemption.</w:t>
+      </w:r>
+      <w:r>
+        <w:t xml:space="preserve"> The SEC treats transaction-based compensation for sourcing investors as the hallmark of broker activity; an unregistered finder taking a success fee is usually deemed an unregistered broker, exposing both the finder and the issuer to Section 15(a) liability. The SEC's Small Business Capital Formation Advisory Committee revisited this in </w:t>
+      </w:r>
+      <w:r>
+        <w:rPr>
+          <w:b/>
+        </w:rPr>
+        <w:t xml:space="preserve">July 2025</w:t>
+      </w:r>
+      <w:r>
+        <w:t xml:space="preserve"> and leadership signalled interest in relief — </w:t>
+      </w:r>
+      <w:r>
+        <w:rPr>
+          <w:b/>
+        </w:rPr>
+        <w:t xml:space="preserve">but nothing has been finalized.</w:t>
+      </w:r>
+      <w:r>
+        <w:t xml:space="preserve"> (</w:t>
+      </w:r>
+      <w:hyperlink r:id="rHl66">
+        <w:r>
+          <w:rPr>
+            <w:rStyle w:val="Hyperlink"/>
+          </w:rPr>
+          <w:t xml:space="preserve">DarrowEverett</w:t>
+        </w:r>
+      </w:hyperlink>
+      <w:r>
+        <w:t xml:space="preserve">; </w:t>
+      </w:r>
+      <w:hyperlink r:id="rHl67">
+        <w:r>
+          <w:rPr>
+            <w:rStyle w:val="Hyperlink"/>
+          </w:rPr>
+          <w:t xml:space="preserve">Nelson Mullins</w:t>
+        </w:r>
+      </w:hyperlink>
+      <w:r>
+        <w:t xml:space="preserve">; </w:t>
+      </w:r>
+      <w:hyperlink r:id="rHl68">
+        <w:r>
+          <w:rPr>
+            <w:rStyle w:val="Hyperlink"/>
+          </w:rPr>
+          <w:t xml:space="preserve">SEC funding portal guidance</w:t>
+        </w:r>
+      </w:hyperlink>
+      <w:r>
+        <w:t xml:space="preserve">)</w:t>
+      </w:r>
+    </w:p>
+    <w:p>
+      <w:r>
+        <w:rPr>
+          <w:b/>
+        </w:rPr>
+        <w:t xml:space="preserve">Implication:</w:t>
+      </w:r>
+      <w:r>
+        <w:t xml:space="preserve"> subscription pricing is fine; </w:t>
+      </w:r>
+      <w:r>
+        <w:rPr>
+          <w:b/>
+        </w:rPr>
+        <w:t xml:space="preserve">success fees on introductions are not</w:t>
+      </w:r>
+      <w:r>
+        <w:t xml:space="preserve">, without registration.</w:t>
+      </w:r>
+    </w:p>
+    <w:p>
+      <w:pPr>
+        <w:pStyle w:val="Heading2"/>
+      </w:pPr>
+      <w:r>
+        <w:t xml:space="preserve">2d. The number the app produces has no legal standing</w:t>
+      </w:r>
+    </w:p>
+    <w:p>
+      <w:r>
+        <w:t xml:space="preserve">409A safe harbor requires an independent appraiser's signed report. Even the AI-powered $499 platforms keep </w:t>
+      </w:r>
+      <w:r>
+        <w:rPr>
+          <w:b/>
+        </w:rPr>
+        <w:t xml:space="preserve">a qualified appraiser reviewing and signing</w:t>
+      </w:r>
+      <w:r>
+        <w:t xml:space="preserve"> (</w:t>
+      </w:r>
+      <w:hyperlink r:id="rHl39">
+        <w:r>
+          <w:rPr>
+            <w:rStyle w:val="Hyperlink"/>
+          </w:rPr>
+          <w:t xml:space="preserve">409a-valuation.com</w:t>
+        </w:r>
+      </w:hyperlink>
+      <w:r>
+        <w:t xml:space="preserve">). A continuously recalculated number is, by construction, not that.</w:t>
+      </w:r>
+    </w:p>
+    <w:p>
+      <w:pPr>
+        <w:pBdr>
+          <w:bottom w:val="single" w:sz="6" w:space="6" w:color="C9CCD1"/>
+        </w:pBdr>
+      </w:pPr>
+    </w:p>
+    <w:p>
+      <w:pPr>
+        <w:pStyle w:val="Heading1"/>
+      </w:pPr>
+      <w:r>
+        <w:t xml:space="preserve">Part 3 — Counterargument 1, argued at full strength</w:t>
+      </w:r>
+    </w:p>
+    <w:p>
+      <w:pPr>
+        <w:pStyle w:val="Heading2"/>
+      </w:pPr>
+      <w:r>
+        <w:rPr>
+          <w:b/>
+        </w:rPr>
+        <w:t xml:space="preserve">"This was already possible five years ago."</w:t>
+      </w:r>
+    </w:p>
+    <w:p>
+      <w:r>
+        <w:rPr>
+          <w:b/>
+        </w:rPr>
+        <w:t xml:space="preserve">Thirteen years ago, in fact.</w:t>
+      </w:r>
+    </w:p>
+    <w:p>
+      <w:r>
+        <w:rPr>
+          <w:b/>
+        </w:rPr>
+        <w:t xml:space="preserve">The valuation engine:</w:t>
+      </w:r>
+      <w:r>
+        <w:t xml:space="preserve"> Equidam was founded </w:t>
+      </w:r>
+      <w:r>
+        <w:rPr>
+          <w:b/>
+        </w:rPr>
+        <w:t xml:space="preserve">2012–2013</w:t>
+      </w:r>
+      <w:r>
+        <w:t xml:space="preserve"> and has run an automated five-method engine — Scorecard, Checklist, two DCF variants and the VC Method, weighted by stage — since its earliest years, with results recalculating </w:t>
+      </w:r>
+      <w:r>
+        <w:rPr>
+          <w:b/>
+        </w:rPr>
+        <w:t xml:space="preserve">as the founder changes inputs</w:t>
+      </w:r>
+      <w:r>
+        <w:t xml:space="preserve">. Contemporary coverage described it as letting startups "see their valuation in real-time for a fraction of the price." It now claims </w:t>
+      </w:r>
+      <w:r>
+        <w:rPr>
+          <w:b/>
+        </w:rPr>
+        <w:t xml:space="preserve">160,000+ valuations across 90+ countries</w:t>
+      </w:r>
+      <w:r>
+        <w:t xml:space="preserve">. (</w:t>
+      </w:r>
+      <w:hyperlink r:id="rHl69">
+        <w:r>
+          <w:rPr>
+            <w:rStyle w:val="Hyperlink"/>
+          </w:rPr>
+          <w:t xml:space="preserve">Equidam</w:t>
+        </w:r>
+      </w:hyperlink>
+      <w:r>
+        <w:t xml:space="preserve">; </w:t>
+      </w:r>
+      <w:hyperlink r:id="rHl70">
+        <w:r>
+          <w:rPr>
+            <w:rStyle w:val="Hyperlink"/>
+          </w:rPr>
+          <w:t xml:space="preserve">Startup Daily</w:t>
+        </w:r>
+      </w:hyperlink>
+      <w:r>
+        <w:t xml:space="preserve">)</w:t>
+      </w:r>
+    </w:p>
+    <w:p>
+      <w:r>
+        <w:rPr>
+          <w:b/>
+        </w:rPr>
+        <w:t xml:space="preserve">The methods themselves are older still:</w:t>
+      </w:r>
+      <w:r>
+        <w:t xml:space="preserve"> the VC Method dates to 1987, Berkus to the 1990s, Payne's Scorecard to around 2011, DCF to the 1930s. </w:t>
+      </w:r>
+      <w:r>
+        <w:rPr>
+          <w:b/>
+        </w:rPr>
+        <w:t xml:space="preserve">None of this needed a model.</w:t>
+      </w:r>
+    </w:p>
+    <w:p>
+      <w:r>
+        <w:rPr>
+          <w:b/>
+        </w:rPr>
+        <w:t xml:space="preserve">The data plumbing predates LLMs:</w:t>
+      </w:r>
+      <w:r>
+        <w:t xml:space="preserve"> SEC Form D has been public, structured and bulk-downloadable for years; Crunchbase has had an API since the mid-2010s; accounting data has been available through QuickBooks, Xero and Stripe APIs for a decade.</w:t>
+      </w:r>
+    </w:p>
+    <w:p>
+      <w:r>
+        <w:rPr>
+          <w:b/>
+        </w:rPr>
+        <w:t xml:space="preserve">"Continuous" is a cron job.</w:t>
+      </w:r>
+      <w:r>
+        <w:t xml:space="preserve"> Recalculating a formula nightly as new inputs arrive is 1990s engineering. Nothing about a weighted five-method valuation requires an agent — Equidam proved that with a web form.</w:t>
+      </w:r>
+    </w:p>
+    <w:p>
+      <w:r>
+        <w:rPr>
+          <w:b/>
+        </w:rPr>
+        <w:t xml:space="preserve">And an agent-callable version already exists:</w:t>
+      </w:r>
+      <w:r>
+        <w:t xml:space="preserve"> Equidam's </w:t>
+      </w:r>
+      <w:r>
+        <w:rPr>
+          <w:b/>
+        </w:rPr>
+        <w:t xml:space="preserve">MCP server (August 8, 2025)</w:t>
+      </w:r>
+      <w:r>
+        <w:t xml:space="preserve"> lets any AI assistant run the full five-method valuation by natural-language request. If the claim is "an AI agent can compile data and value a company," that has been true and purchasable for 13 months.</w:t>
+      </w:r>
+    </w:p>
+    <w:p>
+      <w:r>
+        <w:rPr>
+          <w:b/>
+        </w:rPr>
+        <w:t xml:space="preserve">The strong form:</w:t>
+      </w:r>
+      <w:r>
+        <w:t xml:space="preserve"> the market's failure was never capability. Equidam built the product, had 13 years, and has 15 lifetime Trustpilot reviews. </w:t>
+      </w:r>
+      <w:r>
+        <w:rPr>
+          <w:b/>
+        </w:rPr>
+        <w:t xml:space="preserve">The binding constraint was demand, not technology</w:t>
+      </w:r>
+      <w:r>
+        <w:t xml:space="preserve"> — and an AI agent does not create demand.</w:t>
+      </w:r>
+    </w:p>
+    <w:p>
+      <w:r>
+        <w:rPr>
+          <w:b/>
+        </w:rPr>
+        <w:t xml:space="preserve">Where this argument is weakest:</w:t>
+      </w:r>
+      <w:r>
+        <w:t xml:space="preserve"> it treats "valuation" as the whole job. Equidam's engine requires a founder to *sit down and enter structured inputs* — revenue, projections, team scores. Nothing before 2024 could read a messy P&amp;L PDF, a Stripe feed and a cap table and keep the number current </w:t>
+      </w:r>
+      <w:r>
+        <w:rPr>
+          <w:b/>
+        </w:rPr>
+        <w:t xml:space="preserve">without the founder doing data entry</w:t>
+      </w:r>
+      <w:r>
+        <w:t xml:space="preserve">. Carta's April 2026 AI data-collection product is the first production evidence that that ingestion step is now automatable — and Carta built it because chasing companies for KPIs was consuming *weeks* of professional time.</w:t>
+      </w:r>
+    </w:p>
+    <w:p>
+      <w:pPr>
+        <w:pBdr>
+          <w:bottom w:val="single" w:sz="6" w:space="6" w:color="C9CCD1"/>
+        </w:pBdr>
+      </w:pPr>
+    </w:p>
+    <w:p>
+      <w:pPr>
+        <w:pStyle w:val="Heading1"/>
+      </w:pPr>
+      <w:r>
+        <w:t xml:space="preserve">Part 4 — Counterargument 2, argued at full strength</w:t>
+      </w:r>
+    </w:p>
+    <w:p>
+      <w:pPr>
+        <w:pStyle w:val="Heading2"/>
+      </w:pPr>
+      <w:r>
+        <w:rPr>
+          <w:b/>
+        </w:rPr>
+        <w:t xml:space="preserve">"This still is not possible."</w:t>
+      </w:r>
+    </w:p>
+    <w:p>
+      <w:r>
+        <w:rPr>
+          <w:b/>
+        </w:rPr>
+        <w:t xml:space="preserve">1. The model cannot be trusted with the arithmetic.</w:t>
+      </w:r>
+      <w:r>
+        <w:t xml:space="preserve"> Four of six leading models fabricate financial figures from incomplete documents, two of them confidently and silently; accuracy collapses to near zero on multivariate calculations; the best finance agent scores 46.8%. A valuation is multivariate arithmetic over incomplete documents. </w:t>
+      </w:r>
+      <w:r>
+        <w:rPr>
+          <w:b/>
+        </w:rPr>
+        <w:t xml:space="preserve">A number that is confidently wrong is worse than no number</w:t>
+      </w:r>
+      <w:r>
+        <w:t xml:space="preserve">, because the founder takes it into a negotiation.</w:t>
+      </w:r>
+    </w:p>
+    <w:p>
+      <w:r>
+        <w:rPr>
+          <w:b/>
+        </w:rPr>
+        <w:t xml:space="preserve">2. There is no comps feed you can afford.</w:t>
+      </w:r>
+      <w:r>
+        <w:t xml:space="preserve"> Credible private-company comparables sit behind PitchBook ($15k–$20k/seat), Carta's proprietary data, and Crunchbase's paywall — all of which block bots by default. Without them, "continuous valuation" is a formula recomputing over stale assumptions, which is a spreadsheet with a cron job, not a product.</w:t>
+      </w:r>
+    </w:p>
+    <w:p>
+      <w:r>
+        <w:rPr>
+          <w:b/>
+        </w:rPr>
+        <w:t xml:space="preserve">3. At the stage you're targeting, valuation isn't computed — it's negotiated.</w:t>
+      </w:r>
+      <w:r>
+        <w:t xml:space="preserve"> Carta's own data shows median seed pre-money </w:t>
+      </w:r>
+      <w:r>
+        <w:rPr>
+          <w:b/>
+        </w:rPr>
+        <w:t xml:space="preserve">rising to record highs in 2025 while deal counts fell</w:t>
+      </w:r>
+      <w:r>
+        <w:t xml:space="preserve"> — supply and demand, not fundamentals. A pre-revenue company has no cash flows to discount; its price is set by investor appetite that week. A continuously recalculated intrinsic value can be perfectly computed and still be the wrong number to walk in with.</w:t>
+      </w:r>
+    </w:p>
+    <w:p>
+      <w:r>
+        <w:rPr>
+          <w:b/>
+        </w:rPr>
+        <w:t xml:space="preserve">4. The output has no standing.</w:t>
+      </w:r>
+      <w:r>
+        <w:t xml:space="preserve"> The only valuations that carry legal weight (409A) require a human appraiser's signature, which is why even AI-first providers keep one in the loop.</w:t>
+      </w:r>
+    </w:p>
+    <w:p>
+      <w:r>
+        <w:rPr>
+          <w:b/>
+        </w:rPr>
+        <w:t xml:space="preserve">5. The matching half is legally constrained.</w:t>
+      </w:r>
+      <w:r>
+        <w:t xml:space="preserve"> No finders exemption exists; transaction-based compensation for investor introductions is broker activity. The business model most founders would pay most for — "get me in front of the right investor, take a cut" — is the one you cannot legally run unregistered.</w:t>
+      </w:r>
+    </w:p>
+    <w:p>
+      <w:r>
+        <w:rPr>
+          <w:b/>
+        </w:rPr>
+        <w:t xml:space="preserve">6. Nobody has shown demand.</w:t>
+      </w:r>
+      <w:r>
+        <w:t xml:space="preserve"> Equidam has had the product for 13 years and left almost no usage footprint.</w:t>
+      </w:r>
+    </w:p>
+    <w:p>
+      <w:r>
+        <w:rPr>
+          <w:b/>
+        </w:rPr>
+        <w:t xml:space="preserve">Where this argument is weakest:</w:t>
+      </w:r>
+      <w:r>
+        <w:t xml:space="preserve"> it attacks *autonomous, authoritative* valuation. It does not touch a narrower product — an assistive tool that shows its inputs, cites its comparables, presents a </w:t>
+      </w:r>
+      <w:r>
+        <w:rPr>
+          <w:b/>
+        </w:rPr>
+        <w:t xml:space="preserve">range</w:t>
+      </w:r>
+      <w:r>
+        <w:t xml:space="preserve"> rather than a number, keeps the range current as revenue and market data move, and leaves the founder to argue it. That product doesn't need 95% arithmetic reliability; it needs transparency and auditability, which are engineering choices.</w:t>
+      </w:r>
+    </w:p>
+    <w:p>
+      <w:pPr>
+        <w:pBdr>
+          <w:bottom w:val="single" w:sz="6" w:space="6" w:color="C9CCD1"/>
+        </w:pBdr>
+      </w:pPr>
+    </w:p>
+    <w:p>
+      <w:pPr>
+        <w:pStyle w:val="Heading1"/>
+      </w:pPr>
+      <w:r>
+        <w:t xml:space="preserve">Part 5 — What survives</w:t>
+      </w:r>
+    </w:p>
+    <w:p>
+      <w:r>
+        <w:t xml:space="preserve">Your claim fails on the "not in the market" clause and overstates the "newly possible" one. Here is the version that survives everything above:</w:t>
+      </w:r>
+    </w:p>
+    <w:p>
+      <w:pPr>
+        <w:ind w:left="360"/>
+        <w:pBdr>
+          <w:left w:val="single" w:sz="18" w:space="8" w:color="9AA0A6"/>
+        </w:pBdr>
+      </w:pPr>
+      <w:r>
+        <w:t xml:space="preserve">**Founder-facing continuous valuation is not newly possible — it is newly *low-friction*, and it is newly *unattended*.</w:t>
+      </w:r>
+      <w:r>
+        <w:rPr>
+          <w:b/>
+        </w:rPr>
+        <w:t xml:space="preserve"> What changed between 2021 and 2026 is not the valuation math (13 years old) or agent access to a valuation engine (Equidam's MCP server, Aug 2025) but the </w:t>
+      </w:r>
+      <w:r>
+        <w:t xml:space="preserve">ingestion step</w:t>
+      </w:r>
+      <w:r>
+        <w:rPr>
+          <w:b/>
+        </w:rPr>
+        <w:t xml:space="preserve">: a system can now read a messy P&amp;L, a cap table PDF, a Stripe feed and a funding announcement and keep a valuation </w:t>
+      </w:r>
+      <w:r>
+        <w:t xml:space="preserve">range</w:t>
+      </w:r>
+      <w:r>
+        <w:rPr>
+          <w:b/>
+        </w:rPr>
+        <w:t xml:space="preserve"> current without the founder re-entering anything — which Carta proved in production in April 2026, </w:t>
+      </w:r>
+      <w:r>
+        <w:t xml:space="preserve">for investors rather than founders.** The gap is not capability; it is that everyone has pointed this machinery at the people who already pay ($15k–$20k seats, fund middle offices) and nobody has pointed it at founders. The binding constraints are comparables access, a legally clean business model that avoids transaction-based fees, and — the one nobody has solved in 13 years — demand.</w:t>
+      </w:r>
+    </w:p>
+    <w:p>
+      <w:pPr>
+        <w:pStyle w:val="Heading2"/>
+      </w:pPr>
+      <w:r>
+        <w:t xml:space="preserve">Four tests that would falsify this — run them before building</w:t>
+      </w:r>
+    </w:p>
+    <w:p>
+      <w:r>
+        <w:t xml:space="preserve">1. </w:t>
+      </w:r>
+      <w:r>
+        <w:rPr>
+          <w:b/>
+        </w:rPr>
+        <w:t xml:space="preserve">The Equidam test.</w:t>
+      </w:r>
+      <w:r>
+        <w:t xml:space="preserve"> Buy Equidam's $412 report and run its MCP server. If it already answers your user's question, your product is a distribution and UX play, not a capability play — price and pitch accordingly.</w:t>
+      </w:r>
+    </w:p>
+    <w:p>
+      <w:r>
+        <w:t xml:space="preserve">2. </w:t>
+      </w:r>
+      <w:r>
+        <w:rPr>
+          <w:b/>
+        </w:rPr>
+        <w:t xml:space="preserve">The arithmetic test.</w:t>
+      </w:r>
+      <w:r>
+        <w:t xml:space="preserve"> Feed 20 real startup P&amp;Ls through your engine and check every intermediate number against a human analyst. Publish the error rate. Given the benchmark evidence, assume you will find fabrications.</w:t>
+      </w:r>
+    </w:p>
+    <w:p>
+      <w:r>
+        <w:t xml:space="preserve">3. </w:t>
+      </w:r>
+      <w:r>
+        <w:rPr>
+          <w:b/>
+        </w:rPr>
+        <w:t xml:space="preserve">The comps test.</w:t>
+      </w:r>
+      <w:r>
+        <w:t xml:space="preserve"> Before writing code, establish what comparable-transaction data you can license or derive from Form D at a cost that works at $1,000/yr. If the answer is "scrape Crunchbase," you don't have a product — you have a lawsuit and a Cloudflare block.</w:t>
+      </w:r>
+    </w:p>
+    <w:p>
+      <w:r>
+        <w:t xml:space="preserve">4. </w:t>
+      </w:r>
+      <w:r>
+        <w:rPr>
+          <w:b/>
+        </w:rPr>
+        <w:t xml:space="preserve">The demand test.</w:t>
+      </w:r>
+      <w:r>
+        <w:t xml:space="preserve"> Find 20 founders who will pre-pay $1,000. Equidam had 13 years to do this and its public footprint suggests it never did. </w:t>
+      </w:r>
+      <w:r>
+        <w:rPr>
+          <w:b/>
+        </w:rPr>
+        <w:t xml:space="preserve">This is the test that matters most, and it doesn't require any code.</w:t>
+      </w:r>
+    </w:p>
+    <w:p>
+      <w:pPr>
+        <w:pBdr>
+          <w:bottom w:val="single" w:sz="6" w:space="6" w:color="C9CCD1"/>
+        </w:pBdr>
+      </w:pPr>
+    </w:p>
+    <w:p>
+      <w:pPr>
+        <w:pStyle w:val="Heading1"/>
+      </w:pPr>
+      <w:r>
+        <w:t xml:space="preserve">Flags</w:t>
+      </w:r>
+    </w:p>
+    <w:tbl>
+      <w:tblPr>
+        <w:tblW w:w="10080" w:type="dxa"/>
+        <w:tblBorders>
+          <w:top w:val="single" w:sz="4" w:space="0" w:color="C9CCD1"/>
+          <w:left w:val="single" w:sz="4" w:space="0" w:color="C9CCD1"/>
+          <w:bottom w:val="single" w:sz="4" w:space="0" w:color="C9CCD1"/>
+          <w:right w:val="single" w:sz="4" w:space="0" w:color="C9CCD1"/>
+          <w:insideH w:val="single" w:sz="4" w:space="0" w:color="C9CCD1"/>
+          <w:insideV w:val="single" w:sz="4" w:space="0" w:color="C9CCD1"/>
+        </w:tblBorders>
+        <w:tblLayout w:type="fixed"/>
+      </w:tblPr>
+      <w:tblGrid>
+        <w:gridCol w:w="5040"/>
+        <w:gridCol w:w="5040"/>
+      </w:tblGrid>
+      <w:tr>
+        <w:trPr>
+          <w:tblHeader/>
+        </w:trPr>
+        <w:tc>
+          <w:tcPr>
+            <w:tcW w:w="5040" w:type="dxa"/>
+            <w:shd w:val="clear" w:color="auto" w:fill="EFF1F3"/>
+          </w:tcPr>
+          <w:p>
+            <w:pPr>
+              <w:spacing w:before="40" w:after="40"/>
+            </w:pPr>
+            <w:r>
+              <w:rPr>
+                <w:b/>
+                <w:sz w:val="18"/>
+              </w:rPr>
+              <w:t xml:space="preserve">Item</w:t>
+            </w:r>
+          </w:p>
+        </w:tc>
+        <w:tc>
+          <w:tcPr>
+            <w:tcW w:w="5040" w:type="dxa"/>
+            <w:shd w:val="clear" w:color="auto" w:fill="EFF1F3"/>
+          </w:tcPr>
+          <w:p>
+            <w:pPr>
+              <w:spacing w:before="40" w:after="40"/>
+            </w:pPr>
+            <w:r>
+              <w:rPr>
+                <w:b/>
+                <w:sz w:val="18"/>
+              </w:rPr>
+              <w:t xml:space="preserve">Status</w:t>
+            </w:r>
+          </w:p>
+        </w:tc>
+      </w:tr>
+      <w:tr>
+        <w:tc>
+          <w:tcPr>
+            <w:tcW w:w="5040" w:type="dxa"/>
+          </w:tcPr>
+          <w:p>
+            <w:pPr>
+              <w:spacing w:before="40" w:after="40"/>
+            </w:pPr>
+            <w:r>
+              <w:rPr>
+                <w:sz w:val="18"/>
+              </w:rPr>
+              <w:t xml:space="preserve">Equidam "160,000+ valuations, 90+ countries"</w:t>
+            </w:r>
+          </w:p>
+        </w:tc>
+        <w:tc>
+          <w:tcPr>
+            <w:tcW w:w="5040" w:type="dxa"/>
+          </w:tcPr>
+          <w:p>
+            <w:pPr>
+              <w:spacing w:before="40" w:after="40"/>
+            </w:pPr>
+            <w:r>
+              <w:rPr>
+                <w:sz w:val="18"/>
+              </w:rPr>
+              <w:t xml:space="preserve">⚠️ Marketing claim, irreconcilable with a 15-review Trustpilot footprint. One of the two is misleading; I could not determine which.</w:t>
+            </w:r>
+          </w:p>
+        </w:tc>
+      </w:tr>
+      <w:tr>
+        <w:tc>
+          <w:tcPr>
+            <w:tcW w:w="5040" w:type="dxa"/>
+          </w:tcPr>
+          <w:p>
+            <w:pPr>
+              <w:spacing w:before="40" w:after="40"/>
+            </w:pPr>
+            <w:r>
+              <w:rPr>
+                <w:sz w:val="18"/>
+              </w:rPr>
+              <w:t xml:space="preserve">Equidam MCP performance claim ("4–8 hours → 30 seconds")</w:t>
+            </w:r>
+          </w:p>
+        </w:tc>
+        <w:tc>
+          <w:tcPr>
+            <w:tcW w:w="5040" w:type="dxa"/>
+          </w:tcPr>
+          <w:p>
+            <w:pPr>
+              <w:spacing w:before="40" w:after="40"/>
+            </w:pPr>
+            <w:r>
+              <w:rPr>
+                <w:sz w:val="18"/>
+              </w:rPr>
+              <w:t xml:space="preserve">⚠️ Vendor-stated, untested by me.</w:t>
+            </w:r>
+          </w:p>
+        </w:tc>
+      </w:tr>
+      <w:tr>
+        <w:tc>
+          <w:tcPr>
+            <w:tcW w:w="5040" w:type="dxa"/>
+          </w:tcPr>
+          <w:p>
+            <w:pPr>
+              <w:spacing w:before="40" w:after="40"/>
+            </w:pPr>
+            <w:r>
+              <w:rPr>
+                <w:sz w:val="18"/>
+              </w:rPr>
+              <w:t xml:space="preserve">Carta's "valuation agent"</w:t>
+            </w:r>
+          </w:p>
+        </w:tc>
+        <w:tc>
+          <w:tcPr>
+            <w:tcW w:w="5040" w:type="dxa"/>
+          </w:tcPr>
+          <w:p>
+            <w:pPr>
+              <w:spacing w:before="40" w:after="40"/>
+            </w:pPr>
+            <w:r>
+              <w:rPr>
+                <w:sz w:val="18"/>
+              </w:rPr>
+              <w:t xml:space="preserve">⚠️ Search snippets attribute a real-time "valuation agent" to Carta; the roadmap and blog I retrieved describe AI data collection and expanded methodologies for </w:t>
+            </w:r>
+            <w:r>
+              <w:rPr>
+                <w:b/>
+                <w:sz w:val="18"/>
+              </w:rPr>
+              <w:t xml:space="preserve">fund</w:t>
+            </w:r>
+            <w:r>
+              <w:rPr>
+                <w:sz w:val="18"/>
+              </w:rPr>
+              <w:t xml:space="preserve"> valuations. I did not find a founder-facing valuation agent. </w:t>
+            </w:r>
+            <w:r>
+              <w:rPr>
+                <w:rFonts w:ascii="Consolas" w:hAnsi="Consolas"/>
+                <w:sz w:val="18"/>
+              </w:rPr>
+              <w:t xml:space="preserve">[Treat "Carta is building this for founders" as UNVERIFIED — current evidence says GP/LP side.]</w:t>
+            </w:r>
+          </w:p>
+        </w:tc>
+      </w:tr>
+      <w:tr>
+        <w:tc>
+          <w:tcPr>
+            <w:tcW w:w="5040" w:type="dxa"/>
+          </w:tcPr>
+          <w:p>
+            <w:pPr>
+              <w:spacing w:before="40" w:after="40"/>
+            </w:pPr>
+            <w:r>
+              <w:rPr>
+                <w:sz w:val="18"/>
+              </w:rPr>
+              <w:t xml:space="preserve">AI 409A platforms ($499–$2,500, fastest-growing segment)</w:t>
+            </w:r>
+          </w:p>
+        </w:tc>
+        <w:tc>
+          <w:tcPr>
+            <w:tcW w:w="5040" w:type="dxa"/>
+          </w:tcPr>
+          <w:p>
+            <w:pPr>
+              <w:spacing w:before="40" w:after="40"/>
+            </w:pPr>
+            <w:r>
+              <w:rPr>
+                <w:sz w:val="18"/>
+              </w:rPr>
+              <w:t xml:space="preserve">⚠️ From valuation-provider marketing sites, parties with an interest in that framing.</w:t>
+            </w:r>
+          </w:p>
+        </w:tc>
+      </w:tr>
+      <w:tr>
+        <w:tc>
+          <w:tcPr>
+            <w:tcW w:w="5040" w:type="dxa"/>
+          </w:tcPr>
+          <w:p>
+            <w:pPr>
+              <w:spacing w:before="40" w:after="40"/>
+            </w:pPr>
+            <w:r>
+              <w:rPr>
+                <w:sz w:val="18"/>
+              </w:rPr>
+              <w:t xml:space="preserve">"41% of finance queries hallucinate" (2024)</w:t>
+            </w:r>
+          </w:p>
+        </w:tc>
+        <w:tc>
+          <w:tcPr>
+            <w:tcW w:w="5040" w:type="dxa"/>
+          </w:tcPr>
+          <w:p>
+            <w:pPr>
+              <w:spacing w:before="40" w:after="40"/>
+            </w:pPr>
+            <w:r>
+              <w:rPr>
+                <w:sz w:val="18"/>
+              </w:rPr>
+              <w:t xml:space="preserve">⚠️ Secondary citation via a vendor benchmark write-up; original study not retrieved.</w:t>
+            </w:r>
+          </w:p>
+        </w:tc>
+      </w:tr>
+      <w:tr>
+        <w:tc>
+          <w:tcPr>
+            <w:tcW w:w="5040" w:type="dxa"/>
+          </w:tcPr>
+          <w:p>
+            <w:pPr>
+              <w:spacing w:before="40" w:after="40"/>
+            </w:pPr>
+            <w:r>
+              <w:rPr>
+                <w:sz w:val="18"/>
+              </w:rPr>
+              <w:t xml:space="preserve">JurisTech 2026 benchmark</w:t>
+            </w:r>
+          </w:p>
+        </w:tc>
+        <w:tc>
+          <w:tcPr>
+            <w:tcW w:w="5040" w:type="dxa"/>
+          </w:tcPr>
+          <w:p>
+            <w:pPr>
+              <w:spacing w:before="40" w:after="40"/>
+            </w:pPr>
+            <w:r>
+              <w:rPr>
+                <w:sz w:val="18"/>
+              </w:rPr>
+              <w:t xml:space="preserve">⚠️ Vendor-run benchmark, not peer-reviewed. Directionally consistent with the arXiv findings, which are stronger evidence.</w:t>
+            </w:r>
+          </w:p>
+        </w:tc>
+      </w:tr>
+      <w:tr>
+        <w:tc>
+          <w:tcPr>
+            <w:tcW w:w="5040" w:type="dxa"/>
+          </w:tcPr>
+          <w:p>
+            <w:pPr>
+              <w:spacing w:before="40" w:after="40"/>
+            </w:pPr>
+            <w:r>
+              <w:rPr>
+                <w:sz w:val="18"/>
+              </w:rPr>
+              <w:t xml:space="preserve">Securities-law summary</w:t>
+            </w:r>
+          </w:p>
+        </w:tc>
+        <w:tc>
+          <w:tcPr>
+            <w:tcW w:w="5040" w:type="dxa"/>
+          </w:tcPr>
+          <w:p>
+            <w:pPr>
+              <w:spacing w:before="40" w:after="40"/>
+            </w:pPr>
+            <w:r>
+              <w:rPr>
+                <w:sz w:val="18"/>
+              </w:rPr>
+              <w:t xml:space="preserve">⚠️ From law-firm client alerts, not primary SEC releases. </w:t>
+            </w:r>
+            <w:r>
+              <w:rPr>
+                <w:b/>
+                <w:sz w:val="18"/>
+              </w:rPr>
+              <w:t xml:space="preserve">Not legal advice</w:t>
+            </w:r>
+            <w:r>
+              <w:rPr>
+                <w:sz w:val="18"/>
+              </w:rPr>
+              <w:t xml:space="preserve"> — a securities lawyer must review any fee structure before launch.</w:t>
+            </w:r>
+          </w:p>
+        </w:tc>
+      </w:tr>
+      <w:tr>
+        <w:tc>
+          <w:tcPr>
+            <w:tcW w:w="5040" w:type="dxa"/>
+          </w:tcPr>
+          <w:p>
+            <w:pPr>
+              <w:spacing w:before="40" w:after="40"/>
+            </w:pPr>
+            <w:r>
+              <w:rPr>
+                <w:sz w:val="18"/>
+              </w:rPr>
+              <w:t xml:space="preserve">Blocked sources</w:t>
+            </w:r>
+          </w:p>
+        </w:tc>
+        <w:tc>
+          <w:tcPr>
+            <w:tcW w:w="5040" w:type="dxa"/>
+          </w:tcPr>
+          <w:p>
+            <w:pPr>
+              <w:spacing w:before="40" w:after="40"/>
+            </w:pPr>
+            <w:r>
+              <w:rPr>
+                <w:sz w:val="18"/>
+              </w:rPr>
+              <w:t xml:space="preserve">❌ Reddit and G2 blocked throughout; Crunchbase, PitchBook and Carta pricing pages blocked to direct fetch (Carta retrieved via browser).</w:t>
+            </w:r>
+          </w:p>
+        </w:tc>
+      </w:tr>
+      <w:tr>
+        <w:tc>
+          <w:tcPr>
+            <w:tcW w:w="5040" w:type="dxa"/>
+          </w:tcPr>
+          <w:p>
+            <w:pPr>
+              <w:spacing w:before="40" w:after="40"/>
+            </w:pPr>
+            <w:r>
+              <w:rPr>
+                <w:sz w:val="18"/>
+              </w:rPr>
+              <w:t xml:space="preserve">Equidam founding date</w:t>
+            </w:r>
+          </w:p>
+        </w:tc>
+        <w:tc>
+          <w:tcPr>
+            <w:tcW w:w="5040" w:type="dxa"/>
+          </w:tcPr>
+          <w:p>
+            <w:pPr>
+              <w:spacing w:before="40" w:after="40"/>
+            </w:pPr>
+            <w:r>
+              <w:rPr>
+                <w:sz w:val="18"/>
+              </w:rPr>
+              <w:t xml:space="preserve">⚠️ Sources say 2012 or 2013; both predate the claim's five-year window regardless.</w:t>
             </w:r>
           </w:p>
         </w:tc>

</xml_diff>